<commit_message>
Attempts to inject AddLoc partial to resume editor.
</commit_message>
<xml_diff>
--- a/CUWebinars.Web/App_Data/mergeTemplates/ConnectionInfo2.docx
+++ b/CUWebinars.Web/App_Data/mergeTemplates/ConnectionInfo2.docx
@@ -796,7 +796,7 @@
             </w:r>
             <w:proofErr w:type="spellEnd"/>
             <w:r>
-              <w:t xml:space="preserve"> please </w:t>
+              <w:t xml:space="preserve"> please</w:t>
             </w:r>
             <w:r>
               <w:t xml:space="preserve"> </w:t>
@@ -809,9 +809,6 @@
                 <w:t>«ChangeTimeZoneLink»</w:t>
               </w:r>
             </w:fldSimple>
-            <w:r>
-              <w:t>.</w:t>
-            </w:r>
           </w:p>
           <w:p>
             <w:pPr>
@@ -1782,7 +1779,7 @@
 </file>
 
 <file path=customXml/itemProps1.xml><?xml version="1.0" encoding="utf-8"?>
-<ds:datastoreItem xmlns:ds="http://schemas.openxmlformats.org/officeDocument/2006/customXml" ds:itemID="{B578A98F-D904-46ED-8969-A0D1D123CCEB}">
+<ds:datastoreItem xmlns:ds="http://schemas.openxmlformats.org/officeDocument/2006/customXml" ds:itemID="{C27CB514-7998-4709-AA61-0F99A687C02F}">
   <ds:schemaRefs>
     <ds:schemaRef ds:uri="http://schemas.openxmlformats.org/officeDocument/2006/bibliography"/>
   </ds:schemaRefs>

</xml_diff>

<commit_message>
AddEmailForInvoice implemented FindCo-WorkerLink is fixed Adds session ender attmpt. not liking log output yet.
</commit_message>
<xml_diff>
--- a/CUWebinars.Web/App_Data/mergeTemplates/ConnectionInfo2.docx
+++ b/CUWebinars.Web/App_Data/mergeTemplates/ConnectionInfo2.docx
@@ -40,13 +40,19 @@
               <w:rPr>
                 <w:i/>
               </w:rPr>
+              <w:t xml:space="preserve">Connection Checklist for </w:t>
+            </w:r>
+            <w:r>
+              <w:rPr>
+                <w:i/>
+              </w:rPr>
               <w:fldChar w:fldCharType="begin"/>
             </w:r>
             <w:r>
               <w:rPr>
                 <w:i/>
               </w:rPr>
-              <w:instrText xml:space="preserve"> MERGEFIELD  MessageHeading  \* MERGEFORMAT </w:instrText>
+              <w:instrText xml:space="preserve"> MERGEFIELD  WebinarTitle  \* MERGEFORMAT </w:instrText>
             </w:r>
             <w:r>
               <w:rPr>
@@ -59,7 +65,7 @@
                 <w:i/>
                 <w:noProof/>
               </w:rPr>
-              <w:t>«MessageHeading»</w:t>
+              <w:t>«WebinarTitle»</w:t>
             </w:r>
             <w:r>
               <w:rPr>
@@ -450,27 +456,14 @@
             <w:r>
               <w:t xml:space="preserve">Dear </w:t>
             </w:r>
-            <w:r>
-              <w:fldChar w:fldCharType="begin"/>
-            </w:r>
-            <w:r>
-              <w:instrText xml:space="preserve"> MERGEFIELD  FirstName  \* MERGEFORMAT </w:instrText>
-            </w:r>
-            <w:r>
-              <w:fldChar w:fldCharType="separate"/>
-            </w:r>
-            <w:r>
-              <w:rPr>
-                <w:noProof/>
-              </w:rPr>
-              <w:t>«FirstName»</w:t>
-            </w:r>
-            <w:r>
-              <w:rPr>
-                <w:noProof/>
-              </w:rPr>
-              <w:fldChar w:fldCharType="end"/>
-            </w:r>
+            <w:fldSimple w:instr=" MERGEFIELD  FirstName  \* MERGEFORMAT ">
+              <w:r>
+                <w:rPr>
+                  <w:noProof/>
+                </w:rPr>
+                <w:t>«FirstName»</w:t>
+              </w:r>
+            </w:fldSimple>
             <w:r>
               <w:t>,</w:t>
             </w:r>
@@ -525,102 +518,87 @@
             <w:r>
               <w:t>Date:</w:t>
             </w:r>
+            <w:r>
+              <w:t xml:space="preserve"> </w:t>
+            </w:r>
+            <w:fldSimple w:instr=" MERGEFIELD  DisplayDate  \* MERGEFORMAT ">
+              <w:r>
+                <w:rPr>
+                  <w:noProof/>
+                </w:rPr>
+                <w:t>«DisplayDate»</w:t>
+              </w:r>
+            </w:fldSimple>
           </w:p>
           <w:p>
             <w:r>
               <w:t>Time:</w:t>
             </w:r>
+            <w:r>
+              <w:t xml:space="preserve"> </w:t>
+            </w:r>
+            <w:r>
+              <w:fldChar w:fldCharType="begin"/>
+            </w:r>
+            <w:r>
+              <w:instrText xml:space="preserve"> MERGEFIELD  ShowStartTime  \* MERGEFORMAT </w:instrText>
+            </w:r>
+            <w:r>
+              <w:fldChar w:fldCharType="separate"/>
+            </w:r>
+            <w:r>
+              <w:rPr>
+                <w:noProof/>
+              </w:rPr>
+              <w:t>«ShowStartTime»</w:t>
+            </w:r>
+            <w:r>
+              <w:fldChar w:fldCharType="end"/>
+            </w:r>
+            <w:r>
+              <w:t xml:space="preserve"> </w:t>
+            </w:r>
+            <w:r>
+              <w:fldChar w:fldCharType="begin"/>
+            </w:r>
+            <w:r>
+              <w:instrText xml:space="preserve"> MERGEFIELD  ShowTimeZone  \* MERGEFORMAT </w:instrText>
+            </w:r>
+            <w:r>
+              <w:fldChar w:fldCharType="separate"/>
+            </w:r>
+            <w:r>
+              <w:rPr>
+                <w:noProof/>
+              </w:rPr>
+              <w:t>«ShowTimeZone»</w:t>
+            </w:r>
+            <w:r>
+              <w:rPr>
+                <w:noProof/>
+              </w:rPr>
+              <w:fldChar w:fldCharType="end"/>
+            </w:r>
           </w:p>
           <w:p>
             <w:r>
               <w:t>Duration:</w:t>
             </w:r>
+            <w:r>
+              <w:t xml:space="preserve"> </w:t>
+            </w:r>
+            <w:fldSimple w:instr=" MERGEFIELD  Duration  \* MERGEFORMAT ">
+              <w:r>
+                <w:rPr>
+                  <w:noProof/>
+                </w:rPr>
+                <w:t>«Duration»</w:t>
+              </w:r>
+            </w:fldSimple>
           </w:p>
           <w:p>
             <w:r>
               <w:t>Your Link:</w:t>
-            </w:r>
-            <w:bookmarkStart w:id="1" w:name="_GoBack"/>
-            <w:bookmarkEnd w:id="1"/>
-          </w:p>
-          <w:p>
-            <w:r>
-              <w:t>To ensure a trouble-free connection please note the following:</w:t>
-            </w:r>
-          </w:p>
-          <w:p>
-            <w:pPr>
-              <w:ind w:left="532" w:hanging="532"/>
-            </w:pPr>
-          </w:p>
-          <w:p>
-            <w:pPr>
-              <w:ind w:left="532" w:hanging="532"/>
-            </w:pPr>
-            <w:r>
-              <w:rPr>
-                <w:b/>
-                <w:i/>
-              </w:rPr>
-              <w:t>Will</w:t>
-            </w:r>
-            <w:r>
-              <w:rPr>
-                <w:b/>
-                <w:i/>
-              </w:rPr>
-              <w:t xml:space="preserve"> you </w:t>
-            </w:r>
-            <w:r>
-              <w:rPr>
-                <w:b/>
-                <w:i/>
-              </w:rPr>
-              <w:t>will be</w:t>
-            </w:r>
-            <w:r>
-              <w:rPr>
-                <w:b/>
-                <w:i/>
-              </w:rPr>
-              <w:t xml:space="preserve"> </w:t>
-            </w:r>
-            <w:r>
-              <w:rPr>
-                <w:b/>
-                <w:i/>
-              </w:rPr>
-              <w:t>attending alone or</w:t>
-            </w:r>
-            <w:r>
-              <w:rPr>
-                <w:b/>
-                <w:i/>
-              </w:rPr>
-              <w:t xml:space="preserve"> with</w:t>
-            </w:r>
-            <w:r>
-              <w:rPr>
-                <w:b/>
-                <w:i/>
-              </w:rPr>
-              <w:t xml:space="preserve"> co-workers</w:t>
-            </w:r>
-            <w:r>
-              <w:rPr>
-                <w:b/>
-                <w:i/>
-              </w:rPr>
-              <w:t xml:space="preserve"> at one location</w:t>
-            </w:r>
-            <w:r>
-              <w:t xml:space="preserve"> – </w:t>
-            </w:r>
-            <w:r>
-              <w:t>everything you need can be found at this link:</w:t>
-            </w:r>
-            <w:r>
-              <w:t xml:space="preserve"> </w:t>
             </w:r>
             <w:r>
               <w:t xml:space="preserve"> </w:t>
@@ -633,6 +611,129 @@
                 <w:t>«ClickToJoinLink»</w:t>
               </w:r>
             </w:fldSimple>
+          </w:p>
+          <w:p>
+            <w:pPr>
+              <w:rPr>
+                <w:noProof/>
+              </w:rPr>
+            </w:pPr>
+            <w:r>
+              <w:fldChar w:fldCharType="begin"/>
+            </w:r>
+            <w:r>
+              <w:instrText xml:space="preserve"> MERGEFIELD  AddReminder  \* MERGEFORMAT </w:instrText>
+            </w:r>
+            <w:r>
+              <w:fldChar w:fldCharType="separate"/>
+            </w:r>
+            <w:r>
+              <w:rPr>
+                <w:noProof/>
+              </w:rPr>
+              <w:t>«AddReminder»</w:t>
+            </w:r>
+            <w:r>
+              <w:rPr>
+                <w:noProof/>
+              </w:rPr>
+              <w:fldChar w:fldCharType="end"/>
+            </w:r>
+          </w:p>
+          <w:p/>
+          <w:p>
+            <w:pPr>
+              <w:ind w:left="532" w:hanging="532"/>
+            </w:pPr>
+            <w:r>
+              <w:rPr>
+                <w:b/>
+                <w:i/>
+              </w:rPr>
+              <w:t>Will</w:t>
+            </w:r>
+            <w:r>
+              <w:rPr>
+                <w:b/>
+                <w:i/>
+              </w:rPr>
+              <w:t xml:space="preserve"> you </w:t>
+            </w:r>
+            <w:r>
+              <w:rPr>
+                <w:b/>
+                <w:i/>
+              </w:rPr>
+              <w:t>will be</w:t>
+            </w:r>
+            <w:r>
+              <w:rPr>
+                <w:b/>
+                <w:i/>
+              </w:rPr>
+              <w:t xml:space="preserve"> </w:t>
+            </w:r>
+            <w:r>
+              <w:rPr>
+                <w:b/>
+                <w:i/>
+              </w:rPr>
+              <w:t>attending alone or</w:t>
+            </w:r>
+            <w:r>
+              <w:rPr>
+                <w:b/>
+                <w:i/>
+              </w:rPr>
+              <w:t xml:space="preserve"> with</w:t>
+            </w:r>
+            <w:r>
+              <w:rPr>
+                <w:b/>
+                <w:i/>
+              </w:rPr>
+              <w:t xml:space="preserve"> co-workers</w:t>
+            </w:r>
+            <w:r>
+              <w:rPr>
+                <w:b/>
+                <w:i/>
+              </w:rPr>
+              <w:t xml:space="preserve"> at one location</w:t>
+            </w:r>
+            <w:r>
+              <w:t xml:space="preserve"> – </w:t>
+            </w:r>
+            <w:r>
+              <w:t>everything you need can be found at this link:</w:t>
+            </w:r>
+            <w:r>
+              <w:t xml:space="preserve"> </w:t>
+            </w:r>
+            <w:r>
+              <w:t xml:space="preserve"> </w:t>
+            </w:r>
+            <w:r>
+              <w:fldChar w:fldCharType="begin"/>
+            </w:r>
+            <w:r>
+              <w:instrText xml:space="preserve"> MERGEFIELD  ClickToJoinLink  \* MERGEFORMAT </w:instrText>
+            </w:r>
+            <w:r>
+              <w:fldChar w:fldCharType="separate"/>
+            </w:r>
+            <w:r>
+              <w:rPr>
+                <w:noProof/>
+              </w:rPr>
+              <w:t>«ClickToJoinLink»</w:t>
+            </w:r>
+            <w:r>
+              <w:rPr>
+                <w:noProof/>
+              </w:rPr>
+              <w:fldChar w:fldCharType="end"/>
+            </w:r>
             <w:r>
               <w:rPr>
                 <w:noProof/>
@@ -663,59 +764,46 @@
             <w:r>
               <w:t xml:space="preserve"> </w:t>
             </w:r>
-            <w:r>
-              <w:fldChar w:fldCharType="begin"/>
-            </w:r>
-            <w:r>
-              <w:instrText xml:space="preserve"> MERGEFIELD  CCCaption  \* MERGEFORMAT </w:instrText>
-            </w:r>
-            <w:r>
-              <w:fldChar w:fldCharType="separate"/>
-            </w:r>
-            <w:r>
-              <w:rPr>
-                <w:noProof/>
-              </w:rPr>
-              <w:t>«CCCaption»</w:t>
-            </w:r>
-            <w:r>
-              <w:rPr>
-                <w:noProof/>
-              </w:rPr>
-              <w:fldChar w:fldCharType="end"/>
-            </w:r>
-            <w:r>
-              <w:fldChar w:fldCharType="begin"/>
-            </w:r>
-            <w:r>
-              <w:instrText xml:space="preserve"> MERGEFIELD  ExistingAddLocs  \* MERGEFORMAT </w:instrText>
-            </w:r>
-            <w:r>
-              <w:fldChar w:fldCharType="separate"/>
-            </w:r>
-            <w:r>
-              <w:rPr>
-                <w:noProof/>
-              </w:rPr>
-              <w:t>«ExistingAddLocs»</w:t>
-            </w:r>
-            <w:r>
-              <w:rPr>
-                <w:noProof/>
-              </w:rPr>
-              <w:fldChar w:fldCharType="end"/>
-            </w:r>
-            <w:r>
-              <w:t xml:space="preserve">  </w:t>
-            </w:r>
-            <w:fldSimple w:instr=" MERGEFIELD  AddLocsCost  \* MERGEFORMAT ">
+            <w:fldSimple w:instr=" MERGEFIELD  CCCaption  \* MERGEFORMAT ">
               <w:r>
                 <w:rPr>
                   <w:noProof/>
                 </w:rPr>
-                <w:t>«AddLocsCost»</w:t>
+                <w:t>«CCCaption»</w:t>
               </w:r>
             </w:fldSimple>
+            <w:fldSimple w:instr=" MERGEFIELD  ExistingAddLocs  \* MERGEFORMAT ">
+              <w:r>
+                <w:rPr>
+                  <w:noProof/>
+                </w:rPr>
+                <w:t>«ExistingAddLocs»</w:t>
+              </w:r>
+            </w:fldSimple>
+            <w:r>
+              <w:t xml:space="preserve">  </w:t>
+            </w:r>
+            <w:r>
+              <w:fldChar w:fldCharType="begin"/>
+            </w:r>
+            <w:r>
+              <w:instrText xml:space="preserve"> MERGEFIELD  AddLocsCost  \* MERGEFORMAT </w:instrText>
+            </w:r>
+            <w:r>
+              <w:fldChar w:fldCharType="separate"/>
+            </w:r>
+            <w:r>
+              <w:rPr>
+                <w:noProof/>
+              </w:rPr>
+              <w:t>«AddLocsCost»</w:t>
+            </w:r>
+            <w:r>
+              <w:rPr>
+                <w:noProof/>
+              </w:rPr>
+              <w:fldChar w:fldCharType="end"/>
+            </w:r>
           </w:p>
           <w:p>
             <w:pPr>
@@ -765,8 +853,8 @@
               </w:rPr>
               <w:t>«</w:t>
             </w:r>
-            <w:bookmarkStart w:id="2" w:name="OLE_LINK4"/>
-            <w:bookmarkStart w:id="3" w:name="OLE_LINK5"/>
+            <w:bookmarkStart w:id="1" w:name="OLE_LINK4"/>
+            <w:bookmarkStart w:id="2" w:name="OLE_LINK5"/>
             <w:r>
               <w:rPr>
                 <w:b/>
@@ -774,8 +862,8 @@
               </w:rPr>
               <w:t>ShowStartTime</w:t>
             </w:r>
+            <w:bookmarkEnd w:id="1"/>
             <w:bookmarkEnd w:id="2"/>
-            <w:bookmarkEnd w:id="3"/>
             <w:r>
               <w:rPr>
                 <w:b/>
@@ -814,22 +902,33 @@
               <w:t xml:space="preserve"> </w:t>
             </w:r>
             <w:r>
+              <w:rPr>
+                <w:b/>
+              </w:rPr>
               <w:fldChar w:fldCharType="begin"/>
             </w:r>
             <w:r>
+              <w:rPr>
+                <w:b/>
+              </w:rPr>
               <w:instrText xml:space="preserve"> MERGEFIELD  ShowTimeZone  \* MERGEFORMAT </w:instrText>
             </w:r>
             <w:r>
+              <w:rPr>
+                <w:b/>
+              </w:rPr>
               <w:fldChar w:fldCharType="separate"/>
             </w:r>
             <w:r>
               <w:rPr>
+                <w:b/>
                 <w:noProof/>
               </w:rPr>
               <w:t>«ShowTimeZone»</w:t>
             </w:r>
             <w:r>
               <w:rPr>
+                <w:b/>
                 <w:noProof/>
               </w:rPr>
               <w:fldChar w:fldCharType="end"/>
@@ -864,214 +963,96 @@
             <w:r>
               <w:t xml:space="preserve"> </w:t>
             </w:r>
-            <w:r>
-              <w:fldChar w:fldCharType="begin"/>
-            </w:r>
-            <w:r>
-              <w:instrText xml:space="preserve"> MERGEFIELD  ChangeTime</w:instrText>
-            </w:r>
-            <w:r>
-              <w:instrText xml:space="preserve">ZoneLink  \* MERGEFORMAT </w:instrText>
-            </w:r>
-            <w:r>
-              <w:fldChar w:fldCharType="separate"/>
-            </w:r>
-            <w:r>
-              <w:rPr>
-                <w:noProof/>
-              </w:rPr>
-              <w:t>«ChangeTimeZoneLink»</w:t>
-            </w:r>
-            <w:r>
-              <w:rPr>
-                <w:noProof/>
-              </w:rPr>
-              <w:fldChar w:fldCharType="end"/>
-            </w:r>
-          </w:p>
-          <w:p>
-            <w:pPr>
-              <w:ind w:left="532" w:hanging="540"/>
-            </w:pPr>
-          </w:p>
-          <w:p>
-            <w:pPr>
-              <w:ind w:left="532" w:hanging="540"/>
-              <w:rPr>
-                <w:noProof/>
-              </w:rPr>
-            </w:pPr>
-            <w:r>
-              <w:rPr>
-                <w:b/>
-                <w:i/>
-              </w:rPr>
-              <w:t xml:space="preserve">Add a reminder to your calendar. </w:t>
-            </w:r>
-            <w:r>
-              <w:t xml:space="preserve">This link to </w:t>
-            </w:r>
-            <w:r>
-              <w:t xml:space="preserve"> </w:t>
-            </w:r>
-            <w:r>
-              <w:fldChar w:fldCharType="begin"/>
-            </w:r>
-            <w:r>
-              <w:instrText xml:space="preserve"> MERGEFIELD  AddReminder  \* MERGEFORMAT </w:instrText>
-            </w:r>
-            <w:r>
-              <w:fldChar w:fldCharType="separate"/>
-            </w:r>
-            <w:r>
-              <w:rPr>
-                <w:noProof/>
-              </w:rPr>
-              <w:t>«AddReminder»</w:t>
-            </w:r>
-            <w:r>
-              <w:rPr>
-                <w:noProof/>
-              </w:rPr>
-              <w:fldChar w:fldCharType="end"/>
-            </w:r>
-          </w:p>
-          <w:p>
-            <w:pPr>
-              <w:ind w:left="532" w:hanging="540"/>
-            </w:pPr>
-          </w:p>
-          <w:p>
-            <w:pPr>
-              <w:ind w:left="532" w:hanging="540"/>
-            </w:pPr>
-            <w:r>
-              <w:rPr>
-                <w:b/>
-              </w:rPr>
-              <w:t>Following the event:</w:t>
-            </w:r>
-            <w:r>
-              <w:t xml:space="preserve"> </w:t>
-            </w:r>
-            <w:fldSimple w:instr=" MERGEFIELD  RegDesc  \* MERGEFORMAT ">
+            <w:fldSimple w:instr=" MERGEFIELD  ChangeTimeZoneLink  \* MERGEFORMAT ">
               <w:r>
                 <w:rPr>
                   <w:noProof/>
                 </w:rPr>
-                <w:t>«RegDesc»</w:t>
+                <w:t>«ChangeTimeZoneLink»</w:t>
               </w:r>
             </w:fldSimple>
           </w:p>
           <w:p/>
           <w:p>
-            <w:r>
-              <w:fldChar w:fldCharType="begin"/>
-            </w:r>
-            <w:r>
-              <w:instrText xml:space="preserve"> MERGEFIELD  PaymentCaption  \* MERGEFORMAT </w:instrText>
-            </w:r>
-            <w:r>
-              <w:fldChar w:fldCharType="separate"/>
-            </w:r>
-            <w:r>
-              <w:rPr>
-                <w:noProof/>
-              </w:rPr>
-              <w:t>«PaymentCaption»</w:t>
-            </w:r>
-            <w:r>
-              <w:rPr>
-                <w:noProof/>
-              </w:rPr>
-              <w:fldChar w:fldCharType="end"/>
-            </w:r>
+            <w:fldSimple w:instr=" MERGEFIELD  PaymentCaption  \* MERGEFORMAT ">
+              <w:r>
+                <w:rPr>
+                  <w:noProof/>
+                </w:rPr>
+                <w:t>«PaymentCaption»</w:t>
+              </w:r>
+            </w:fldSimple>
+            <w:bookmarkStart w:id="3" w:name="_GoBack"/>
+            <w:bookmarkEnd w:id="3"/>
           </w:p>
           <w:p>
             <w:pPr>
-              <w:ind w:left="532" w:hanging="540"/>
+              <w:spacing w:before="200"/>
             </w:pPr>
+            <w:r>
+              <w:t xml:space="preserve">The customer service staff at </w:t>
+            </w:r>
+            <w:r>
+              <w:fldChar w:fldCharType="begin"/>
+            </w:r>
+            <w:r>
+              <w:instrText xml:space="preserve"> MERGEFIELD  TenantName  \* MERGEFORMAT </w:instrText>
+            </w:r>
+            <w:r>
+              <w:fldChar w:fldCharType="separate"/>
+            </w:r>
+            <w:r>
+              <w:rPr>
+                <w:noProof/>
+              </w:rPr>
+              <w:t>«TenantName»</w:t>
+            </w:r>
+            <w:r>
+              <w:rPr>
+                <w:noProof/>
+              </w:rPr>
+              <w:fldChar w:fldCharType="end"/>
+            </w:r>
+            <w:r>
+              <w:t xml:space="preserve"> is confident you’ll find both our Webinars and our site’s ability to deliver that content meets the highest standards in the industry. And in the off chance it doesn’t, please email us (</w:t>
+            </w:r>
+            <w:r>
+              <w:fldChar w:fldCharType="begin"/>
+            </w:r>
+            <w:r>
+              <w:instrText xml:space="preserve"> MERGEFIELD  SupportEmail  \* MERGEFORMAT </w:instrText>
+            </w:r>
+            <w:r>
+              <w:fldChar w:fldCharType="separate"/>
+            </w:r>
+            <w:r>
+              <w:rPr>
+                <w:noProof/>
+              </w:rPr>
+              <w:t>«</w:t>
+            </w:r>
+            <w:proofErr w:type="spellStart"/>
+            <w:r>
+              <w:rPr>
+                <w:noProof/>
+              </w:rPr>
+              <w:t>SupportEmail</w:t>
+            </w:r>
+            <w:proofErr w:type="spellEnd"/>
+            <w:r>
+              <w:rPr>
+                <w:noProof/>
+              </w:rPr>
+              <w:t>»</w:t>
+            </w:r>
+            <w:r>
+              <w:fldChar w:fldCharType="end"/>
+            </w:r>
+            <w:r>
+              <w:t>) or visit our online chat where you’ll find a professional representative waiting to make sure your satisfaction is restored.</w:t>
+            </w:r>
           </w:p>
-          <w:p>
-            <w:r>
-              <w:t xml:space="preserve">The customer service staff at </w:t>
-            </w:r>
-            <w:r>
-              <w:fldChar w:fldCharType="begin"/>
-            </w:r>
-            <w:r>
-              <w:instrText xml:space="preserve"> MERGEFIELD  TenantName  \* MERGEFORMAT </w:instrText>
-            </w:r>
-            <w:r>
-              <w:fldChar w:fldCharType="separate"/>
-            </w:r>
-            <w:r>
-              <w:rPr>
-                <w:noProof/>
-              </w:rPr>
-              <w:t>«TenantName»</w:t>
-            </w:r>
-            <w:r>
-              <w:rPr>
-                <w:noProof/>
-              </w:rPr>
-              <w:fldChar w:fldCharType="end"/>
-            </w:r>
-            <w:r>
-              <w:t xml:space="preserve"> is confident you’ll find both </w:t>
-            </w:r>
-            <w:r>
-              <w:t xml:space="preserve">our Webinars and </w:t>
-            </w:r>
-            <w:r>
-              <w:t xml:space="preserve">our </w:t>
-            </w:r>
-            <w:r>
-              <w:t>Web</w:t>
-            </w:r>
-            <w:r>
-              <w:t xml:space="preserve">site’s ability to deliver </w:t>
-            </w:r>
-            <w:r>
-              <w:t>a first class experience</w:t>
-            </w:r>
-            <w:r>
-              <w:t xml:space="preserve"> meets the highest standards in the industry. And in the off chance it doesn’t, please</w:t>
-            </w:r>
-            <w:r>
-              <w:t xml:space="preserve"> email us or, for immediate assistance,</w:t>
-            </w:r>
-            <w:r>
-              <w:t xml:space="preserve"> visit our online chat where you’ll find a professional representative waiting to make sure your satisfaction is restored. </w:t>
-            </w:r>
-            <w:r>
-              <w:fldChar w:fldCharType="begin"/>
-            </w:r>
-            <w:r>
-              <w:instrText xml:space="preserve"> MERGEFIE</w:instrText>
-            </w:r>
-            <w:r>
-              <w:instrText xml:space="preserve">LD  TechSupportLink  \* MERGEFORMAT </w:instrText>
-            </w:r>
-            <w:r>
-              <w:fldChar w:fldCharType="separate"/>
-            </w:r>
-            <w:r>
-              <w:rPr>
-                <w:noProof/>
-              </w:rPr>
-              <w:t>TechSupportLink»</w:t>
-            </w:r>
-            <w:r>
-              <w:rPr>
-                <w:noProof/>
-              </w:rPr>
-              <w:fldChar w:fldCharType="end"/>
-            </w:r>
-            <w:r>
-              <w:t>.</w:t>
-            </w:r>
-          </w:p>
+          <w:p/>
           <w:p/>
           <w:p/>
         </w:tc>
@@ -1898,7 +1879,7 @@
 </file>
 
 <file path=customXml/itemProps1.xml><?xml version="1.0" encoding="utf-8"?>
-<ds:datastoreItem xmlns:ds="http://schemas.openxmlformats.org/officeDocument/2006/customXml" ds:itemID="{FDC44FB7-9E56-4F6B-9351-33D0B266293D}">
+<ds:datastoreItem xmlns:ds="http://schemas.openxmlformats.org/officeDocument/2006/customXml" ds:itemID="{17A500BA-D945-4620-9159-6C6BFC835DE0}">
   <ds:schemaRefs>
     <ds:schemaRef ds:uri="http://schemas.openxmlformats.org/officeDocument/2006/bibliography"/>
   </ds:schemaRefs>

</xml_diff>

<commit_message>
Minor typo fixes and refinements to notification templates
</commit_message>
<xml_diff>
--- a/CUWebinars.Web/App_Data/mergeTemplates/ConnectionInfo2.docx
+++ b/CUWebinars.Web/App_Data/mergeTemplates/ConnectionInfo2.docx
@@ -456,83 +456,136 @@
             <w:r>
               <w:t xml:space="preserve">Dear </w:t>
             </w:r>
-            <w:fldSimple w:instr=" MERGEFIELD  FirstName  \* MERGEFORMAT ">
+            <w:r>
+              <w:fldChar w:fldCharType="begin"/>
+            </w:r>
+            <w:r>
+              <w:instrText xml:space="preserve"> MERGEFIELD  FirstName  \* MERGEFORMAT </w:instrText>
+            </w:r>
+            <w:r>
+              <w:fldChar w:fldCharType="separate"/>
+            </w:r>
+            <w:r>
+              <w:rPr>
+                <w:noProof/>
+              </w:rPr>
+              <w:t>«FirstName»</w:t>
+            </w:r>
+            <w:r>
+              <w:rPr>
+                <w:noProof/>
+              </w:rPr>
+              <w:fldChar w:fldCharType="end"/>
+            </w:r>
+            <w:r>
+              <w:t>,</w:t>
+            </w:r>
+          </w:p>
+          <w:p/>
+          <w:p>
+            <w:r>
+              <w:t xml:space="preserve">It’s time to get ready for the </w:t>
+            </w:r>
+            <w:r>
+              <w:rPr>
+                <w:i/>
+              </w:rPr>
+              <w:fldChar w:fldCharType="begin"/>
+            </w:r>
+            <w:r>
+              <w:rPr>
+                <w:i/>
+              </w:rPr>
+              <w:instrText xml:space="preserve"> MERGEFIELD  WebinarTitle  \* MERGEFORMAT </w:instrText>
+            </w:r>
+            <w:r>
+              <w:rPr>
+                <w:i/>
+              </w:rPr>
+              <w:fldChar w:fldCharType="separate"/>
+            </w:r>
+            <w:r>
+              <w:rPr>
+                <w:i/>
+                <w:noProof/>
+              </w:rPr>
+              <w:t>«WebinarTitle»</w:t>
+            </w:r>
+            <w:r>
+              <w:rPr>
+                <w:i/>
+              </w:rPr>
+              <w:fldChar w:fldCharType="end"/>
+            </w:r>
+            <w:r>
+              <w:rPr>
+                <w:i/>
+              </w:rPr>
+              <w:t xml:space="preserve"> </w:t>
+            </w:r>
+            <w:r>
+              <w:t xml:space="preserve">webinar. </w:t>
+            </w:r>
+          </w:p>
+          <w:p>
+            <w:r>
+              <w:t>Date:</w:t>
+            </w:r>
+            <w:r>
+              <w:t xml:space="preserve"> </w:t>
+            </w:r>
+            <w:r>
+              <w:fldChar w:fldCharType="begin"/>
+            </w:r>
+            <w:r>
+              <w:instrText xml:space="preserve"> MERGEFIELD  DisplayDate  \* MERGEFORMAT </w:instrText>
+            </w:r>
+            <w:r>
+              <w:fldChar w:fldCharType="separate"/>
+            </w:r>
+            <w:r>
+              <w:rPr>
+                <w:noProof/>
+              </w:rPr>
+              <w:t>«DisplayDate»</w:t>
+            </w:r>
+            <w:r>
+              <w:rPr>
+                <w:noProof/>
+              </w:rPr>
+              <w:fldChar w:fldCharType="end"/>
+            </w:r>
+          </w:p>
+          <w:p>
+            <w:r>
+              <w:t>Time:</w:t>
+            </w:r>
+            <w:r>
+              <w:t xml:space="preserve"> </w:t>
+            </w:r>
+            <w:fldSimple w:instr=" MERGEFIELD  ShowStartTime  \* MERGEFORMAT ">
               <w:r>
                 <w:rPr>
                   <w:noProof/>
                 </w:rPr>
-                <w:t>«FirstName»</w:t>
+                <w:t>«ShowStartTime»</w:t>
               </w:r>
             </w:fldSimple>
             <w:r>
-              <w:t>,</w:t>
-            </w:r>
-          </w:p>
-          <w:p/>
-          <w:p>
-            <w:r>
-              <w:t xml:space="preserve">It’s time to get ready for the </w:t>
-            </w:r>
-            <w:r>
-              <w:rPr>
-                <w:i/>
-              </w:rPr>
-              <w:fldChar w:fldCharType="begin"/>
-            </w:r>
-            <w:r>
-              <w:rPr>
-                <w:i/>
-              </w:rPr>
-              <w:instrText xml:space="preserve"> MERGEFIELD  WebinarTitle  \* MERGEFORMAT </w:instrText>
-            </w:r>
-            <w:r>
-              <w:rPr>
-                <w:i/>
-              </w:rPr>
-              <w:fldChar w:fldCharType="separate"/>
-            </w:r>
-            <w:r>
-              <w:rPr>
-                <w:i/>
-                <w:noProof/>
-              </w:rPr>
-              <w:t>«WebinarTitle»</w:t>
-            </w:r>
-            <w:r>
-              <w:rPr>
-                <w:i/>
-              </w:rPr>
-              <w:fldChar w:fldCharType="end"/>
-            </w:r>
-            <w:r>
-              <w:rPr>
-                <w:i/>
-              </w:rPr>
               <w:t xml:space="preserve"> </w:t>
             </w:r>
-            <w:r>
-              <w:t xml:space="preserve">webinar. </w:t>
-            </w:r>
-          </w:p>
-          <w:p>
-            <w:r>
-              <w:t>Date:</w:t>
-            </w:r>
-            <w:r>
-              <w:t xml:space="preserve"> </w:t>
-            </w:r>
-            <w:fldSimple w:instr=" MERGEFIELD  DisplayDate  \* MERGEFORMAT ">
+            <w:fldSimple w:instr=" MERGEFIELD  ShowTimeZone  \* MERGEFORMAT ">
               <w:r>
                 <w:rPr>
                   <w:noProof/>
                 </w:rPr>
-                <w:t>«DisplayDate»</w:t>
+                <w:t>«ShowTimeZone»</w:t>
               </w:r>
             </w:fldSimple>
           </w:p>
           <w:p>
             <w:r>
-              <w:t>Time:</w:t>
+              <w:t>Duration:</w:t>
             </w:r>
             <w:r>
               <w:t xml:space="preserve"> </w:t>
@@ -541,7 +594,7 @@
               <w:fldChar w:fldCharType="begin"/>
             </w:r>
             <w:r>
-              <w:instrText xml:space="preserve"> MERGEFIELD  ShowStartTime  \* MERGEFORMAT </w:instrText>
+              <w:instrText xml:space="preserve"> MERGEFIELD  Duration  \* MERGEFORMAT </w:instrText>
             </w:r>
             <w:r>
               <w:fldChar w:fldCharType="separate"/>
@@ -550,28 +603,7 @@
               <w:rPr>
                 <w:noProof/>
               </w:rPr>
-              <w:t>«ShowStartTime»</w:t>
-            </w:r>
-            <w:r>
-              <w:fldChar w:fldCharType="end"/>
-            </w:r>
-            <w:r>
-              <w:t xml:space="preserve"> </w:t>
-            </w:r>
-            <w:r>
-              <w:fldChar w:fldCharType="begin"/>
-            </w:r>
-            <w:r>
-              <w:instrText xml:space="preserve"> MERGEFIELD  ShowTimeZone  \* MERGEFORMAT </w:instrText>
-            </w:r>
-            <w:r>
-              <w:fldChar w:fldCharType="separate"/>
-            </w:r>
-            <w:r>
-              <w:rPr>
-                <w:noProof/>
-              </w:rPr>
-              <w:t>«ShowTimeZone»</w:t>
+              <w:t>«Duration»</w:t>
             </w:r>
             <w:r>
               <w:rPr>
@@ -582,23 +614,117 @@
           </w:p>
           <w:p>
             <w:r>
-              <w:t>Duration:</w:t>
+              <w:t>Your Link:</w:t>
             </w:r>
             <w:r>
               <w:t xml:space="preserve"> </w:t>
             </w:r>
-            <w:fldSimple w:instr=" MERGEFIELD  Duration  \* MERGEFORMAT ">
+            <w:r>
+              <w:fldChar w:fldCharType="begin"/>
+            </w:r>
+            <w:r>
+              <w:instrText xml:space="preserve"> MERGEFIELD  ClickToJoinLink  \* MERGEFORMAT </w:instrText>
+            </w:r>
+            <w:r>
+              <w:fldChar w:fldCharType="separate"/>
+            </w:r>
+            <w:r>
+              <w:rPr>
+                <w:noProof/>
+              </w:rPr>
+              <w:t>«ClickToJoinLink»</w:t>
+            </w:r>
+            <w:r>
+              <w:rPr>
+                <w:noProof/>
+              </w:rPr>
+              <w:fldChar w:fldCharType="end"/>
+            </w:r>
+          </w:p>
+          <w:p>
+            <w:pPr>
+              <w:rPr>
+                <w:noProof/>
+              </w:rPr>
+            </w:pPr>
+            <w:fldSimple w:instr=" MERGEFIELD  AddReminder  \* MERGEFORMAT ">
               <w:r>
                 <w:rPr>
                   <w:noProof/>
                 </w:rPr>
-                <w:t>«Duration»</w:t>
+                <w:t>«AddReminder»</w:t>
               </w:r>
             </w:fldSimple>
           </w:p>
+          <w:p/>
           <w:p>
-            <w:r>
-              <w:t>Your Link:</w:t>
+            <w:pPr>
+              <w:ind w:left="532" w:hanging="532"/>
+            </w:pPr>
+            <w:r>
+              <w:rPr>
+                <w:b/>
+                <w:i/>
+              </w:rPr>
+              <w:t>Will</w:t>
+            </w:r>
+            <w:r>
+              <w:rPr>
+                <w:b/>
+                <w:i/>
+              </w:rPr>
+              <w:t xml:space="preserve"> you </w:t>
+            </w:r>
+            <w:r>
+              <w:rPr>
+                <w:b/>
+                <w:i/>
+              </w:rPr>
+              <w:t>will be</w:t>
+            </w:r>
+            <w:r>
+              <w:rPr>
+                <w:b/>
+                <w:i/>
+              </w:rPr>
+              <w:t xml:space="preserve"> </w:t>
+            </w:r>
+            <w:r>
+              <w:rPr>
+                <w:b/>
+                <w:i/>
+              </w:rPr>
+              <w:t>attending alone or</w:t>
+            </w:r>
+            <w:r>
+              <w:rPr>
+                <w:b/>
+                <w:i/>
+              </w:rPr>
+              <w:t xml:space="preserve"> with</w:t>
+            </w:r>
+            <w:r>
+              <w:rPr>
+                <w:b/>
+                <w:i/>
+              </w:rPr>
+              <w:t xml:space="preserve"> co-workers</w:t>
+            </w:r>
+            <w:r>
+              <w:rPr>
+                <w:b/>
+                <w:i/>
+              </w:rPr>
+              <w:t xml:space="preserve"> at one location</w:t>
+            </w:r>
+            <w:r>
+              <w:t xml:space="preserve"> – </w:t>
+            </w:r>
+            <w:r>
+              <w:t>everything you need can be found at this link:</w:t>
+            </w:r>
+            <w:r>
+              <w:t xml:space="preserve"> </w:t>
             </w:r>
             <w:r>
               <w:t xml:space="preserve"> </w:t>
@@ -611,18 +737,41 @@
                 <w:t>«ClickToJoinLink»</w:t>
               </w:r>
             </w:fldSimple>
-          </w:p>
-          <w:p>
-            <w:pPr>
-              <w:rPr>
-                <w:noProof/>
-              </w:rPr>
-            </w:pPr>
+            <w:r>
+              <w:rPr>
+                <w:noProof/>
+              </w:rPr>
+              <w:t xml:space="preserve">. </w:t>
+            </w:r>
+            <w:r>
+              <w:rPr>
+                <w:b/>
+                <w:i/>
+              </w:rPr>
+              <w:t>Are you planning to forward this</w:t>
+            </w:r>
+            <w:r>
+              <w:rPr>
+                <w:b/>
+                <w:i/>
+              </w:rPr>
+              <w:t xml:space="preserve"> email</w:t>
+            </w:r>
+            <w:r>
+              <w:rPr>
+                <w:b/>
+                <w:i/>
+              </w:rPr>
+              <w:t xml:space="preserve"> to an associate?</w:t>
+            </w:r>
+            <w:r>
+              <w:t xml:space="preserve"> </w:t>
+            </w:r>
             <w:r>
               <w:fldChar w:fldCharType="begin"/>
             </w:r>
             <w:r>
-              <w:instrText xml:space="preserve"> MERGEFIELD  AddReminder  \* MERGEFORMAT </w:instrText>
+              <w:instrText xml:space="preserve"> MERGEFIELD  CCCaption  \* MERGEFORMAT </w:instrText>
             </w:r>
             <w:r>
               <w:fldChar w:fldCharType="separate"/>
@@ -631,7 +780,7 @@
               <w:rPr>
                 <w:noProof/>
               </w:rPr>
-              <w:t>«AddReminder»</w:t>
+              <w:t>«CCCaption»</w:t>
             </w:r>
             <w:r>
               <w:rPr>
@@ -639,85 +788,11 @@
               </w:rPr>
               <w:fldChar w:fldCharType="end"/>
             </w:r>
-          </w:p>
-          <w:p/>
-          <w:p>
-            <w:pPr>
-              <w:ind w:left="532" w:hanging="532"/>
-            </w:pPr>
-            <w:r>
-              <w:rPr>
-                <w:b/>
-                <w:i/>
-              </w:rPr>
-              <w:t>Will</w:t>
-            </w:r>
-            <w:r>
-              <w:rPr>
-                <w:b/>
-                <w:i/>
-              </w:rPr>
-              <w:t xml:space="preserve"> you </w:t>
-            </w:r>
-            <w:r>
-              <w:rPr>
-                <w:b/>
-                <w:i/>
-              </w:rPr>
-              <w:t>will be</w:t>
-            </w:r>
-            <w:r>
-              <w:rPr>
-                <w:b/>
-                <w:i/>
-              </w:rPr>
-              <w:t xml:space="preserve"> </w:t>
-            </w:r>
-            <w:r>
-              <w:rPr>
-                <w:b/>
-                <w:i/>
-              </w:rPr>
-              <w:t>attending alone or</w:t>
-            </w:r>
-            <w:r>
-              <w:rPr>
-                <w:b/>
-                <w:i/>
-              </w:rPr>
-              <w:t xml:space="preserve"> with</w:t>
-            </w:r>
-            <w:r>
-              <w:rPr>
-                <w:b/>
-                <w:i/>
-              </w:rPr>
-              <w:t xml:space="preserve"> co-workers</w:t>
-            </w:r>
-            <w:r>
-              <w:rPr>
-                <w:b/>
-                <w:i/>
-              </w:rPr>
-              <w:t xml:space="preserve"> at one location</w:t>
-            </w:r>
-            <w:r>
-              <w:t xml:space="preserve"> – </w:t>
-            </w:r>
-            <w:r>
-              <w:t>everything you need can be found at this link:</w:t>
-            </w:r>
-            <w:r>
-              <w:t xml:space="preserve"> </w:t>
-            </w:r>
-            <w:r>
-              <w:t xml:space="preserve"> </w:t>
-            </w:r>
             <w:r>
               <w:fldChar w:fldCharType="begin"/>
             </w:r>
             <w:r>
-              <w:instrText xml:space="preserve"> MERGEFIELD  ClickToJoinLink  \* MERGEFORMAT </w:instrText>
+              <w:instrText xml:space="preserve"> MERGEFIELD  ExistingAddLocs  \* MERGEFORMAT </w:instrText>
             </w:r>
             <w:r>
               <w:fldChar w:fldCharType="separate"/>
@@ -726,7 +801,7 @@
               <w:rPr>
                 <w:noProof/>
               </w:rPr>
-              <w:t>«ClickToJoinLink»</w:t>
+              <w:t>«ExistingAddLocs»</w:t>
             </w:r>
             <w:r>
               <w:rPr>
@@ -735,75 +810,16 @@
               <w:fldChar w:fldCharType="end"/>
             </w:r>
             <w:r>
-              <w:rPr>
-                <w:noProof/>
-              </w:rPr>
-              <w:t xml:space="preserve">. </w:t>
-            </w:r>
-            <w:r>
-              <w:rPr>
-                <w:b/>
-                <w:i/>
-              </w:rPr>
-              <w:t>Are you planning to forward this</w:t>
-            </w:r>
-            <w:r>
-              <w:rPr>
-                <w:b/>
-                <w:i/>
-              </w:rPr>
-              <w:t xml:space="preserve"> email</w:t>
-            </w:r>
-            <w:r>
-              <w:rPr>
-                <w:b/>
-                <w:i/>
-              </w:rPr>
-              <w:t xml:space="preserve"> to an associate?</w:t>
-            </w:r>
-            <w:r>
-              <w:t xml:space="preserve"> </w:t>
-            </w:r>
-            <w:fldSimple w:instr=" MERGEFIELD  CCCaption  \* MERGEFORMAT ">
+              <w:t xml:space="preserve">  </w:t>
+            </w:r>
+            <w:fldSimple w:instr=" MERGEFIELD  AddLocsCost  \* MERGEFORMAT ">
               <w:r>
                 <w:rPr>
                   <w:noProof/>
                 </w:rPr>
-                <w:t>«CCCaption»</w:t>
+                <w:t>«AddLocsCost»</w:t>
               </w:r>
             </w:fldSimple>
-            <w:fldSimple w:instr=" MERGEFIELD  ExistingAddLocs  \* MERGEFORMAT ">
-              <w:r>
-                <w:rPr>
-                  <w:noProof/>
-                </w:rPr>
-                <w:t>«ExistingAddLocs»</w:t>
-              </w:r>
-            </w:fldSimple>
-            <w:r>
-              <w:t xml:space="preserve">  </w:t>
-            </w:r>
-            <w:r>
-              <w:fldChar w:fldCharType="begin"/>
-            </w:r>
-            <w:r>
-              <w:instrText xml:space="preserve"> MERGEFIELD  AddLocsCost  \* MERGEFORMAT </w:instrText>
-            </w:r>
-            <w:r>
-              <w:fldChar w:fldCharType="separate"/>
-            </w:r>
-            <w:r>
-              <w:rPr>
-                <w:noProof/>
-              </w:rPr>
-              <w:t>«AddLocsCost»</w:t>
-            </w:r>
-            <w:r>
-              <w:rPr>
-                <w:noProof/>
-              </w:rPr>
-              <w:fldChar w:fldCharType="end"/>
-            </w:r>
           </w:p>
           <w:p>
             <w:pPr>
@@ -963,27 +979,90 @@
             <w:r>
               <w:t xml:space="preserve"> </w:t>
             </w:r>
-            <w:fldSimple w:instr=" MERGEFIELD  ChangeTimeZoneLink  \* MERGEFORMAT ">
-              <w:r>
-                <w:rPr>
-                  <w:noProof/>
-                </w:rPr>
-                <w:t>«ChangeTimeZoneLink»</w:t>
-              </w:r>
-            </w:fldSimple>
+            <w:r>
+              <w:fldChar w:fldCharType="begin"/>
+            </w:r>
+            <w:r>
+              <w:instrText xml:space="preserve"> MERGEFIELD  ChangeTimeZoneLink  \* MERGEFORMAT </w:instrText>
+            </w:r>
+            <w:r>
+              <w:fldChar w:fldCharType="separate"/>
+            </w:r>
+            <w:r>
+              <w:rPr>
+                <w:noProof/>
+              </w:rPr>
+              <w:t>«ChangeTimeZoneLink»</w:t>
+            </w:r>
+            <w:r>
+              <w:rPr>
+                <w:noProof/>
+              </w:rPr>
+              <w:fldChar w:fldCharType="end"/>
+            </w:r>
           </w:p>
           <w:p/>
           <w:p>
-            <w:fldSimple w:instr=" MERGEFIELD  PaymentCaption  \* MERGEFORMAT ">
-              <w:r>
-                <w:rPr>
-                  <w:noProof/>
-                </w:rPr>
-                <w:t>«PaymentCaption»</w:t>
-              </w:r>
-            </w:fldSimple>
             <w:bookmarkStart w:id="3" w:name="_GoBack"/>
+            <w:r>
+              <w:rPr>
+                <w:b/>
+                <w:i/>
+              </w:rPr>
+              <w:t>Detailed connection info</w:t>
+            </w:r>
+            <w:r>
+              <w:t xml:space="preserve"> </w:t>
+            </w:r>
             <w:bookmarkEnd w:id="3"/>
+            <w:r>
+              <w:t xml:space="preserve">(including a chance to test your computer’s readiness) can be viewed at </w:t>
+            </w:r>
+            <w:r>
+              <w:fldChar w:fldCharType="begin"/>
+            </w:r>
+            <w:r>
+              <w:instrText xml:space="preserve"> MERGEFIELD  DetailedConnectionInfoLink  \* MERGEFORMAT </w:instrText>
+            </w:r>
+            <w:r>
+              <w:fldChar w:fldCharType="separate"/>
+            </w:r>
+            <w:r>
+              <w:rPr>
+                <w:noProof/>
+              </w:rPr>
+              <w:t>«DetailedConnectionInfoLink»</w:t>
+            </w:r>
+            <w:r>
+              <w:fldChar w:fldCharType="end"/>
+            </w:r>
+            <w:r>
+              <w:t xml:space="preserve">. </w:t>
+            </w:r>
+          </w:p>
+          <w:p/>
+          <w:p>
+            <w:r>
+              <w:fldChar w:fldCharType="begin"/>
+            </w:r>
+            <w:r>
+              <w:instrText xml:space="preserve"> MERGEFIELD  PaymentCaption  \* MERGEFORMAT </w:instrText>
+            </w:r>
+            <w:r>
+              <w:fldChar w:fldCharType="separate"/>
+            </w:r>
+            <w:r>
+              <w:rPr>
+                <w:noProof/>
+              </w:rPr>
+              <w:t>«PaymentCaption»</w:t>
+            </w:r>
+            <w:r>
+              <w:rPr>
+                <w:noProof/>
+              </w:rPr>
+              <w:fldChar w:fldCharType="end"/>
+            </w:r>
           </w:p>
           <w:p>
             <w:pPr>
@@ -992,62 +1071,25 @@
             <w:r>
               <w:t xml:space="preserve">The customer service staff at </w:t>
             </w:r>
-            <w:r>
-              <w:fldChar w:fldCharType="begin"/>
-            </w:r>
-            <w:r>
-              <w:instrText xml:space="preserve"> MERGEFIELD  TenantName  \* MERGEFORMAT </w:instrText>
-            </w:r>
-            <w:r>
-              <w:fldChar w:fldCharType="separate"/>
-            </w:r>
-            <w:r>
-              <w:rPr>
-                <w:noProof/>
-              </w:rPr>
-              <w:t>«TenantName»</w:t>
-            </w:r>
-            <w:r>
-              <w:rPr>
-                <w:noProof/>
-              </w:rPr>
-              <w:fldChar w:fldCharType="end"/>
-            </w:r>
+            <w:fldSimple w:instr=" MERGEFIELD  TenantName  \* MERGEFORMAT ">
+              <w:r>
+                <w:rPr>
+                  <w:noProof/>
+                </w:rPr>
+                <w:t>«TenantName»</w:t>
+              </w:r>
+            </w:fldSimple>
             <w:r>
               <w:t xml:space="preserve"> is confident you’ll find both our Webinars and our site’s ability to deliver that content meets the highest standards in the industry. And in the off chance it doesn’t, please email us (</w:t>
             </w:r>
-            <w:r>
-              <w:fldChar w:fldCharType="begin"/>
-            </w:r>
-            <w:r>
-              <w:instrText xml:space="preserve"> MERGEFIELD  SupportEmail  \* MERGEFORMAT </w:instrText>
-            </w:r>
-            <w:r>
-              <w:fldChar w:fldCharType="separate"/>
-            </w:r>
-            <w:r>
-              <w:rPr>
-                <w:noProof/>
-              </w:rPr>
-              <w:t>«</w:t>
-            </w:r>
-            <w:proofErr w:type="spellStart"/>
-            <w:r>
-              <w:rPr>
-                <w:noProof/>
-              </w:rPr>
-              <w:t>SupportEmail</w:t>
-            </w:r>
-            <w:proofErr w:type="spellEnd"/>
-            <w:r>
-              <w:rPr>
-                <w:noProof/>
-              </w:rPr>
-              <w:t>»</w:t>
-            </w:r>
-            <w:r>
-              <w:fldChar w:fldCharType="end"/>
-            </w:r>
+            <w:fldSimple w:instr=" MERGEFIELD  SupportEmail  \* MERGEFORMAT ">
+              <w:r>
+                <w:rPr>
+                  <w:noProof/>
+                </w:rPr>
+                <w:t>«SupportEmail»</w:t>
+              </w:r>
+            </w:fldSimple>
             <w:r>
               <w:t>) or visit our online chat where you’ll find a professional representative waiting to make sure your satisfaction is restored.</w:t>
             </w:r>
@@ -1879,7 +1921,7 @@
 </file>
 
 <file path=customXml/itemProps1.xml><?xml version="1.0" encoding="utf-8"?>
-<ds:datastoreItem xmlns:ds="http://schemas.openxmlformats.org/officeDocument/2006/customXml" ds:itemID="{17A500BA-D945-4620-9159-6C6BFC835DE0}">
+<ds:datastoreItem xmlns:ds="http://schemas.openxmlformats.org/officeDocument/2006/customXml" ds:itemID="{0BEAD1AC-7F3E-47FE-B23B-A77079C68D62}">
   <ds:schemaRefs>
     <ds:schemaRef ds:uri="http://schemas.openxmlformats.org/officeDocument/2006/bibliography"/>
   </ds:schemaRefs>

</xml_diff>

<commit_message>
Overhauls Json Comments Add Send OrderConfirmation when ACS approves order
</commit_message>
<xml_diff>
--- a/CUWebinars.Web/App_Data/mergeTemplates/ConnectionInfo2.docx
+++ b/CUWebinars.Web/App_Data/mergeTemplates/ConnectionInfo2.docx
@@ -456,275 +456,83 @@
             <w:r>
               <w:t xml:space="preserve">Dear </w:t>
             </w:r>
-            <w:r>
-              <w:fldChar w:fldCharType="begin"/>
-            </w:r>
-            <w:r>
-              <w:instrText xml:space="preserve"> MERGEFIELD  FirstName  \* MERGEFORMAT </w:instrText>
-            </w:r>
-            <w:r>
-              <w:fldChar w:fldCharType="separate"/>
-            </w:r>
-            <w:r>
-              <w:rPr>
-                <w:noProof/>
-              </w:rPr>
-              <w:t>«FirstName»</w:t>
-            </w:r>
-            <w:r>
-              <w:rPr>
-                <w:noProof/>
-              </w:rPr>
-              <w:fldChar w:fldCharType="end"/>
-            </w:r>
-            <w:r>
-              <w:t>,</w:t>
-            </w:r>
-          </w:p>
-          <w:p/>
-          <w:p>
-            <w:r>
-              <w:t xml:space="preserve">It’s time to get ready for the </w:t>
-            </w:r>
-            <w:r>
-              <w:rPr>
-                <w:i/>
-              </w:rPr>
-              <w:fldChar w:fldCharType="begin"/>
-            </w:r>
-            <w:r>
-              <w:rPr>
-                <w:i/>
-              </w:rPr>
-              <w:instrText xml:space="preserve"> MERGEFIELD  WebinarTitle  \* MERGEFORMAT </w:instrText>
-            </w:r>
-            <w:r>
-              <w:rPr>
-                <w:i/>
-              </w:rPr>
-              <w:fldChar w:fldCharType="separate"/>
-            </w:r>
-            <w:r>
-              <w:rPr>
-                <w:i/>
-                <w:noProof/>
-              </w:rPr>
-              <w:t>«WebinarTitle»</w:t>
-            </w:r>
-            <w:r>
-              <w:rPr>
-                <w:i/>
-              </w:rPr>
-              <w:fldChar w:fldCharType="end"/>
-            </w:r>
-            <w:r>
-              <w:rPr>
-                <w:i/>
-              </w:rPr>
-              <w:t xml:space="preserve"> </w:t>
-            </w:r>
-            <w:r>
-              <w:t xml:space="preserve">webinar. </w:t>
-            </w:r>
-          </w:p>
-          <w:p>
-            <w:r>
-              <w:t>Date:</w:t>
-            </w:r>
-            <w:r>
-              <w:t xml:space="preserve"> </w:t>
-            </w:r>
-            <w:r>
-              <w:fldChar w:fldCharType="begin"/>
-            </w:r>
-            <w:r>
-              <w:instrText xml:space="preserve"> MERGEFIELD  DisplayDate  \* MERGEFORMAT </w:instrText>
-            </w:r>
-            <w:r>
-              <w:fldChar w:fldCharType="separate"/>
-            </w:r>
-            <w:r>
-              <w:rPr>
-                <w:noProof/>
-              </w:rPr>
-              <w:t>«DisplayDate»</w:t>
-            </w:r>
-            <w:r>
-              <w:rPr>
-                <w:noProof/>
-              </w:rPr>
-              <w:fldChar w:fldCharType="end"/>
-            </w:r>
-          </w:p>
-          <w:p>
-            <w:r>
-              <w:t>Time:</w:t>
-            </w:r>
-            <w:r>
-              <w:t xml:space="preserve"> </w:t>
-            </w:r>
-            <w:fldSimple w:instr=" MERGEFIELD  ShowStartTime  \* MERGEFORMAT ">
+            <w:fldSimple w:instr=" MERGEFIELD  FirstName  \* MERGEFORMAT ">
               <w:r>
                 <w:rPr>
                   <w:noProof/>
                 </w:rPr>
-                <w:t>«ShowStartTime»</w:t>
+                <w:t>«FirstName»</w:t>
               </w:r>
             </w:fldSimple>
             <w:r>
+              <w:t>,</w:t>
+            </w:r>
+          </w:p>
+          <w:p/>
+          <w:p>
+            <w:r>
+              <w:t xml:space="preserve">It’s time to get ready for the </w:t>
+            </w:r>
+            <w:r>
+              <w:rPr>
+                <w:i/>
+              </w:rPr>
+              <w:fldChar w:fldCharType="begin"/>
+            </w:r>
+            <w:r>
+              <w:rPr>
+                <w:i/>
+              </w:rPr>
+              <w:instrText xml:space="preserve"> MERGEFIELD  WebinarTitle  \* MERGEFORMAT </w:instrText>
+            </w:r>
+            <w:r>
+              <w:rPr>
+                <w:i/>
+              </w:rPr>
+              <w:fldChar w:fldCharType="separate"/>
+            </w:r>
+            <w:r>
+              <w:rPr>
+                <w:i/>
+                <w:noProof/>
+              </w:rPr>
+              <w:t>«WebinarTitle»</w:t>
+            </w:r>
+            <w:r>
+              <w:rPr>
+                <w:i/>
+              </w:rPr>
+              <w:fldChar w:fldCharType="end"/>
+            </w:r>
+            <w:r>
+              <w:rPr>
+                <w:i/>
+              </w:rPr>
               <w:t xml:space="preserve"> </w:t>
             </w:r>
-            <w:fldSimple w:instr=" MERGEFIELD  ShowTimeZone  \* MERGEFORMAT ">
+            <w:r>
+              <w:t xml:space="preserve">webinar. </w:t>
+            </w:r>
+          </w:p>
+          <w:p>
+            <w:r>
+              <w:t>Date:</w:t>
+            </w:r>
+            <w:r>
+              <w:t xml:space="preserve"> </w:t>
+            </w:r>
+            <w:fldSimple w:instr=" MERGEFIELD  DisplayDate  \* MERGEFORMAT ">
               <w:r>
                 <w:rPr>
                   <w:noProof/>
                 </w:rPr>
-                <w:t>«ShowTimeZone»</w:t>
+                <w:t>«DisplayDate»</w:t>
               </w:r>
             </w:fldSimple>
           </w:p>
           <w:p>
             <w:r>
-              <w:t>Duration:</w:t>
-            </w:r>
-            <w:r>
-              <w:t xml:space="preserve"> </w:t>
-            </w:r>
-            <w:r>
-              <w:fldChar w:fldCharType="begin"/>
-            </w:r>
-            <w:r>
-              <w:instrText xml:space="preserve"> MERGEFIELD  Duration  \* MERGEFORMAT </w:instrText>
-            </w:r>
-            <w:r>
-              <w:fldChar w:fldCharType="separate"/>
-            </w:r>
-            <w:r>
-              <w:rPr>
-                <w:noProof/>
-              </w:rPr>
-              <w:t>«Duration»</w:t>
-            </w:r>
-            <w:r>
-              <w:rPr>
-                <w:noProof/>
-              </w:rPr>
-              <w:fldChar w:fldCharType="end"/>
-            </w:r>
-          </w:p>
-          <w:p>
-            <w:r>
               <w:t>Your Link:</w:t>
-            </w:r>
-            <w:r>
-              <w:t xml:space="preserve"> </w:t>
-            </w:r>
-            <w:r>
-              <w:fldChar w:fldCharType="begin"/>
-            </w:r>
-            <w:r>
-              <w:instrText xml:space="preserve"> MERGEFIELD  ClickToJoinLink  \* MERGEFORMAT </w:instrText>
-            </w:r>
-            <w:r>
-              <w:fldChar w:fldCharType="separate"/>
-            </w:r>
-            <w:r>
-              <w:rPr>
-                <w:noProof/>
-              </w:rPr>
-              <w:t>«ClickToJoinLink»</w:t>
-            </w:r>
-            <w:r>
-              <w:rPr>
-                <w:noProof/>
-              </w:rPr>
-              <w:fldChar w:fldCharType="end"/>
-            </w:r>
-          </w:p>
-          <w:p>
-            <w:pPr>
-              <w:rPr>
-                <w:noProof/>
-              </w:rPr>
-            </w:pPr>
-            <w:fldSimple w:instr=" MERGEFIELD  AddReminder  \* MERGEFORMAT ">
-              <w:r>
-                <w:rPr>
-                  <w:noProof/>
-                </w:rPr>
-                <w:t>«AddReminder»</w:t>
-              </w:r>
-            </w:fldSimple>
-          </w:p>
-          <w:p/>
-          <w:p>
-            <w:pPr>
-              <w:ind w:left="532" w:hanging="532"/>
-            </w:pPr>
-            <w:r>
-              <w:rPr>
-                <w:b/>
-                <w:i/>
-              </w:rPr>
-              <w:t>Will</w:t>
-            </w:r>
-            <w:r>
-              <w:rPr>
-                <w:b/>
-                <w:i/>
-              </w:rPr>
-              <w:t xml:space="preserve"> you </w:t>
-            </w:r>
-            <w:r>
-              <w:rPr>
-                <w:b/>
-                <w:i/>
-              </w:rPr>
-              <w:t>will be</w:t>
-            </w:r>
-            <w:r>
-              <w:rPr>
-                <w:b/>
-                <w:i/>
-              </w:rPr>
-              <w:t xml:space="preserve"> </w:t>
-            </w:r>
-            <w:r>
-              <w:rPr>
-                <w:b/>
-                <w:i/>
-              </w:rPr>
-              <w:t>attending alone or</w:t>
-            </w:r>
-            <w:r>
-              <w:rPr>
-                <w:b/>
-                <w:i/>
-              </w:rPr>
-              <w:t xml:space="preserve"> with</w:t>
-            </w:r>
-            <w:r>
-              <w:rPr>
-                <w:b/>
-                <w:i/>
-              </w:rPr>
-              <w:t xml:space="preserve"> co-workers</w:t>
-            </w:r>
-            <w:r>
-              <w:rPr>
-                <w:b/>
-                <w:i/>
-              </w:rPr>
-              <w:t xml:space="preserve"> at one location</w:t>
-            </w:r>
-            <w:r>
-              <w:t xml:space="preserve"> – </w:t>
-            </w:r>
-            <w:r>
-              <w:t>everything you need can be found at this link:</w:t>
-            </w:r>
-            <w:r>
-              <w:t xml:space="preserve"> </w:t>
             </w:r>
             <w:r>
               <w:t xml:space="preserve"> </w:t>
@@ -737,89 +545,387 @@
                 <w:t>«ClickToJoinLink»</w:t>
               </w:r>
             </w:fldSimple>
-            <w:r>
+          </w:p>
+          <w:p>
+            <w:pPr>
               <w:rPr>
                 <w:noProof/>
               </w:rPr>
-              <w:t xml:space="preserve">. </w:t>
-            </w:r>
-            <w:r>
-              <w:rPr>
-                <w:b/>
-                <w:i/>
-              </w:rPr>
-              <w:t>Are you planning to forward this</w:t>
-            </w:r>
-            <w:r>
-              <w:rPr>
-                <w:b/>
-                <w:i/>
-              </w:rPr>
-              <w:t xml:space="preserve"> email</w:t>
-            </w:r>
-            <w:r>
-              <w:rPr>
-                <w:b/>
-                <w:i/>
-              </w:rPr>
-              <w:t xml:space="preserve"> to an associate?</w:t>
+            </w:pPr>
+            <w:r>
+              <w:fldChar w:fldCharType="begin"/>
+            </w:r>
+            <w:r>
+              <w:instrText xml:space="preserve"> MERGEFIELD  AddReminder  \* MERGEFORMAT </w:instrText>
+            </w:r>
+            <w:r>
+              <w:fldChar w:fldCharType="separate"/>
+            </w:r>
+            <w:r>
+              <w:rPr>
+                <w:noProof/>
+              </w:rPr>
+              <w:t>«AddReminder»</w:t>
+            </w:r>
+            <w:r>
+              <w:rPr>
+                <w:noProof/>
+              </w:rPr>
+              <w:fldChar w:fldCharType="end"/>
+            </w:r>
+          </w:p>
+          <w:p/>
+          <w:p>
+            <w:pPr>
+              <w:ind w:left="532" w:hanging="532"/>
+              <w:rPr>
+                <w:noProof/>
+              </w:rPr>
+            </w:pPr>
+            <w:r>
+              <w:t xml:space="preserve">1. </w:t>
+            </w:r>
+            <w:r>
+              <w:t xml:space="preserve">Click the link to join: </w:t>
+            </w:r>
+            <w:r>
+              <w:fldChar w:fldCharType="begin"/>
+            </w:r>
+            <w:r>
+              <w:instrText xml:space="preserve"> MERGEFIELD  ClickToJoinLink  \* MERGEFORMAT </w:instrText>
+            </w:r>
+            <w:r>
+              <w:fldChar w:fldCharType="separate"/>
+            </w:r>
+            <w:r>
+              <w:rPr>
+                <w:noProof/>
+              </w:rPr>
+              <w:t>«ClickToJoinLink»</w:t>
+            </w:r>
+            <w:r>
+              <w:rPr>
+                <w:noProof/>
+              </w:rPr>
+              <w:fldChar w:fldCharType="end"/>
+            </w:r>
+            <w:r>
+              <w:rPr>
+                <w:noProof/>
+              </w:rPr>
+              <w:t>.</w:t>
+            </w:r>
+            <w:r>
+              <w:rPr>
+                <w:noProof/>
+              </w:rPr>
+              <w:t xml:space="preserve"> Note: This link is valid for one location.</w:t>
             </w:r>
             <w:r>
               <w:t xml:space="preserve"> </w:t>
             </w:r>
-            <w:r>
-              <w:fldChar w:fldCharType="begin"/>
-            </w:r>
-            <w:r>
-              <w:instrText xml:space="preserve"> MERGEFIELD  CCCaption  \* MERGEFORMAT </w:instrText>
-            </w:r>
-            <w:r>
-              <w:fldChar w:fldCharType="separate"/>
-            </w:r>
-            <w:r>
-              <w:rPr>
-                <w:noProof/>
-              </w:rPr>
-              <w:t>«CCCaption»</w:t>
-            </w:r>
-            <w:r>
-              <w:rPr>
-                <w:noProof/>
-              </w:rPr>
-              <w:fldChar w:fldCharType="end"/>
-            </w:r>
-            <w:r>
-              <w:fldChar w:fldCharType="begin"/>
-            </w:r>
-            <w:r>
-              <w:instrText xml:space="preserve"> MERGEFIELD  ExistingAddLocs  \* MERGEFORMAT </w:instrText>
-            </w:r>
-            <w:r>
-              <w:fldChar w:fldCharType="separate"/>
-            </w:r>
-            <w:r>
-              <w:rPr>
-                <w:noProof/>
-              </w:rPr>
-              <w:t>«ExistingAddLocs»</w:t>
-            </w:r>
-            <w:r>
-              <w:rPr>
-                <w:noProof/>
-              </w:rPr>
-              <w:fldChar w:fldCharType="end"/>
-            </w:r>
-            <w:r>
-              <w:t xml:space="preserve">  </w:t>
-            </w:r>
-            <w:fldSimple w:instr=" MERGEFIELD  AddLocsCost  \* MERGEFORMAT ">
+            <w:fldSimple w:instr=" MERGEFIELD  CCCaption  \* MERGEFORMAT ">
               <w:r>
                 <w:rPr>
                   <w:noProof/>
                 </w:rPr>
-                <w:t>«AddLocsCost»</w:t>
+                <w:t>«CCCaption»</w:t>
               </w:r>
             </w:fldSimple>
+            <w:fldSimple w:instr=" MERGEFIELD  ExistingAddLocs  \* MERGEFORMAT ">
+              <w:r>
+                <w:rPr>
+                  <w:noProof/>
+                </w:rPr>
+                <w:t>«ExistingAddLocs»</w:t>
+              </w:r>
+            </w:fldSimple>
+            <w:r>
+              <w:t xml:space="preserve"> </w:t>
+            </w:r>
+            <w:r>
+              <w:fldChar w:fldCharType="begin"/>
+            </w:r>
+            <w:r>
+              <w:instrText xml:space="preserve"> MERGEFIELD  </w:instrText>
+            </w:r>
+            <w:r>
+              <w:instrText xml:space="preserve">AddLocsCost  \* MERGEFORMAT </w:instrText>
+            </w:r>
+            <w:r>
+              <w:fldChar w:fldCharType="separate"/>
+            </w:r>
+            <w:r>
+              <w:rPr>
+                <w:noProof/>
+              </w:rPr>
+              <w:t>«AddLocsCost»</w:t>
+            </w:r>
+            <w:r>
+              <w:rPr>
+                <w:noProof/>
+              </w:rPr>
+              <w:fldChar w:fldCharType="end"/>
+            </w:r>
+          </w:p>
+          <w:p>
+            <w:pPr>
+              <w:ind w:left="532" w:hanging="532"/>
+            </w:pPr>
+          </w:p>
+          <w:p>
+            <w:pPr>
+              <w:ind w:left="532" w:hanging="532"/>
+              <w:rPr>
+                <w:b/>
+              </w:rPr>
+            </w:pPr>
+            <w:bookmarkStart w:id="1" w:name="_GoBack"/>
+            <w:r>
+              <w:rPr>
+                <w:b/>
+              </w:rPr>
+              <w:t>Presenter Materials:</w:t>
+            </w:r>
+          </w:p>
+          <w:bookmarkEnd w:id="1"/>
+          <w:p>
+            <w:pPr>
+              <w:ind w:left="532" w:hanging="532"/>
+            </w:pPr>
+            <w:r>
+              <w:fldChar w:fldCharType="begin"/>
+            </w:r>
+            <w:r>
+              <w:instrText xml:space="preserve"> MERGEFIELD  PresenterMaterials  \* MERGEFORMAT </w:instrText>
+            </w:r>
+            <w:r>
+              <w:fldChar w:fldCharType="separate"/>
+            </w:r>
+            <w:r>
+              <w:rPr>
+                <w:noProof/>
+              </w:rPr>
+              <w:t>«PresenterMaterials»</w:t>
+            </w:r>
+            <w:r>
+              <w:fldChar w:fldCharType="end"/>
+            </w:r>
+          </w:p>
+          <w:p>
+            <w:pPr>
+              <w:ind w:left="532" w:hanging="532"/>
+            </w:pPr>
+          </w:p>
+          <w:p>
+            <w:pPr>
+              <w:ind w:left="532" w:hanging="532"/>
+            </w:pPr>
+            <w:r>
+              <w:t xml:space="preserve">2. </w:t>
+            </w:r>
+            <w:r>
+              <w:t>Choose one of the following audio options:</w:t>
+            </w:r>
+          </w:p>
+          <w:p>
+            <w:pPr>
+              <w:pStyle w:val="NormalWeb"/>
+              <w:shd w:val="clear" w:color="auto" w:fill="FFFFFF"/>
+              <w:spacing w:before="75" w:beforeAutospacing="0" w:after="0" w:afterAutospacing="0"/>
+              <w:ind w:left="720"/>
+              <w:rPr>
+                <w:rFonts w:asciiTheme="minorHAnsi" w:eastAsiaTheme="minorHAnsi" w:hAnsiTheme="minorHAnsi" w:cstheme="minorBidi"/>
+                <w:sz w:val="22"/>
+                <w:szCs w:val="22"/>
+              </w:rPr>
+            </w:pPr>
+            <w:r>
+              <w:rPr>
+                <w:rFonts w:asciiTheme="minorHAnsi" w:eastAsiaTheme="minorHAnsi" w:hAnsiTheme="minorHAnsi" w:cstheme="minorBidi"/>
+                <w:sz w:val="22"/>
+                <w:szCs w:val="22"/>
+              </w:rPr>
+              <w:t>TO USE YOUR COMPUTER'S AUDIO:</w:t>
+            </w:r>
+            <w:r>
+              <w:rPr>
+                <w:rFonts w:asciiTheme="minorHAnsi" w:eastAsiaTheme="minorHAnsi" w:hAnsiTheme="minorHAnsi" w:cstheme="minorBidi"/>
+                <w:sz w:val="22"/>
+                <w:szCs w:val="22"/>
+              </w:rPr>
+              <w:br/>
+              <w:t>When the webinar begins, you will be connected to audio using your computer's microphone and speakers (VoIP). A headset is recommended.</w:t>
+            </w:r>
+          </w:p>
+          <w:p>
+            <w:pPr>
+              <w:pStyle w:val="NormalWeb"/>
+              <w:shd w:val="clear" w:color="auto" w:fill="FFFFFF"/>
+              <w:spacing w:before="75" w:beforeAutospacing="0" w:after="0" w:afterAutospacing="0"/>
+              <w:ind w:left="1695"/>
+              <w:rPr>
+                <w:rFonts w:asciiTheme="minorHAnsi" w:eastAsiaTheme="minorHAnsi" w:hAnsiTheme="minorHAnsi" w:cstheme="minorBidi"/>
+                <w:sz w:val="22"/>
+                <w:szCs w:val="22"/>
+              </w:rPr>
+            </w:pPr>
+            <w:r>
+              <w:rPr>
+                <w:rFonts w:asciiTheme="minorHAnsi" w:eastAsiaTheme="minorHAnsi" w:hAnsiTheme="minorHAnsi" w:cstheme="minorBidi"/>
+                <w:sz w:val="22"/>
+                <w:szCs w:val="22"/>
+              </w:rPr>
+              <w:t>--OR--</w:t>
+            </w:r>
+          </w:p>
+          <w:p>
+            <w:pPr>
+              <w:pStyle w:val="NormalWeb"/>
+              <w:shd w:val="clear" w:color="auto" w:fill="FFFFFF"/>
+              <w:spacing w:before="75" w:beforeAutospacing="0" w:after="0" w:afterAutospacing="0"/>
+              <w:ind w:left="720"/>
+            </w:pPr>
+            <w:r>
+              <w:rPr>
+                <w:rFonts w:asciiTheme="minorHAnsi" w:eastAsiaTheme="minorHAnsi" w:hAnsiTheme="minorHAnsi" w:cstheme="minorBidi"/>
+                <w:sz w:val="22"/>
+                <w:szCs w:val="22"/>
+              </w:rPr>
+              <w:t>TO USE YOUR TELEPHONE:</w:t>
+            </w:r>
+            <w:r>
+              <w:rPr>
+                <w:rFonts w:asciiTheme="minorHAnsi" w:eastAsiaTheme="minorHAnsi" w:hAnsiTheme="minorHAnsi" w:cstheme="minorBidi"/>
+                <w:sz w:val="22"/>
+                <w:szCs w:val="22"/>
+              </w:rPr>
+              <w:br/>
+              <w:t>I</w:t>
+            </w:r>
+            <w:r>
+              <w:rPr>
+                <w:rFonts w:asciiTheme="minorHAnsi" w:eastAsiaTheme="minorHAnsi" w:hAnsiTheme="minorHAnsi" w:cstheme="minorBidi"/>
+                <w:sz w:val="22"/>
+                <w:szCs w:val="22"/>
+              </w:rPr>
+              <w:t>f you prefer to use your phone, you must select "Use Telephone" after joining the webinar and call in using the numbers below.</w:t>
+            </w:r>
+            <w:r>
+              <w:rPr>
+                <w:rFonts w:asciiTheme="minorHAnsi" w:eastAsiaTheme="minorHAnsi" w:hAnsiTheme="minorHAnsi" w:cstheme="minorBidi"/>
+                <w:sz w:val="22"/>
+                <w:szCs w:val="22"/>
+              </w:rPr>
+              <w:br/>
+              <w:t>United States (Toll-free):</w:t>
+            </w:r>
+            <w:r>
+              <w:rPr>
+                <w:rFonts w:asciiTheme="minorHAnsi" w:eastAsiaTheme="minorHAnsi" w:hAnsiTheme="minorHAnsi" w:cstheme="minorBidi"/>
+                <w:sz w:val="22"/>
+                <w:szCs w:val="22"/>
+              </w:rPr>
+              <w:t xml:space="preserve"> </w:t>
+            </w:r>
+            <w:r>
+              <w:rPr>
+                <w:rFonts w:asciiTheme="minorHAnsi" w:hAnsiTheme="minorHAnsi"/>
+                <w:sz w:val="22"/>
+                <w:szCs w:val="22"/>
+              </w:rPr>
+              <w:fldChar w:fldCharType="begin"/>
+            </w:r>
+            <w:r>
+              <w:rPr>
+                <w:rFonts w:asciiTheme="minorHAnsi" w:hAnsiTheme="minorHAnsi"/>
+                <w:sz w:val="22"/>
+                <w:szCs w:val="22"/>
+              </w:rPr>
+              <w:instrText xml:space="preserve"> MERGEFIELD  Phone  \* MERGEFORMAT </w:instrText>
+            </w:r>
+            <w:r>
+              <w:rPr>
+                <w:rFonts w:asciiTheme="minorHAnsi" w:hAnsiTheme="minorHAnsi"/>
+                <w:sz w:val="22"/>
+                <w:szCs w:val="22"/>
+              </w:rPr>
+              <w:fldChar w:fldCharType="separate"/>
+            </w:r>
+            <w:r>
+              <w:rPr>
+                <w:rFonts w:asciiTheme="minorHAnsi" w:hAnsiTheme="minorHAnsi"/>
+                <w:noProof/>
+                <w:sz w:val="22"/>
+                <w:szCs w:val="22"/>
+              </w:rPr>
+              <w:t>«Phone»</w:t>
+            </w:r>
+            <w:r>
+              <w:rPr>
+                <w:rFonts w:asciiTheme="minorHAnsi" w:hAnsiTheme="minorHAnsi"/>
+                <w:sz w:val="22"/>
+                <w:szCs w:val="22"/>
+              </w:rPr>
+              <w:fldChar w:fldCharType="end"/>
+            </w:r>
+            <w:r>
+              <w:rPr>
+                <w:rFonts w:asciiTheme="minorHAnsi" w:eastAsiaTheme="minorHAnsi" w:hAnsiTheme="minorHAnsi" w:cstheme="minorBidi"/>
+                <w:sz w:val="22"/>
+                <w:szCs w:val="22"/>
+              </w:rPr>
+              <w:br/>
+            </w:r>
+            <w:r>
+              <w:rPr>
+                <w:rFonts w:asciiTheme="minorHAnsi" w:eastAsiaTheme="minorHAnsi" w:hAnsiTheme="minorHAnsi" w:cstheme="minorBidi"/>
+                <w:sz w:val="22"/>
+                <w:szCs w:val="22"/>
+              </w:rPr>
+              <w:t xml:space="preserve">Access Code: </w:t>
+            </w:r>
+            <w:r>
+              <w:rPr>
+                <w:rFonts w:asciiTheme="minorHAnsi" w:hAnsiTheme="minorHAnsi"/>
+                <w:sz w:val="22"/>
+                <w:szCs w:val="22"/>
+              </w:rPr>
+              <w:fldChar w:fldCharType="begin"/>
+            </w:r>
+            <w:r>
+              <w:rPr>
+                <w:rFonts w:asciiTheme="minorHAnsi" w:hAnsiTheme="minorHAnsi"/>
+                <w:sz w:val="22"/>
+                <w:szCs w:val="22"/>
+              </w:rPr>
+              <w:instrText xml:space="preserve"> MERGEFIELD  AccessCode  \* MERGEFORMAT </w:instrText>
+            </w:r>
+            <w:r>
+              <w:rPr>
+                <w:rFonts w:asciiTheme="minorHAnsi" w:hAnsiTheme="minorHAnsi"/>
+                <w:sz w:val="22"/>
+                <w:szCs w:val="22"/>
+              </w:rPr>
+              <w:fldChar w:fldCharType="separate"/>
+            </w:r>
+            <w:r>
+              <w:rPr>
+                <w:rFonts w:asciiTheme="minorHAnsi" w:hAnsiTheme="minorHAnsi"/>
+                <w:noProof/>
+                <w:sz w:val="22"/>
+                <w:szCs w:val="22"/>
+              </w:rPr>
+              <w:t>«AccessCode»</w:t>
+            </w:r>
+            <w:r>
+              <w:rPr>
+                <w:rFonts w:asciiTheme="minorHAnsi" w:hAnsiTheme="minorHAnsi"/>
+                <w:sz w:val="22"/>
+                <w:szCs w:val="22"/>
+              </w:rPr>
+              <w:fldChar w:fldCharType="end"/>
+            </w:r>
           </w:p>
           <w:p>
             <w:pPr>
@@ -869,8 +975,8 @@
               </w:rPr>
               <w:t>«</w:t>
             </w:r>
-            <w:bookmarkStart w:id="1" w:name="OLE_LINK4"/>
-            <w:bookmarkStart w:id="2" w:name="OLE_LINK5"/>
+            <w:bookmarkStart w:id="2" w:name="OLE_LINK4"/>
+            <w:bookmarkStart w:id="3" w:name="OLE_LINK5"/>
             <w:r>
               <w:rPr>
                 <w:b/>
@@ -878,8 +984,8 @@
               </w:rPr>
               <w:t>ShowStartTime</w:t>
             </w:r>
-            <w:bookmarkEnd w:id="1"/>
             <w:bookmarkEnd w:id="2"/>
+            <w:bookmarkEnd w:id="3"/>
             <w:r>
               <w:rPr>
                 <w:b/>
@@ -979,123 +1085,39 @@
             <w:r>
               <w:t xml:space="preserve"> </w:t>
             </w:r>
-            <w:r>
-              <w:fldChar w:fldCharType="begin"/>
-            </w:r>
-            <w:r>
-              <w:instrText xml:space="preserve"> MERGEFIELD  ChangeTimeZoneLink  \* MERGEFORMAT </w:instrText>
-            </w:r>
-            <w:r>
-              <w:fldChar w:fldCharType="separate"/>
-            </w:r>
-            <w:r>
-              <w:rPr>
-                <w:noProof/>
-              </w:rPr>
-              <w:t>«ChangeTimeZoneLink»</w:t>
-            </w:r>
-            <w:r>
-              <w:rPr>
-                <w:noProof/>
-              </w:rPr>
-              <w:fldChar w:fldCharType="end"/>
-            </w:r>
-          </w:p>
-          <w:p/>
-          <w:p>
-            <w:bookmarkStart w:id="3" w:name="_GoBack"/>
-            <w:r>
-              <w:rPr>
-                <w:b/>
-                <w:i/>
-              </w:rPr>
-              <w:t>Detailed connection info</w:t>
-            </w:r>
-            <w:r>
-              <w:t xml:space="preserve"> </w:t>
-            </w:r>
-            <w:bookmarkEnd w:id="3"/>
-            <w:r>
-              <w:t xml:space="preserve">(including a chance to test your computer’s readiness) can be viewed at </w:t>
-            </w:r>
-            <w:r>
-              <w:fldChar w:fldCharType="begin"/>
-            </w:r>
-            <w:r>
-              <w:instrText xml:space="preserve"> MERGEFIELD  DetailedConnectionInfoLink  \* MERGEFORMAT </w:instrText>
-            </w:r>
-            <w:r>
-              <w:fldChar w:fldCharType="separate"/>
-            </w:r>
-            <w:r>
-              <w:rPr>
-                <w:noProof/>
-              </w:rPr>
-              <w:t>«DetailedConnectionInfoLink»</w:t>
-            </w:r>
-            <w:r>
-              <w:fldChar w:fldCharType="end"/>
-            </w:r>
-            <w:r>
-              <w:t xml:space="preserve">. </w:t>
-            </w:r>
-          </w:p>
-          <w:p/>
-          <w:p>
-            <w:r>
-              <w:fldChar w:fldCharType="begin"/>
-            </w:r>
-            <w:r>
-              <w:instrText xml:space="preserve"> MERGEFIELD  PaymentCaption  \* MERGEFORMAT </w:instrText>
-            </w:r>
-            <w:r>
-              <w:fldChar w:fldCharType="separate"/>
-            </w:r>
-            <w:r>
-              <w:rPr>
-                <w:noProof/>
-              </w:rPr>
-              <w:t>«PaymentCaption»</w:t>
-            </w:r>
-            <w:r>
-              <w:rPr>
-                <w:noProof/>
-              </w:rPr>
-              <w:fldChar w:fldCharType="end"/>
-            </w:r>
-          </w:p>
-          <w:p>
-            <w:pPr>
-              <w:spacing w:before="200"/>
-            </w:pPr>
-            <w:r>
-              <w:t xml:space="preserve">The customer service staff at </w:t>
-            </w:r>
-            <w:fldSimple w:instr=" MERGEFIELD  TenantName  \* MERGEFORMAT ">
+            <w:fldSimple w:instr=" MERGEFIELD  ChangeTimeZoneLink  \* MERGEFORMAT ">
               <w:r>
                 <w:rPr>
                   <w:noProof/>
                 </w:rPr>
-                <w:t>«TenantName»</w:t>
+                <w:t>«ChangeTimeZoneLink»</w:t>
               </w:r>
             </w:fldSimple>
-            <w:r>
-              <w:t xml:space="preserve"> is confident you’ll find both our Webinars and our site’s ability to deliver that content meets the highest standards in the industry. And in the off chance it doesn’t, please email us (</w:t>
-            </w:r>
-            <w:fldSimple w:instr=" MERGEFIELD  SupportEmail  \* MERGEFORMAT ">
+          </w:p>
+          <w:p/>
+          <w:p>
+            <w:r>
+              <w:rPr>
+                <w:b/>
+                <w:i/>
+              </w:rPr>
+              <w:t>Detailed connection info</w:t>
+            </w:r>
+            <w:r>
+              <w:t xml:space="preserve"> (including a chance to test your computer’s readiness) can be viewed at </w:t>
+            </w:r>
+            <w:fldSimple w:instr=" MERGEFIELD  DetailedConnectionInfoLink  \* MERGEFORMAT ">
               <w:r>
                 <w:rPr>
                   <w:noProof/>
                 </w:rPr>
-                <w:t>«SupportEmail»</w:t>
+                <w:t>«DetailedConnectionInfoLink»</w:t>
               </w:r>
             </w:fldSimple>
             <w:r>
-              <w:t>) or visit our online chat where you’ll find a professional representative waiting to make sure your satisfaction is restored.</w:t>
+              <w:t xml:space="preserve">. </w:t>
             </w:r>
           </w:p>
-          <w:p/>
-          <w:p/>
           <w:p/>
         </w:tc>
         <w:tc>
@@ -1123,6 +1145,161 @@
             <w:gridSpan w:val="2"/>
             <w:shd w:val="clear" w:color="auto" w:fill="000000" w:themeFill="text1"/>
           </w:tcPr>
+          <w:p/>
+          <w:tbl>
+            <w:tblPr>
+              <w:tblStyle w:val="TableGrid"/>
+              <w:tblW w:w="0" w:type="auto"/>
+              <w:tblLook w:val="04A0" w:firstRow="1" w:lastRow="0" w:firstColumn="1" w:lastColumn="0" w:noHBand="0" w:noVBand="1"/>
+            </w:tblPr>
+            <w:tblGrid>
+              <w:gridCol w:w="4304"/>
+              <w:gridCol w:w="4305"/>
+            </w:tblGrid>
+            <w:tr>
+              <w:tc>
+                <w:tcPr>
+                  <w:tcW w:w="4304" w:type="dxa"/>
+                </w:tcPr>
+                <w:p>
+                  <w:pPr>
+                    <w:jc w:val="center"/>
+                    <w:rPr>
+                      <w:sz w:val="18"/>
+                      <w:szCs w:val="18"/>
+                    </w:rPr>
+                  </w:pPr>
+                  <w:r>
+                    <w:rPr>
+                      <w:sz w:val="18"/>
+                      <w:szCs w:val="18"/>
+                    </w:rPr>
+                    <w:fldChar w:fldCharType="begin"/>
+                  </w:r>
+                  <w:r>
+                    <w:rPr>
+                      <w:sz w:val="18"/>
+                      <w:szCs w:val="18"/>
+                    </w:rPr>
+                    <w:instrText xml:space="preserve"> MERGEFIELD  AffFooter  \* MERGEFORMAT </w:instrText>
+                  </w:r>
+                  <w:r>
+                    <w:rPr>
+                      <w:sz w:val="18"/>
+                      <w:szCs w:val="18"/>
+                    </w:rPr>
+                    <w:fldChar w:fldCharType="separate"/>
+                  </w:r>
+                  <w:r>
+                    <w:rPr>
+                      <w:noProof/>
+                      <w:sz w:val="18"/>
+                      <w:szCs w:val="18"/>
+                    </w:rPr>
+                    <w:t>«AffFooter»</w:t>
+                  </w:r>
+                  <w:r>
+                    <w:rPr>
+                      <w:sz w:val="18"/>
+                      <w:szCs w:val="18"/>
+                    </w:rPr>
+                    <w:fldChar w:fldCharType="end"/>
+                  </w:r>
+                </w:p>
+              </w:tc>
+              <w:tc>
+                <w:tcPr>
+                  <w:tcW w:w="4305" w:type="dxa"/>
+                </w:tcPr>
+                <w:p>
+                  <w:pPr>
+                    <w:jc w:val="center"/>
+                    <w:rPr>
+                      <w:sz w:val="18"/>
+                      <w:szCs w:val="18"/>
+                    </w:rPr>
+                  </w:pPr>
+                  <w:r>
+                    <w:rPr>
+                      <w:sz w:val="18"/>
+                      <w:szCs w:val="18"/>
+                    </w:rPr>
+                    <w:t xml:space="preserve">800-831-0678 </w:t>
+                  </w:r>
+                  <w:proofErr w:type="spellStart"/>
+                  <w:r>
+                    <w:rPr>
+                      <w:sz w:val="18"/>
+                      <w:szCs w:val="18"/>
+                    </w:rPr>
+                    <w:t>ext</w:t>
+                  </w:r>
+                  <w:proofErr w:type="spellEnd"/>
+                  <w:r>
+                    <w:rPr>
+                      <w:sz w:val="18"/>
+                      <w:szCs w:val="18"/>
+                    </w:rPr>
+                    <w:t xml:space="preserve"> 6</w:t>
+                  </w:r>
+                </w:p>
+                <w:p>
+                  <w:pPr>
+                    <w:jc w:val="center"/>
+                    <w:rPr>
+                      <w:sz w:val="18"/>
+                      <w:szCs w:val="18"/>
+                    </w:rPr>
+                  </w:pPr>
+                  <w:r>
+                    <w:rPr>
+                      <w:sz w:val="18"/>
+                      <w:szCs w:val="18"/>
+                    </w:rPr>
+                    <w:fldChar w:fldCharType="begin"/>
+                  </w:r>
+                  <w:r>
+                    <w:rPr>
+                      <w:sz w:val="18"/>
+                      <w:szCs w:val="18"/>
+                    </w:rPr>
+                    <w:instrText xml:space="preserve"> MERGEFIELD  SupportEmail  \* MERGEFORMAT </w:instrText>
+                  </w:r>
+                  <w:r>
+                    <w:rPr>
+                      <w:sz w:val="18"/>
+                      <w:szCs w:val="18"/>
+                    </w:rPr>
+                    <w:fldChar w:fldCharType="separate"/>
+                  </w:r>
+                  <w:r>
+                    <w:rPr>
+                      <w:noProof/>
+                      <w:sz w:val="18"/>
+                      <w:szCs w:val="18"/>
+                    </w:rPr>
+                    <w:t>«SupportEmail»</w:t>
+                  </w:r>
+                  <w:r>
+                    <w:rPr>
+                      <w:sz w:val="18"/>
+                      <w:szCs w:val="18"/>
+                    </w:rPr>
+                    <w:fldChar w:fldCharType="end"/>
+                  </w:r>
+                </w:p>
+                <w:p>
+                  <w:pPr>
+                    <w:jc w:val="center"/>
+                    <w:rPr>
+                      <w:sz w:val="18"/>
+                      <w:szCs w:val="18"/>
+                    </w:rPr>
+                  </w:pPr>
+                </w:p>
+              </w:tc>
+            </w:tr>
+          </w:tbl>
           <w:p/>
         </w:tc>
         <w:tc>
@@ -1154,6 +1331,400 @@
     </w:sectPr>
   </w:body>
 </w:document>
+</file>
+
+<file path=word/numbering.xml><?xml version="1.0" encoding="utf-8"?>
+<w:numbering xmlns:wpc="http://schemas.microsoft.com/office/word/2010/wordprocessingCanvas" xmlns:cx="http://schemas.microsoft.com/office/drawing/2014/chartex" xmlns:cx1="http://schemas.microsoft.com/office/drawing/2015/9/8/chartex" xmlns:cx2="http://schemas.microsoft.com/office/drawing/2015/10/21/chartex" xmlns:cx3="http://schemas.microsoft.com/office/drawing/2016/5/9/chartex" xmlns:cx4="http://schemas.microsoft.com/office/drawing/2016/5/10/chartex" xmlns:cx5="http://schemas.microsoft.com/office/drawing/2016/5/11/chartex" xmlns:mc="http://schemas.openxmlformats.org/markup-compatibility/2006" xmlns:o="urn:schemas-microsoft-com:office:office" xmlns:r="http://schemas.openxmlformats.org/officeDocument/2006/relationships" xmlns:m="http://schemas.openxmlformats.org/officeDocument/2006/math" xmlns:v="urn:schemas-microsoft-com:vml" xmlns:wp14="http://schemas.microsoft.com/office/word/2010/wordprocessingDrawing" xmlns:wp="http://schemas.openxmlformats.org/drawingml/2006/wordprocessingDrawing" xmlns:w10="urn:schemas-microsoft-com:office:word" xmlns:w="http://schemas.openxmlformats.org/wordprocessingml/2006/main" xmlns:w14="http://schemas.microsoft.com/office/word/2010/wordml" xmlns:w15="http://schemas.microsoft.com/office/word/2012/wordml" xmlns:w16se="http://schemas.microsoft.com/office/word/2015/wordml/symex" xmlns:wpg="http://schemas.microsoft.com/office/word/2010/wordprocessingGroup" xmlns:wpi="http://schemas.microsoft.com/office/word/2010/wordprocessingInk" xmlns:wne="http://schemas.microsoft.com/office/word/2006/wordml" xmlns:wps="http://schemas.microsoft.com/office/word/2010/wordprocessingShape" mc:Ignorable="w14 w15 w16se wp14">
+  <w:abstractNum w:abstractNumId="0" w15:restartNumberingAfterBreak="0">
+    <w:nsid w:val="0DED66E9"/>
+    <w:multiLevelType w:val="hybridMultilevel"/>
+    <w:tmpl w:val="9FA4C696"/>
+    <w:lvl w:ilvl="0" w:tplc="0409000F">
+      <w:start w:val="1"/>
+      <w:numFmt w:val="decimal"/>
+      <w:lvlText w:val="%1."/>
+      <w:lvlJc w:val="left"/>
+      <w:pPr>
+        <w:ind w:left="360" w:hanging="360"/>
+      </w:pPr>
+    </w:lvl>
+    <w:lvl w:ilvl="1" w:tplc="04090019" w:tentative="1">
+      <w:start w:val="1"/>
+      <w:numFmt w:val="lowerLetter"/>
+      <w:lvlText w:val="%2."/>
+      <w:lvlJc w:val="left"/>
+      <w:pPr>
+        <w:ind w:left="1080" w:hanging="360"/>
+      </w:pPr>
+    </w:lvl>
+    <w:lvl w:ilvl="2" w:tplc="0409001B" w:tentative="1">
+      <w:start w:val="1"/>
+      <w:numFmt w:val="lowerRoman"/>
+      <w:lvlText w:val="%3."/>
+      <w:lvlJc w:val="right"/>
+      <w:pPr>
+        <w:ind w:left="1800" w:hanging="180"/>
+      </w:pPr>
+    </w:lvl>
+    <w:lvl w:ilvl="3" w:tplc="0409000F" w:tentative="1">
+      <w:start w:val="1"/>
+      <w:numFmt w:val="decimal"/>
+      <w:lvlText w:val="%4."/>
+      <w:lvlJc w:val="left"/>
+      <w:pPr>
+        <w:ind w:left="2520" w:hanging="360"/>
+      </w:pPr>
+    </w:lvl>
+    <w:lvl w:ilvl="4" w:tplc="04090019" w:tentative="1">
+      <w:start w:val="1"/>
+      <w:numFmt w:val="lowerLetter"/>
+      <w:lvlText w:val="%5."/>
+      <w:lvlJc w:val="left"/>
+      <w:pPr>
+        <w:ind w:left="3240" w:hanging="360"/>
+      </w:pPr>
+    </w:lvl>
+    <w:lvl w:ilvl="5" w:tplc="0409001B" w:tentative="1">
+      <w:start w:val="1"/>
+      <w:numFmt w:val="lowerRoman"/>
+      <w:lvlText w:val="%6."/>
+      <w:lvlJc w:val="right"/>
+      <w:pPr>
+        <w:ind w:left="3960" w:hanging="180"/>
+      </w:pPr>
+    </w:lvl>
+    <w:lvl w:ilvl="6" w:tplc="0409000F" w:tentative="1">
+      <w:start w:val="1"/>
+      <w:numFmt w:val="decimal"/>
+      <w:lvlText w:val="%7."/>
+      <w:lvlJc w:val="left"/>
+      <w:pPr>
+        <w:ind w:left="4680" w:hanging="360"/>
+      </w:pPr>
+    </w:lvl>
+    <w:lvl w:ilvl="7" w:tplc="04090019" w:tentative="1">
+      <w:start w:val="1"/>
+      <w:numFmt w:val="lowerLetter"/>
+      <w:lvlText w:val="%8."/>
+      <w:lvlJc w:val="left"/>
+      <w:pPr>
+        <w:ind w:left="5400" w:hanging="360"/>
+      </w:pPr>
+    </w:lvl>
+    <w:lvl w:ilvl="8" w:tplc="0409001B" w:tentative="1">
+      <w:start w:val="1"/>
+      <w:numFmt w:val="lowerRoman"/>
+      <w:lvlText w:val="%9."/>
+      <w:lvlJc w:val="right"/>
+      <w:pPr>
+        <w:ind w:left="6120" w:hanging="180"/>
+      </w:pPr>
+    </w:lvl>
+  </w:abstractNum>
+  <w:abstractNum w:abstractNumId="1" w15:restartNumberingAfterBreak="0">
+    <w:nsid w:val="4A432A11"/>
+    <w:multiLevelType w:val="hybridMultilevel"/>
+    <w:tmpl w:val="8B3E66CC"/>
+    <w:lvl w:ilvl="0" w:tplc="2C2E2EEC">
+      <w:start w:val="2"/>
+      <w:numFmt w:val="decimal"/>
+      <w:lvlText w:val="%1."/>
+      <w:lvlJc w:val="left"/>
+      <w:pPr>
+        <w:ind w:left="1080" w:hanging="360"/>
+      </w:pPr>
+      <w:rPr>
+        <w:rFonts w:hint="default"/>
+      </w:rPr>
+    </w:lvl>
+    <w:lvl w:ilvl="1" w:tplc="04090019" w:tentative="1">
+      <w:start w:val="1"/>
+      <w:numFmt w:val="lowerLetter"/>
+      <w:lvlText w:val="%2."/>
+      <w:lvlJc w:val="left"/>
+      <w:pPr>
+        <w:ind w:left="1800" w:hanging="360"/>
+      </w:pPr>
+    </w:lvl>
+    <w:lvl w:ilvl="2" w:tplc="0409001B" w:tentative="1">
+      <w:start w:val="1"/>
+      <w:numFmt w:val="lowerRoman"/>
+      <w:lvlText w:val="%3."/>
+      <w:lvlJc w:val="right"/>
+      <w:pPr>
+        <w:ind w:left="2520" w:hanging="180"/>
+      </w:pPr>
+    </w:lvl>
+    <w:lvl w:ilvl="3" w:tplc="0409000F" w:tentative="1">
+      <w:start w:val="1"/>
+      <w:numFmt w:val="decimal"/>
+      <w:lvlText w:val="%4."/>
+      <w:lvlJc w:val="left"/>
+      <w:pPr>
+        <w:ind w:left="3240" w:hanging="360"/>
+      </w:pPr>
+    </w:lvl>
+    <w:lvl w:ilvl="4" w:tplc="04090019" w:tentative="1">
+      <w:start w:val="1"/>
+      <w:numFmt w:val="lowerLetter"/>
+      <w:lvlText w:val="%5."/>
+      <w:lvlJc w:val="left"/>
+      <w:pPr>
+        <w:ind w:left="3960" w:hanging="360"/>
+      </w:pPr>
+    </w:lvl>
+    <w:lvl w:ilvl="5" w:tplc="0409001B" w:tentative="1">
+      <w:start w:val="1"/>
+      <w:numFmt w:val="lowerRoman"/>
+      <w:lvlText w:val="%6."/>
+      <w:lvlJc w:val="right"/>
+      <w:pPr>
+        <w:ind w:left="4680" w:hanging="180"/>
+      </w:pPr>
+    </w:lvl>
+    <w:lvl w:ilvl="6" w:tplc="0409000F" w:tentative="1">
+      <w:start w:val="1"/>
+      <w:numFmt w:val="decimal"/>
+      <w:lvlText w:val="%7."/>
+      <w:lvlJc w:val="left"/>
+      <w:pPr>
+        <w:ind w:left="5400" w:hanging="360"/>
+      </w:pPr>
+    </w:lvl>
+    <w:lvl w:ilvl="7" w:tplc="04090019" w:tentative="1">
+      <w:start w:val="1"/>
+      <w:numFmt w:val="lowerLetter"/>
+      <w:lvlText w:val="%8."/>
+      <w:lvlJc w:val="left"/>
+      <w:pPr>
+        <w:ind w:left="6120" w:hanging="360"/>
+      </w:pPr>
+    </w:lvl>
+    <w:lvl w:ilvl="8" w:tplc="0409001B" w:tentative="1">
+      <w:start w:val="1"/>
+      <w:numFmt w:val="lowerRoman"/>
+      <w:lvlText w:val="%9."/>
+      <w:lvlJc w:val="right"/>
+      <w:pPr>
+        <w:ind w:left="6840" w:hanging="180"/>
+      </w:pPr>
+    </w:lvl>
+  </w:abstractNum>
+  <w:abstractNum w:abstractNumId="2" w15:restartNumberingAfterBreak="0">
+    <w:nsid w:val="5ABC28D5"/>
+    <w:multiLevelType w:val="hybridMultilevel"/>
+    <w:tmpl w:val="F8AA3DEA"/>
+    <w:lvl w:ilvl="0" w:tplc="0409000F">
+      <w:start w:val="2"/>
+      <w:numFmt w:val="decimal"/>
+      <w:lvlText w:val="%1."/>
+      <w:lvlJc w:val="left"/>
+      <w:pPr>
+        <w:ind w:left="720" w:hanging="360"/>
+      </w:pPr>
+      <w:rPr>
+        <w:rFonts w:hint="default"/>
+      </w:rPr>
+    </w:lvl>
+    <w:lvl w:ilvl="1" w:tplc="04090019" w:tentative="1">
+      <w:start w:val="1"/>
+      <w:numFmt w:val="lowerLetter"/>
+      <w:lvlText w:val="%2."/>
+      <w:lvlJc w:val="left"/>
+      <w:pPr>
+        <w:ind w:left="1440" w:hanging="360"/>
+      </w:pPr>
+    </w:lvl>
+    <w:lvl w:ilvl="2" w:tplc="0409001B" w:tentative="1">
+      <w:start w:val="1"/>
+      <w:numFmt w:val="lowerRoman"/>
+      <w:lvlText w:val="%3."/>
+      <w:lvlJc w:val="right"/>
+      <w:pPr>
+        <w:ind w:left="2160" w:hanging="180"/>
+      </w:pPr>
+    </w:lvl>
+    <w:lvl w:ilvl="3" w:tplc="0409000F" w:tentative="1">
+      <w:start w:val="1"/>
+      <w:numFmt w:val="decimal"/>
+      <w:lvlText w:val="%4."/>
+      <w:lvlJc w:val="left"/>
+      <w:pPr>
+        <w:ind w:left="2880" w:hanging="360"/>
+      </w:pPr>
+    </w:lvl>
+    <w:lvl w:ilvl="4" w:tplc="04090019" w:tentative="1">
+      <w:start w:val="1"/>
+      <w:numFmt w:val="lowerLetter"/>
+      <w:lvlText w:val="%5."/>
+      <w:lvlJc w:val="left"/>
+      <w:pPr>
+        <w:ind w:left="3600" w:hanging="360"/>
+      </w:pPr>
+    </w:lvl>
+    <w:lvl w:ilvl="5" w:tplc="0409001B" w:tentative="1">
+      <w:start w:val="1"/>
+      <w:numFmt w:val="lowerRoman"/>
+      <w:lvlText w:val="%6."/>
+      <w:lvlJc w:val="right"/>
+      <w:pPr>
+        <w:ind w:left="4320" w:hanging="180"/>
+      </w:pPr>
+    </w:lvl>
+    <w:lvl w:ilvl="6" w:tplc="0409000F" w:tentative="1">
+      <w:start w:val="1"/>
+      <w:numFmt w:val="decimal"/>
+      <w:lvlText w:val="%7."/>
+      <w:lvlJc w:val="left"/>
+      <w:pPr>
+        <w:ind w:left="5040" w:hanging="360"/>
+      </w:pPr>
+    </w:lvl>
+    <w:lvl w:ilvl="7" w:tplc="04090019" w:tentative="1">
+      <w:start w:val="1"/>
+      <w:numFmt w:val="lowerLetter"/>
+      <w:lvlText w:val="%8."/>
+      <w:lvlJc w:val="left"/>
+      <w:pPr>
+        <w:ind w:left="5760" w:hanging="360"/>
+      </w:pPr>
+    </w:lvl>
+    <w:lvl w:ilvl="8" w:tplc="0409001B" w:tentative="1">
+      <w:start w:val="1"/>
+      <w:numFmt w:val="lowerRoman"/>
+      <w:lvlText w:val="%9."/>
+      <w:lvlJc w:val="right"/>
+      <w:pPr>
+        <w:ind w:left="6480" w:hanging="180"/>
+      </w:pPr>
+    </w:lvl>
+  </w:abstractNum>
+  <w:abstractNum w:abstractNumId="3" w15:restartNumberingAfterBreak="0">
+    <w:nsid w:val="63656CA7"/>
+    <w:multiLevelType w:val="hybridMultilevel"/>
+    <w:tmpl w:val="2FDED672"/>
+    <w:lvl w:ilvl="0" w:tplc="04090001">
+      <w:start w:val="1"/>
+      <w:numFmt w:val="bullet"/>
+      <w:lvlText w:val=""/>
+      <w:lvlJc w:val="left"/>
+      <w:pPr>
+        <w:ind w:left="720" w:hanging="360"/>
+      </w:pPr>
+      <w:rPr>
+        <w:rFonts w:ascii="Symbol" w:hAnsi="Symbol" w:hint="default"/>
+      </w:rPr>
+    </w:lvl>
+    <w:lvl w:ilvl="1" w:tplc="04090003" w:tentative="1">
+      <w:start w:val="1"/>
+      <w:numFmt w:val="bullet"/>
+      <w:lvlText w:val="o"/>
+      <w:lvlJc w:val="left"/>
+      <w:pPr>
+        <w:ind w:left="1440" w:hanging="360"/>
+      </w:pPr>
+      <w:rPr>
+        <w:rFonts w:ascii="Courier New" w:hAnsi="Courier New" w:cs="Courier New" w:hint="default"/>
+      </w:rPr>
+    </w:lvl>
+    <w:lvl w:ilvl="2" w:tplc="04090005" w:tentative="1">
+      <w:start w:val="1"/>
+      <w:numFmt w:val="bullet"/>
+      <w:lvlText w:val=""/>
+      <w:lvlJc w:val="left"/>
+      <w:pPr>
+        <w:ind w:left="2160" w:hanging="360"/>
+      </w:pPr>
+      <w:rPr>
+        <w:rFonts w:ascii="Wingdings" w:hAnsi="Wingdings" w:hint="default"/>
+      </w:rPr>
+    </w:lvl>
+    <w:lvl w:ilvl="3" w:tplc="04090001" w:tentative="1">
+      <w:start w:val="1"/>
+      <w:numFmt w:val="bullet"/>
+      <w:lvlText w:val=""/>
+      <w:lvlJc w:val="left"/>
+      <w:pPr>
+        <w:ind w:left="2880" w:hanging="360"/>
+      </w:pPr>
+      <w:rPr>
+        <w:rFonts w:ascii="Symbol" w:hAnsi="Symbol" w:hint="default"/>
+      </w:rPr>
+    </w:lvl>
+    <w:lvl w:ilvl="4" w:tplc="04090003" w:tentative="1">
+      <w:start w:val="1"/>
+      <w:numFmt w:val="bullet"/>
+      <w:lvlText w:val="o"/>
+      <w:lvlJc w:val="left"/>
+      <w:pPr>
+        <w:ind w:left="3600" w:hanging="360"/>
+      </w:pPr>
+      <w:rPr>
+        <w:rFonts w:ascii="Courier New" w:hAnsi="Courier New" w:cs="Courier New" w:hint="default"/>
+      </w:rPr>
+    </w:lvl>
+    <w:lvl w:ilvl="5" w:tplc="04090005" w:tentative="1">
+      <w:start w:val="1"/>
+      <w:numFmt w:val="bullet"/>
+      <w:lvlText w:val=""/>
+      <w:lvlJc w:val="left"/>
+      <w:pPr>
+        <w:ind w:left="4320" w:hanging="360"/>
+      </w:pPr>
+      <w:rPr>
+        <w:rFonts w:ascii="Wingdings" w:hAnsi="Wingdings" w:hint="default"/>
+      </w:rPr>
+    </w:lvl>
+    <w:lvl w:ilvl="6" w:tplc="04090001" w:tentative="1">
+      <w:start w:val="1"/>
+      <w:numFmt w:val="bullet"/>
+      <w:lvlText w:val=""/>
+      <w:lvlJc w:val="left"/>
+      <w:pPr>
+        <w:ind w:left="5040" w:hanging="360"/>
+      </w:pPr>
+      <w:rPr>
+        <w:rFonts w:ascii="Symbol" w:hAnsi="Symbol" w:hint="default"/>
+      </w:rPr>
+    </w:lvl>
+    <w:lvl w:ilvl="7" w:tplc="04090003" w:tentative="1">
+      <w:start w:val="1"/>
+      <w:numFmt w:val="bullet"/>
+      <w:lvlText w:val="o"/>
+      <w:lvlJc w:val="left"/>
+      <w:pPr>
+        <w:ind w:left="5760" w:hanging="360"/>
+      </w:pPr>
+      <w:rPr>
+        <w:rFonts w:ascii="Courier New" w:hAnsi="Courier New" w:cs="Courier New" w:hint="default"/>
+      </w:rPr>
+    </w:lvl>
+    <w:lvl w:ilvl="8" w:tplc="04090005" w:tentative="1">
+      <w:start w:val="1"/>
+      <w:numFmt w:val="bullet"/>
+      <w:lvlText w:val=""/>
+      <w:lvlJc w:val="left"/>
+      <w:pPr>
+        <w:ind w:left="6480" w:hanging="360"/>
+      </w:pPr>
+      <w:rPr>
+        <w:rFonts w:ascii="Wingdings" w:hAnsi="Wingdings" w:hint="default"/>
+      </w:rPr>
+    </w:lvl>
+  </w:abstractNum>
+  <w:num w:numId="1">
+    <w:abstractNumId w:val="3"/>
+  </w:num>
+  <w:num w:numId="2">
+    <w:abstractNumId w:val="0"/>
+  </w:num>
+  <w:num w:numId="3">
+    <w:abstractNumId w:val="2"/>
+  </w:num>
+  <w:num w:numId="4">
+    <w:abstractNumId w:val="1"/>
+  </w:num>
+</w:numbering>
 </file>
 
 <file path=word/styles.xml><?xml version="1.0" encoding="utf-8"?>
@@ -1585,7 +2156,6 @@
     <w:name w:val="Normal (Web)"/>
     <w:basedOn w:val="Normal"/>
     <w:uiPriority w:val="99"/>
-    <w:semiHidden/>
     <w:unhideWhenUsed/>
     <w:rsid w:val="00226AB3"/>
     <w:pPr>
@@ -1650,6 +2220,17 @@
     <w:rsid w:val="00600828"/>
     <w:pPr>
       <w:spacing w:after="0" w:line="240" w:lineRule="auto"/>
+    </w:pPr>
+  </w:style>
+  <w:style w:type="paragraph" w:styleId="ListParagraph">
+    <w:name w:val="List Paragraph"/>
+    <w:basedOn w:val="Normal"/>
+    <w:uiPriority w:val="34"/>
+    <w:qFormat/>
+    <w:rsid w:val="009F5D81"/>
+    <w:pPr>
+      <w:ind w:left="720"/>
+      <w:contextualSpacing/>
     </w:pPr>
   </w:style>
 </w:styles>
@@ -1921,7 +2502,7 @@
 </file>
 
 <file path=customXml/itemProps1.xml><?xml version="1.0" encoding="utf-8"?>
-<ds:datastoreItem xmlns:ds="http://schemas.openxmlformats.org/officeDocument/2006/customXml" ds:itemID="{0BEAD1AC-7F3E-47FE-B23B-A77079C68D62}">
+<ds:datastoreItem xmlns:ds="http://schemas.openxmlformats.org/officeDocument/2006/customXml" ds:itemID="{2BFA5E5E-563B-4EBE-89CA-38155E879974}">
   <ds:schemaRefs>
     <ds:schemaRef ds:uri="http://schemas.openxmlformats.org/officeDocument/2006/bibliography"/>
   </ds:schemaRefs>

</xml_diff>

<commit_message>
Adds additional location pricing to S/R of notifications Adds Alert you have inprocess order(s)
</commit_message>
<xml_diff>
--- a/CUWebinars.Web/App_Data/mergeTemplates/ConnectionInfo2.docx
+++ b/CUWebinars.Web/App_Data/mergeTemplates/ConnectionInfo2.docx
@@ -1,6 +1,6 @@
 
 <file path=word/document.xml><?xml version="1.0" encoding="utf-8"?>
-<w:document xmlns:wpc="http://schemas.microsoft.com/office/word/2010/wordprocessingCanvas" xmlns:cx="http://schemas.microsoft.com/office/drawing/2014/chartex" xmlns:cx1="http://schemas.microsoft.com/office/drawing/2015/9/8/chartex" xmlns:cx2="http://schemas.microsoft.com/office/drawing/2015/10/21/chartex" xmlns:cx3="http://schemas.microsoft.com/office/drawing/2016/5/9/chartex" xmlns:cx4="http://schemas.microsoft.com/office/drawing/2016/5/10/chartex" xmlns:cx5="http://schemas.microsoft.com/office/drawing/2016/5/11/chartex" xmlns:mc="http://schemas.openxmlformats.org/markup-compatibility/2006" xmlns:o="urn:schemas-microsoft-com:office:office" xmlns:r="http://schemas.openxmlformats.org/officeDocument/2006/relationships" xmlns:m="http://schemas.openxmlformats.org/officeDocument/2006/math" xmlns:v="urn:schemas-microsoft-com:vml" xmlns:wp14="http://schemas.microsoft.com/office/word/2010/wordprocessingDrawing" xmlns:wp="http://schemas.openxmlformats.org/drawingml/2006/wordprocessingDrawing" xmlns:w10="urn:schemas-microsoft-com:office:word" xmlns:w="http://schemas.openxmlformats.org/wordprocessingml/2006/main" xmlns:w14="http://schemas.microsoft.com/office/word/2010/wordml" xmlns:w15="http://schemas.microsoft.com/office/word/2012/wordml" xmlns:w16se="http://schemas.microsoft.com/office/word/2015/wordml/symex" xmlns:wpg="http://schemas.microsoft.com/office/word/2010/wordprocessingGroup" xmlns:wpi="http://schemas.microsoft.com/office/word/2010/wordprocessingInk" xmlns:wne="http://schemas.microsoft.com/office/word/2006/wordml" xmlns:wps="http://schemas.microsoft.com/office/word/2010/wordprocessingShape" mc:Ignorable="w14 w15 w16se wp14">
+<w:document xmlns:wpc="http://schemas.microsoft.com/office/word/2010/wordprocessingCanvas" xmlns:cx="http://schemas.microsoft.com/office/drawing/2014/chartex" xmlns:cx1="http://schemas.microsoft.com/office/drawing/2015/9/8/chartex" xmlns:cx2="http://schemas.microsoft.com/office/drawing/2015/10/21/chartex" xmlns:cx3="http://schemas.microsoft.com/office/drawing/2016/5/9/chartex" xmlns:cx4="http://schemas.microsoft.com/office/drawing/2016/5/10/chartex" xmlns:cx5="http://schemas.microsoft.com/office/drawing/2016/5/11/chartex" xmlns:cx6="http://schemas.microsoft.com/office/drawing/2016/5/12/chartex" xmlns:cx7="http://schemas.microsoft.com/office/drawing/2016/5/13/chartex" xmlns:cx8="http://schemas.microsoft.com/office/drawing/2016/5/14/chartex" xmlns:mc="http://schemas.openxmlformats.org/markup-compatibility/2006" xmlns:o="urn:schemas-microsoft-com:office:office" xmlns:r="http://schemas.openxmlformats.org/officeDocument/2006/relationships" xmlns:m="http://schemas.openxmlformats.org/officeDocument/2006/math" xmlns:v="urn:schemas-microsoft-com:vml" xmlns:wp14="http://schemas.microsoft.com/office/word/2010/wordprocessingDrawing" xmlns:wp="http://schemas.openxmlformats.org/drawingml/2006/wordprocessingDrawing" xmlns:w10="urn:schemas-microsoft-com:office:word" xmlns:w="http://schemas.openxmlformats.org/wordprocessingml/2006/main" xmlns:w14="http://schemas.microsoft.com/office/word/2010/wordml" xmlns:w15="http://schemas.microsoft.com/office/word/2012/wordml" xmlns:w16se="http://schemas.microsoft.com/office/word/2015/wordml/symex" xmlns:wpg="http://schemas.microsoft.com/office/word/2010/wordprocessingGroup" xmlns:wpi="http://schemas.microsoft.com/office/word/2010/wordprocessingInk" xmlns:wne="http://schemas.microsoft.com/office/word/2006/wordml" xmlns:wps="http://schemas.microsoft.com/office/word/2010/wordprocessingShape" mc:Ignorable="w14 w15 w16se wp14">
   <w:body>
     <w:tbl>
       <w:tblPr>
@@ -483,6 +483,11 @@
           </w:p>
           <w:p/>
           <w:p>
+            <w:pPr>
+              <w:rPr>
+                <w:noProof/>
+              </w:rPr>
+            </w:pPr>
             <w:r>
               <w:t xml:space="preserve">It’s time to get ready for the </w:t>
             </w:r>
@@ -524,21 +529,45 @@
               <w:t xml:space="preserve"> </w:t>
             </w:r>
             <w:r>
-              <w:t xml:space="preserve">webinar. </w:t>
-            </w:r>
-          </w:p>
-          <w:p>
-            <w:r>
-              <w:t>Date:</w:t>
+              <w:t xml:space="preserve">webinar coming up on </w:t>
+            </w:r>
+            <w:r>
+              <w:fldChar w:fldCharType="begin"/>
+            </w:r>
+            <w:r>
+              <w:instrText xml:space="preserve"> MERGEFIELD  DisplayDate  \* MERGEFORMAT </w:instrText>
+            </w:r>
+            <w:r>
+              <w:fldChar w:fldCharType="separate"/>
+            </w:r>
+            <w:r>
+              <w:rPr>
+                <w:noProof/>
+              </w:rPr>
+              <w:t>«DisplayDate»</w:t>
+            </w:r>
+            <w:r>
+              <w:rPr>
+                <w:noProof/>
+              </w:rPr>
+              <w:fldChar w:fldCharType="end"/>
+            </w:r>
+            <w:r>
+              <w:rPr>
+                <w:noProof/>
+              </w:rPr>
+              <w:t>.</w:t>
             </w:r>
             <w:r>
               <w:t xml:space="preserve"> </w:t>
             </w:r>
+            <w:bookmarkStart w:id="1" w:name="_GoBack"/>
+            <w:bookmarkEnd w:id="1"/>
             <w:r>
               <w:fldChar w:fldCharType="begin"/>
             </w:r>
             <w:r>
-              <w:instrText xml:space="preserve"> MERGEFIELD  DisplayDate  \* MERGEFORMAT </w:instrText>
+              <w:instrText xml:space="preserve"> MERGEFIELD  AddReminder  \* MERGEFORMAT </w:instrText>
             </w:r>
             <w:r>
               <w:fldChar w:fldCharType="separate"/>
@@ -547,7 +576,7 @@
               <w:rPr>
                 <w:noProof/>
               </w:rPr>
-              <w:t>«DisplayDate»</w:t>
+              <w:t>«AddReminder»</w:t>
             </w:r>
             <w:r>
               <w:rPr>
@@ -555,50 +584,6 @@
               </w:rPr>
               <w:fldChar w:fldCharType="end"/>
             </w:r>
-          </w:p>
-          <w:p>
-            <w:r>
-              <w:t>Your Link:</w:t>
-            </w:r>
-            <w:r>
-              <w:t xml:space="preserve"> </w:t>
-            </w:r>
-            <w:r>
-              <w:fldChar w:fldCharType="begin"/>
-            </w:r>
-            <w:r>
-              <w:instrText xml:space="preserve"> MERGEFIELD  ClickToJoinLink  \* MERGEFORMAT </w:instrText>
-            </w:r>
-            <w:r>
-              <w:fldChar w:fldCharType="separate"/>
-            </w:r>
-            <w:r>
-              <w:rPr>
-                <w:noProof/>
-              </w:rPr>
-              <w:t>«ClickToJoinLink»</w:t>
-            </w:r>
-            <w:r>
-              <w:rPr>
-                <w:noProof/>
-              </w:rPr>
-              <w:fldChar w:fldCharType="end"/>
-            </w:r>
-          </w:p>
-          <w:p>
-            <w:pPr>
-              <w:rPr>
-                <w:noProof/>
-              </w:rPr>
-            </w:pPr>
-            <w:fldSimple w:instr=" MERGEFIELD  AddReminder  \* MERGEFORMAT ">
-              <w:r>
-                <w:rPr>
-                  <w:noProof/>
-                </w:rPr>
-                <w:t>«AddReminder»</w:t>
-              </w:r>
-            </w:fldSimple>
           </w:p>
           <w:p/>
           <w:p>
@@ -798,10 +783,11 @@
             <w:r>
               <w:rPr>
                 <w:rFonts w:asciiTheme="minorHAnsi" w:eastAsiaTheme="minorHAnsi" w:hAnsiTheme="minorHAnsi" w:cstheme="minorBidi"/>
+                <w:b/>
                 <w:sz w:val="22"/>
                 <w:szCs w:val="22"/>
               </w:rPr>
-              <w:t>TO USE YOUR COMPUTER'S AUDIO:</w:t>
+              <w:t>TO USE YOUR COMPUTER'S AUDIO</w:t>
             </w:r>
             <w:r>
               <w:rPr>
@@ -844,10 +830,11 @@
             <w:r>
               <w:rPr>
                 <w:rFonts w:asciiTheme="minorHAnsi" w:eastAsiaTheme="minorHAnsi" w:hAnsiTheme="minorHAnsi" w:cstheme="minorBidi"/>
+                <w:b/>
                 <w:sz w:val="22"/>
                 <w:szCs w:val="22"/>
               </w:rPr>
-              <w:t>TO USE YOUR TELEPHONE:</w:t>
+              <w:t>TO USE YOUR TELEPHONE</w:t>
             </w:r>
             <w:r>
               <w:rPr>
@@ -866,8 +853,6 @@
               </w:rPr>
               <w:t>f you prefer to use your phone, you must select "Use Telephone" after joining the webinar and call in using the numbers below.</w:t>
             </w:r>
-            <w:bookmarkStart w:id="1" w:name="_GoBack"/>
-            <w:bookmarkEnd w:id="1"/>
             <w:r>
               <w:rPr>
                 <w:rFonts w:asciiTheme="minorHAnsi" w:eastAsiaTheme="minorHAnsi" w:hAnsiTheme="minorHAnsi" w:cstheme="minorBidi"/>
@@ -1468,7 +1453,7 @@
 </file>
 
 <file path=word/numbering.xml><?xml version="1.0" encoding="utf-8"?>
-<w:numbering xmlns:wpc="http://schemas.microsoft.com/office/word/2010/wordprocessingCanvas" xmlns:cx="http://schemas.microsoft.com/office/drawing/2014/chartex" xmlns:cx1="http://schemas.microsoft.com/office/drawing/2015/9/8/chartex" xmlns:cx2="http://schemas.microsoft.com/office/drawing/2015/10/21/chartex" xmlns:cx3="http://schemas.microsoft.com/office/drawing/2016/5/9/chartex" xmlns:cx4="http://schemas.microsoft.com/office/drawing/2016/5/10/chartex" xmlns:cx5="http://schemas.microsoft.com/office/drawing/2016/5/11/chartex" xmlns:mc="http://schemas.openxmlformats.org/markup-compatibility/2006" xmlns:o="urn:schemas-microsoft-com:office:office" xmlns:r="http://schemas.openxmlformats.org/officeDocument/2006/relationships" xmlns:m="http://schemas.openxmlformats.org/officeDocument/2006/math" xmlns:v="urn:schemas-microsoft-com:vml" xmlns:wp14="http://schemas.microsoft.com/office/word/2010/wordprocessingDrawing" xmlns:wp="http://schemas.openxmlformats.org/drawingml/2006/wordprocessingDrawing" xmlns:w10="urn:schemas-microsoft-com:office:word" xmlns:w="http://schemas.openxmlformats.org/wordprocessingml/2006/main" xmlns:w14="http://schemas.microsoft.com/office/word/2010/wordml" xmlns:w15="http://schemas.microsoft.com/office/word/2012/wordml" xmlns:w16se="http://schemas.microsoft.com/office/word/2015/wordml/symex" xmlns:wpg="http://schemas.microsoft.com/office/word/2010/wordprocessingGroup" xmlns:wpi="http://schemas.microsoft.com/office/word/2010/wordprocessingInk" xmlns:wne="http://schemas.microsoft.com/office/word/2006/wordml" xmlns:wps="http://schemas.microsoft.com/office/word/2010/wordprocessingShape" mc:Ignorable="w14 w15 w16se wp14">
+<w:numbering xmlns:wpc="http://schemas.microsoft.com/office/word/2010/wordprocessingCanvas" xmlns:cx="http://schemas.microsoft.com/office/drawing/2014/chartex" xmlns:cx1="http://schemas.microsoft.com/office/drawing/2015/9/8/chartex" xmlns:cx2="http://schemas.microsoft.com/office/drawing/2015/10/21/chartex" xmlns:cx3="http://schemas.microsoft.com/office/drawing/2016/5/9/chartex" xmlns:cx4="http://schemas.microsoft.com/office/drawing/2016/5/10/chartex" xmlns:cx5="http://schemas.microsoft.com/office/drawing/2016/5/11/chartex" xmlns:cx6="http://schemas.microsoft.com/office/drawing/2016/5/12/chartex" xmlns:cx7="http://schemas.microsoft.com/office/drawing/2016/5/13/chartex" xmlns:cx8="http://schemas.microsoft.com/office/drawing/2016/5/14/chartex" xmlns:mc="http://schemas.openxmlformats.org/markup-compatibility/2006" xmlns:o="urn:schemas-microsoft-com:office:office" xmlns:r="http://schemas.openxmlformats.org/officeDocument/2006/relationships" xmlns:m="http://schemas.openxmlformats.org/officeDocument/2006/math" xmlns:v="urn:schemas-microsoft-com:vml" xmlns:wp14="http://schemas.microsoft.com/office/word/2010/wordprocessingDrawing" xmlns:wp="http://schemas.openxmlformats.org/drawingml/2006/wordprocessingDrawing" xmlns:w10="urn:schemas-microsoft-com:office:word" xmlns:w="http://schemas.openxmlformats.org/wordprocessingml/2006/main" xmlns:w14="http://schemas.microsoft.com/office/word/2010/wordml" xmlns:w15="http://schemas.microsoft.com/office/word/2012/wordml" xmlns:w16se="http://schemas.microsoft.com/office/word/2015/wordml/symex" xmlns:wpg="http://schemas.microsoft.com/office/word/2010/wordprocessingGroup" xmlns:wpi="http://schemas.microsoft.com/office/word/2010/wordprocessingInk" xmlns:wne="http://schemas.microsoft.com/office/word/2006/wordml" xmlns:wps="http://schemas.microsoft.com/office/word/2010/wordprocessingShape" mc:Ignorable="w14 w15 w16se wp14">
   <w:abstractNum w:abstractNumId="0" w15:restartNumberingAfterBreak="0">
     <w:nsid w:val="0DED66E9"/>
     <w:multiLevelType w:val="hybridMultilevel"/>
@@ -2636,7 +2621,7 @@
 </file>
 
 <file path=customXml/itemProps1.xml><?xml version="1.0" encoding="utf-8"?>
-<ds:datastoreItem xmlns:ds="http://schemas.openxmlformats.org/officeDocument/2006/customXml" ds:itemID="{69139A96-D134-4FC2-86BE-A234977DBD5D}">
+<ds:datastoreItem xmlns:ds="http://schemas.openxmlformats.org/officeDocument/2006/customXml" ds:itemID="{E62426BB-1CAC-44B9-82D1-036B16E1AC76}">
   <ds:schemaRefs>
     <ds:schemaRef ds:uri="http://schemas.openxmlformats.org/officeDocument/2006/bibliography"/>
   </ds:schemaRefs>

</xml_diff>

<commit_message>
Re-worked send connection info so it loops thru list of orders inside browser instead of at server. Sends one at a time from client side. Adds webhook for Mandrill postbacks of send status.
</commit_message>
<xml_diff>
--- a/CUWebinars.Web/App_Data/mergeTemplates/ConnectionInfo2.docx
+++ b/CUWebinars.Web/App_Data/mergeTemplates/ConnectionInfo2.docx
@@ -456,27 +456,14 @@
             <w:r>
               <w:t xml:space="preserve">Dear </w:t>
             </w:r>
-            <w:r>
-              <w:fldChar w:fldCharType="begin"/>
-            </w:r>
-            <w:r>
-              <w:instrText xml:space="preserve"> MERGEFIELD  FirstName  \* MERGEFORMAT </w:instrText>
-            </w:r>
-            <w:r>
-              <w:fldChar w:fldCharType="separate"/>
-            </w:r>
-            <w:r>
-              <w:rPr>
-                <w:noProof/>
-              </w:rPr>
-              <w:t>«FirstName»</w:t>
-            </w:r>
-            <w:r>
-              <w:rPr>
-                <w:noProof/>
-              </w:rPr>
-              <w:fldChar w:fldCharType="end"/>
-            </w:r>
+            <w:fldSimple w:instr=" MERGEFIELD  FirstName  \* MERGEFORMAT ">
+              <w:r>
+                <w:rPr>
+                  <w:noProof/>
+                </w:rPr>
+                <w:t>«FirstName»</w:t>
+              </w:r>
+            </w:fldSimple>
             <w:r>
               <w:t>,</w:t>
             </w:r>
@@ -531,80 +518,12 @@
             <w:r>
               <w:t xml:space="preserve">webinar coming up on </w:t>
             </w:r>
-            <w:r>
-              <w:fldChar w:fldCharType="begin"/>
-            </w:r>
-            <w:r>
-              <w:instrText xml:space="preserve"> MERGEFIELD  DisplayDate  \* MERGEFORMAT </w:instrText>
-            </w:r>
-            <w:r>
-              <w:fldChar w:fldCharType="separate"/>
-            </w:r>
-            <w:r>
-              <w:rPr>
-                <w:noProof/>
-              </w:rPr>
-              <w:t>«DisplayDate»</w:t>
-            </w:r>
-            <w:r>
-              <w:rPr>
-                <w:noProof/>
-              </w:rPr>
-              <w:fldChar w:fldCharType="end"/>
-            </w:r>
-            <w:r>
-              <w:rPr>
-                <w:noProof/>
-              </w:rPr>
-              <w:t>.</w:t>
-            </w:r>
-            <w:r>
-              <w:t xml:space="preserve"> </w:t>
-            </w:r>
-            <w:bookmarkStart w:id="1" w:name="_GoBack"/>
-            <w:bookmarkEnd w:id="1"/>
-            <w:r>
-              <w:fldChar w:fldCharType="begin"/>
-            </w:r>
-            <w:r>
-              <w:instrText xml:space="preserve"> MERGEFIELD  AddReminder  \* MERGEFORMAT </w:instrText>
-            </w:r>
-            <w:r>
-              <w:fldChar w:fldCharType="separate"/>
-            </w:r>
-            <w:r>
-              <w:rPr>
-                <w:noProof/>
-              </w:rPr>
-              <w:t>«AddReminder»</w:t>
-            </w:r>
-            <w:r>
-              <w:rPr>
-                <w:noProof/>
-              </w:rPr>
-              <w:fldChar w:fldCharType="end"/>
-            </w:r>
-          </w:p>
-          <w:p/>
-          <w:p>
-            <w:pPr>
-              <w:ind w:left="532" w:hanging="532"/>
-              <w:rPr>
-                <w:noProof/>
-              </w:rPr>
-            </w:pPr>
-            <w:r>
-              <w:t xml:space="preserve">1. </w:t>
-            </w:r>
-            <w:r>
-              <w:t xml:space="preserve">Click the link to join: </w:t>
-            </w:r>
-            <w:fldSimple w:instr=" MERGEFIELD  ClickToJoinLink  \* MERGEFORMAT ">
+            <w:fldSimple w:instr=" MERGEFIELD  DisplayDate  \* MERGEFORMAT ">
               <w:r>
                 <w:rPr>
                   <w:noProof/>
                 </w:rPr>
-                <w:t>«ClickToJoinLink»</w:t>
+                <w:t>«DisplayDate»</w:t>
               </w:r>
             </w:fldSimple>
             <w:r>
@@ -614,109 +533,14 @@
               <w:t>.</w:t>
             </w:r>
             <w:r>
-              <w:rPr>
-                <w:noProof/>
-              </w:rPr>
               <w:t xml:space="preserve"> </w:t>
             </w:r>
-            <w:r>
-              <w:rPr>
-                <w:noProof/>
-                <w:sz w:val="20"/>
-                <w:szCs w:val="20"/>
-              </w:rPr>
-              <w:t>(V</w:t>
-            </w:r>
-            <w:r>
-              <w:rPr>
-                <w:noProof/>
-                <w:sz w:val="20"/>
-                <w:szCs w:val="20"/>
-              </w:rPr>
-              <w:t>alid for one location</w:t>
-            </w:r>
-            <w:r>
-              <w:rPr>
-                <w:noProof/>
-                <w:sz w:val="20"/>
-                <w:szCs w:val="20"/>
-              </w:rPr>
-              <w:t xml:space="preserve"> only</w:t>
-            </w:r>
-            <w:r>
-              <w:rPr>
-                <w:noProof/>
-                <w:sz w:val="20"/>
-                <w:szCs w:val="20"/>
-              </w:rPr>
-              <w:t>.</w:t>
-            </w:r>
-            <w:r>
-              <w:rPr>
-                <w:noProof/>
-                <w:sz w:val="20"/>
-                <w:szCs w:val="20"/>
-              </w:rPr>
-              <w:t>)</w:t>
-            </w:r>
-            <w:r>
-              <w:rPr>
-                <w:sz w:val="20"/>
-                <w:szCs w:val="20"/>
-              </w:rPr>
-              <w:t xml:space="preserve"> </w:t>
-            </w:r>
-            <w:r>
-              <w:fldChar w:fldCharType="begin"/>
-            </w:r>
-            <w:r>
-              <w:instrText xml:space="preserve"> MERGEFIELD  CCCaption  \* MERGEFORMAT </w:instrText>
-            </w:r>
-            <w:r>
-              <w:fldChar w:fldCharType="separate"/>
-            </w:r>
-            <w:r>
-              <w:rPr>
-                <w:noProof/>
-              </w:rPr>
-              <w:t>«CCCaption»</w:t>
-            </w:r>
-            <w:r>
-              <w:rPr>
-                <w:noProof/>
-              </w:rPr>
-              <w:fldChar w:fldCharType="end"/>
-            </w:r>
-            <w:r>
-              <w:fldChar w:fldCharType="begin"/>
-            </w:r>
-            <w:r>
-              <w:instrText xml:space="preserve"> MERGEFIELD  ExistingAddLocs  \* MERGEFORMAT </w:instrText>
-            </w:r>
-            <w:r>
-              <w:fldChar w:fldCharType="separate"/>
-            </w:r>
-            <w:r>
-              <w:rPr>
-                <w:noProof/>
-              </w:rPr>
-              <w:t>«ExistingAddLocs»</w:t>
-            </w:r>
-            <w:r>
-              <w:rPr>
-                <w:noProof/>
-              </w:rPr>
-              <w:fldChar w:fldCharType="end"/>
-            </w:r>
-            <w:r>
-              <w:t xml:space="preserve"> </w:t>
-            </w:r>
-            <w:fldSimple w:instr=" MERGEFIELD  AddLocsCost  \* MERGEFORMAT ">
+            <w:fldSimple w:instr=" MERGEFIELD  AddReminder  \* MERGEFORMAT ">
               <w:r>
                 <w:rPr>
                   <w:noProof/>
                 </w:rPr>
-                <w:t>«AddLocsCost»</w:t>
+                <w:t>«AddReminder»</w:t>
               </w:r>
             </w:fldSimple>
           </w:p>
@@ -727,7 +551,6 @@
           </w:p>
           <w:p>
             <w:pPr>
-              <w:ind w:left="532" w:hanging="532"/>
               <w:rPr>
                 <w:b/>
               </w:rPr>
@@ -741,7 +564,7 @@
           </w:p>
           <w:p>
             <w:pPr>
-              <w:ind w:left="532" w:hanging="532"/>
+              <w:ind w:left="438"/>
             </w:pPr>
             <w:fldSimple w:instr=" MERGEFIELD  PresenterMaterials  \* MERGEFORMAT ">
               <w:r>
@@ -752,15 +575,171 @@
               </w:r>
             </w:fldSimple>
           </w:p>
+          <w:p/>
+          <w:p>
+            <w:pPr>
+              <w:rPr>
+                <w:sz w:val="20"/>
+                <w:szCs w:val="20"/>
+              </w:rPr>
+            </w:pPr>
+            <w:r>
+              <w:t xml:space="preserve">1. </w:t>
+            </w:r>
+            <w:r>
+              <w:t xml:space="preserve">Click the link to join: </w:t>
+            </w:r>
+            <w:r>
+              <w:fldChar w:fldCharType="begin"/>
+            </w:r>
+            <w:r>
+              <w:instrText xml:space="preserve"> MERGEFIELD  ClickToJoinLink  \* MERGEFORMAT </w:instrText>
+            </w:r>
+            <w:r>
+              <w:fldChar w:fldCharType="separate"/>
+            </w:r>
+            <w:r>
+              <w:rPr>
+                <w:noProof/>
+              </w:rPr>
+              <w:t>«ClickToJoinLink»</w:t>
+            </w:r>
+            <w:r>
+              <w:rPr>
+                <w:noProof/>
+              </w:rPr>
+              <w:fldChar w:fldCharType="end"/>
+            </w:r>
+            <w:r>
+              <w:rPr>
+                <w:noProof/>
+              </w:rPr>
+              <w:t>.</w:t>
+            </w:r>
+            <w:r>
+              <w:rPr>
+                <w:noProof/>
+              </w:rPr>
+              <w:t xml:space="preserve"> </w:t>
+            </w:r>
+            <w:r>
+              <w:rPr>
+                <w:noProof/>
+                <w:sz w:val="20"/>
+                <w:szCs w:val="20"/>
+              </w:rPr>
+              <w:t>(V</w:t>
+            </w:r>
+            <w:r>
+              <w:rPr>
+                <w:noProof/>
+                <w:sz w:val="20"/>
+                <w:szCs w:val="20"/>
+              </w:rPr>
+              <w:t>alid for one location</w:t>
+            </w:r>
+            <w:r>
+              <w:rPr>
+                <w:noProof/>
+                <w:sz w:val="20"/>
+                <w:szCs w:val="20"/>
+              </w:rPr>
+              <w:t xml:space="preserve"> only</w:t>
+            </w:r>
+            <w:r>
+              <w:rPr>
+                <w:noProof/>
+                <w:sz w:val="20"/>
+                <w:szCs w:val="20"/>
+              </w:rPr>
+              <w:t>.</w:t>
+            </w:r>
+            <w:r>
+              <w:rPr>
+                <w:noProof/>
+                <w:sz w:val="20"/>
+                <w:szCs w:val="20"/>
+              </w:rPr>
+              <w:t>)</w:t>
+            </w:r>
+            <w:r>
+              <w:rPr>
+                <w:sz w:val="20"/>
+                <w:szCs w:val="20"/>
+              </w:rPr>
+              <w:t xml:space="preserve"> </w:t>
+            </w:r>
+          </w:p>
+          <w:p>
+            <w:pPr>
+              <w:ind w:left="798"/>
+              <w:rPr>
+                <w:noProof/>
+              </w:rPr>
+            </w:pPr>
+            <w:fldSimple w:instr=" MERGEFIELD  CCCaption  \* MERGEFORMAT ">
+              <w:r>
+                <w:rPr>
+                  <w:noProof/>
+                </w:rPr>
+                <w:t>«C</w:t>
+              </w:r>
+              <w:bookmarkStart w:id="1" w:name="_GoBack"/>
+              <w:bookmarkEnd w:id="1"/>
+              <w:r>
+                <w:rPr>
+                  <w:noProof/>
+                </w:rPr>
+                <w:t>CCaption»</w:t>
+              </w:r>
+            </w:fldSimple>
+            <w:fldSimple w:instr=" MERGEFIELD  ExistingAddLocs  \* MERGEFORMAT ">
+              <w:r>
+                <w:rPr>
+                  <w:noProof/>
+                </w:rPr>
+                <w:t>«ExistingAddLocs»</w:t>
+              </w:r>
+            </w:fldSimple>
+            <w:r>
+              <w:t xml:space="preserve"> </w:t>
+            </w:r>
+            <w:r>
+              <w:rPr>
+                <w:noProof/>
+              </w:rPr>
+              <w:t xml:space="preserve"> To update addresses t</w:t>
+            </w:r>
+            <w:r>
+              <w:rPr>
+                <w:noProof/>
+              </w:rPr>
+              <w:t xml:space="preserve">his event is shared with visit your </w:t>
+            </w:r>
+            <w:fldSimple w:instr=" MERGEFIELD  UpdateOrderPage  \* MERGEFORMAT ">
+              <w:r>
+                <w:rPr>
+                  <w:noProof/>
+                </w:rPr>
+                <w:t>«UpdateOrderPage»</w:t>
+              </w:r>
+            </w:fldSimple>
+            <w:r>
+              <w:t xml:space="preserve"> </w:t>
+            </w:r>
+            <w:r>
+              <w:rPr>
+                <w:noProof/>
+              </w:rPr>
+              <w:t xml:space="preserve"> </w:t>
+            </w:r>
+          </w:p>
           <w:p>
             <w:pPr>
               <w:ind w:left="532" w:hanging="532"/>
             </w:pPr>
           </w:p>
           <w:p>
-            <w:pPr>
-              <w:ind w:left="532" w:hanging="532"/>
-            </w:pPr>
             <w:r>
               <w:t xml:space="preserve">2. </w:t>
             </w:r>
@@ -961,7 +940,7 @@
           </w:p>
           <w:p>
             <w:pPr>
-              <w:ind w:left="532" w:hanging="540"/>
+              <w:ind w:hanging="8"/>
             </w:pPr>
             <w:r>
               <w:rPr>
@@ -1112,27 +1091,14 @@
             <w:r>
               <w:t xml:space="preserve"> </w:t>
             </w:r>
-            <w:r>
-              <w:fldChar w:fldCharType="begin"/>
-            </w:r>
-            <w:r>
-              <w:instrText xml:space="preserve"> MERGEFIELD  ChangeTimeZoneLink  \* MERGEFORMAT </w:instrText>
-            </w:r>
-            <w:r>
-              <w:fldChar w:fldCharType="separate"/>
-            </w:r>
-            <w:r>
-              <w:rPr>
-                <w:noProof/>
-              </w:rPr>
-              <w:t>«ChangeTimeZoneLink»</w:t>
-            </w:r>
-            <w:r>
-              <w:rPr>
-                <w:noProof/>
-              </w:rPr>
-              <w:fldChar w:fldCharType="end"/>
-            </w:r>
+            <w:fldSimple w:instr=" MERGEFIELD  ChangeTimeZoneLink  \* MERGEFORMAT ">
+              <w:r>
+                <w:rPr>
+                  <w:noProof/>
+                </w:rPr>
+                <w:t>«ChangeTimeZoneLink»</w:t>
+              </w:r>
+            </w:fldSimple>
           </w:p>
           <w:p/>
           <w:p>
@@ -1146,27 +1112,14 @@
             <w:r>
               <w:t xml:space="preserve"> (including a chance to test your computer’s readiness) can be viewed at </w:t>
             </w:r>
-            <w:r>
-              <w:fldChar w:fldCharType="begin"/>
-            </w:r>
-            <w:r>
-              <w:instrText xml:space="preserve"> MERGEFIELD  DetailedConnectionInfoLink  \* MERGEFORMAT </w:instrText>
-            </w:r>
-            <w:r>
-              <w:fldChar w:fldCharType="separate"/>
-            </w:r>
-            <w:r>
-              <w:rPr>
-                <w:noProof/>
-              </w:rPr>
-              <w:t>«DetailedConnectionInfoLink»</w:t>
-            </w:r>
-            <w:r>
-              <w:rPr>
-                <w:noProof/>
-              </w:rPr>
-              <w:fldChar w:fldCharType="end"/>
-            </w:r>
+            <w:fldSimple w:instr=" MERGEFIELD  DetailedConnectionInfoLink  \* MERGEFORMAT ">
+              <w:r>
+                <w:rPr>
+                  <w:noProof/>
+                </w:rPr>
+                <w:t>«DetailedConnectionInfoLink»</w:t>
+              </w:r>
+            </w:fldSimple>
             <w:r>
               <w:t xml:space="preserve">. </w:t>
             </w:r>
@@ -1541,6 +1494,96 @@
     </w:lvl>
   </w:abstractNum>
   <w:abstractNum w:abstractNumId="1" w15:restartNumberingAfterBreak="0">
+    <w:nsid w:val="28784269"/>
+    <w:multiLevelType w:val="hybridMultilevel"/>
+    <w:tmpl w:val="D21873D6"/>
+    <w:lvl w:ilvl="0" w:tplc="EC5C3F5A">
+      <w:start w:val="1"/>
+      <w:numFmt w:val="decimal"/>
+      <w:lvlText w:val="%1."/>
+      <w:lvlJc w:val="left"/>
+      <w:pPr>
+        <w:ind w:left="720" w:hanging="360"/>
+      </w:pPr>
+      <w:rPr>
+        <w:rFonts w:hint="default"/>
+        <w:sz w:val="22"/>
+      </w:rPr>
+    </w:lvl>
+    <w:lvl w:ilvl="1" w:tplc="04090019" w:tentative="1">
+      <w:start w:val="1"/>
+      <w:numFmt w:val="lowerLetter"/>
+      <w:lvlText w:val="%2."/>
+      <w:lvlJc w:val="left"/>
+      <w:pPr>
+        <w:ind w:left="1440" w:hanging="360"/>
+      </w:pPr>
+    </w:lvl>
+    <w:lvl w:ilvl="2" w:tplc="0409001B" w:tentative="1">
+      <w:start w:val="1"/>
+      <w:numFmt w:val="lowerRoman"/>
+      <w:lvlText w:val="%3."/>
+      <w:lvlJc w:val="right"/>
+      <w:pPr>
+        <w:ind w:left="2160" w:hanging="180"/>
+      </w:pPr>
+    </w:lvl>
+    <w:lvl w:ilvl="3" w:tplc="0409000F" w:tentative="1">
+      <w:start w:val="1"/>
+      <w:numFmt w:val="decimal"/>
+      <w:lvlText w:val="%4."/>
+      <w:lvlJc w:val="left"/>
+      <w:pPr>
+        <w:ind w:left="2880" w:hanging="360"/>
+      </w:pPr>
+    </w:lvl>
+    <w:lvl w:ilvl="4" w:tplc="04090019" w:tentative="1">
+      <w:start w:val="1"/>
+      <w:numFmt w:val="lowerLetter"/>
+      <w:lvlText w:val="%5."/>
+      <w:lvlJc w:val="left"/>
+      <w:pPr>
+        <w:ind w:left="3600" w:hanging="360"/>
+      </w:pPr>
+    </w:lvl>
+    <w:lvl w:ilvl="5" w:tplc="0409001B" w:tentative="1">
+      <w:start w:val="1"/>
+      <w:numFmt w:val="lowerRoman"/>
+      <w:lvlText w:val="%6."/>
+      <w:lvlJc w:val="right"/>
+      <w:pPr>
+        <w:ind w:left="4320" w:hanging="180"/>
+      </w:pPr>
+    </w:lvl>
+    <w:lvl w:ilvl="6" w:tplc="0409000F" w:tentative="1">
+      <w:start w:val="1"/>
+      <w:numFmt w:val="decimal"/>
+      <w:lvlText w:val="%7."/>
+      <w:lvlJc w:val="left"/>
+      <w:pPr>
+        <w:ind w:left="5040" w:hanging="360"/>
+      </w:pPr>
+    </w:lvl>
+    <w:lvl w:ilvl="7" w:tplc="04090019" w:tentative="1">
+      <w:start w:val="1"/>
+      <w:numFmt w:val="lowerLetter"/>
+      <w:lvlText w:val="%8."/>
+      <w:lvlJc w:val="left"/>
+      <w:pPr>
+        <w:ind w:left="5760" w:hanging="360"/>
+      </w:pPr>
+    </w:lvl>
+    <w:lvl w:ilvl="8" w:tplc="0409001B" w:tentative="1">
+      <w:start w:val="1"/>
+      <w:numFmt w:val="lowerRoman"/>
+      <w:lvlText w:val="%9."/>
+      <w:lvlJc w:val="right"/>
+      <w:pPr>
+        <w:ind w:left="6480" w:hanging="180"/>
+      </w:pPr>
+    </w:lvl>
+  </w:abstractNum>
+  <w:abstractNum w:abstractNumId="2" w15:restartNumberingAfterBreak="0">
     <w:nsid w:val="4A432A11"/>
     <w:multiLevelType w:val="hybridMultilevel"/>
     <w:tmpl w:val="8B3E66CC"/>
@@ -1629,7 +1672,97 @@
       </w:pPr>
     </w:lvl>
   </w:abstractNum>
-  <w:abstractNum w:abstractNumId="2" w15:restartNumberingAfterBreak="0">
+  <w:abstractNum w:abstractNumId="3" w15:restartNumberingAfterBreak="0">
+    <w:nsid w:val="4A6A156A"/>
+    <w:multiLevelType w:val="hybridMultilevel"/>
+    <w:tmpl w:val="F5A8ED3E"/>
+    <w:lvl w:ilvl="0" w:tplc="FABCC4DE">
+      <w:start w:val="1"/>
+      <w:numFmt w:val="decimal"/>
+      <w:lvlText w:val="%1."/>
+      <w:lvlJc w:val="left"/>
+      <w:pPr>
+        <w:ind w:left="810" w:hanging="360"/>
+      </w:pPr>
+      <w:rPr>
+        <w:rFonts w:hint="default"/>
+        <w:sz w:val="22"/>
+      </w:rPr>
+    </w:lvl>
+    <w:lvl w:ilvl="1" w:tplc="04090019" w:tentative="1">
+      <w:start w:val="1"/>
+      <w:numFmt w:val="lowerLetter"/>
+      <w:lvlText w:val="%2."/>
+      <w:lvlJc w:val="left"/>
+      <w:pPr>
+        <w:ind w:left="1530" w:hanging="360"/>
+      </w:pPr>
+    </w:lvl>
+    <w:lvl w:ilvl="2" w:tplc="0409001B" w:tentative="1">
+      <w:start w:val="1"/>
+      <w:numFmt w:val="lowerRoman"/>
+      <w:lvlText w:val="%3."/>
+      <w:lvlJc w:val="right"/>
+      <w:pPr>
+        <w:ind w:left="2250" w:hanging="180"/>
+      </w:pPr>
+    </w:lvl>
+    <w:lvl w:ilvl="3" w:tplc="0409000F" w:tentative="1">
+      <w:start w:val="1"/>
+      <w:numFmt w:val="decimal"/>
+      <w:lvlText w:val="%4."/>
+      <w:lvlJc w:val="left"/>
+      <w:pPr>
+        <w:ind w:left="2970" w:hanging="360"/>
+      </w:pPr>
+    </w:lvl>
+    <w:lvl w:ilvl="4" w:tplc="04090019" w:tentative="1">
+      <w:start w:val="1"/>
+      <w:numFmt w:val="lowerLetter"/>
+      <w:lvlText w:val="%5."/>
+      <w:lvlJc w:val="left"/>
+      <w:pPr>
+        <w:ind w:left="3690" w:hanging="360"/>
+      </w:pPr>
+    </w:lvl>
+    <w:lvl w:ilvl="5" w:tplc="0409001B" w:tentative="1">
+      <w:start w:val="1"/>
+      <w:numFmt w:val="lowerRoman"/>
+      <w:lvlText w:val="%6."/>
+      <w:lvlJc w:val="right"/>
+      <w:pPr>
+        <w:ind w:left="4410" w:hanging="180"/>
+      </w:pPr>
+    </w:lvl>
+    <w:lvl w:ilvl="6" w:tplc="0409000F" w:tentative="1">
+      <w:start w:val="1"/>
+      <w:numFmt w:val="decimal"/>
+      <w:lvlText w:val="%7."/>
+      <w:lvlJc w:val="left"/>
+      <w:pPr>
+        <w:ind w:left="5130" w:hanging="360"/>
+      </w:pPr>
+    </w:lvl>
+    <w:lvl w:ilvl="7" w:tplc="04090019" w:tentative="1">
+      <w:start w:val="1"/>
+      <w:numFmt w:val="lowerLetter"/>
+      <w:lvlText w:val="%8."/>
+      <w:lvlJc w:val="left"/>
+      <w:pPr>
+        <w:ind w:left="5850" w:hanging="360"/>
+      </w:pPr>
+    </w:lvl>
+    <w:lvl w:ilvl="8" w:tplc="0409001B" w:tentative="1">
+      <w:start w:val="1"/>
+      <w:numFmt w:val="lowerRoman"/>
+      <w:lvlText w:val="%9."/>
+      <w:lvlJc w:val="right"/>
+      <w:pPr>
+        <w:ind w:left="6570" w:hanging="180"/>
+      </w:pPr>
+    </w:lvl>
+  </w:abstractNum>
+  <w:abstractNum w:abstractNumId="4" w15:restartNumberingAfterBreak="0">
     <w:nsid w:val="5ABC28D5"/>
     <w:multiLevelType w:val="hybridMultilevel"/>
     <w:tmpl w:val="F8AA3DEA"/>
@@ -1718,7 +1851,7 @@
       </w:pPr>
     </w:lvl>
   </w:abstractNum>
-  <w:abstractNum w:abstractNumId="3" w15:restartNumberingAfterBreak="0">
+  <w:abstractNum w:abstractNumId="5" w15:restartNumberingAfterBreak="0">
     <w:nsid w:val="63656CA7"/>
     <w:multiLevelType w:val="hybridMultilevel"/>
     <w:tmpl w:val="2FDED672"/>
@@ -1832,15 +1965,21 @@
     </w:lvl>
   </w:abstractNum>
   <w:num w:numId="1">
-    <w:abstractNumId w:val="3"/>
+    <w:abstractNumId w:val="5"/>
   </w:num>
   <w:num w:numId="2">
     <w:abstractNumId w:val="0"/>
   </w:num>
   <w:num w:numId="3">
+    <w:abstractNumId w:val="4"/>
+  </w:num>
+  <w:num w:numId="4">
     <w:abstractNumId w:val="2"/>
   </w:num>
-  <w:num w:numId="4">
+  <w:num w:numId="5">
+    <w:abstractNumId w:val="3"/>
+  </w:num>
+  <w:num w:numId="6">
     <w:abstractNumId w:val="1"/>
   </w:num>
 </w:numbering>
@@ -2621,7 +2760,7 @@
 </file>
 
 <file path=customXml/itemProps1.xml><?xml version="1.0" encoding="utf-8"?>
-<ds:datastoreItem xmlns:ds="http://schemas.openxmlformats.org/officeDocument/2006/customXml" ds:itemID="{E62426BB-1CAC-44B9-82D1-036B16E1AC76}">
+<ds:datastoreItem xmlns:ds="http://schemas.openxmlformats.org/officeDocument/2006/customXml" ds:itemID="{E7FE4751-EA34-45B5-AC08-C8A313AD66B6}">
   <ds:schemaRefs>
     <ds:schemaRef ds:uri="http://schemas.openxmlformats.org/officeDocument/2006/bibliography"/>
   </ds:schemaRefs>

</xml_diff>

<commit_message>
Adds custom message ability to Connection Checklist
</commit_message>
<xml_diff>
--- a/CUWebinars.Web/App_Data/mergeTemplates/ConnectionInfo2.docx
+++ b/CUWebinars.Web/App_Data/mergeTemplates/ConnectionInfo2.docx
@@ -1,6 +1,6 @@
 
 <file path=word/document.xml><?xml version="1.0" encoding="utf-8"?>
-<w:document xmlns:wpc="http://schemas.microsoft.com/office/word/2010/wordprocessingCanvas" xmlns:cx="http://schemas.microsoft.com/office/drawing/2014/chartex" xmlns:cx1="http://schemas.microsoft.com/office/drawing/2015/9/8/chartex" xmlns:cx2="http://schemas.microsoft.com/office/drawing/2015/10/21/chartex" xmlns:cx3="http://schemas.microsoft.com/office/drawing/2016/5/9/chartex" xmlns:cx4="http://schemas.microsoft.com/office/drawing/2016/5/10/chartex" xmlns:cx5="http://schemas.microsoft.com/office/drawing/2016/5/11/chartex" xmlns:cx6="http://schemas.microsoft.com/office/drawing/2016/5/12/chartex" xmlns:cx7="http://schemas.microsoft.com/office/drawing/2016/5/13/chartex" xmlns:cx8="http://schemas.microsoft.com/office/drawing/2016/5/14/chartex" xmlns:mc="http://schemas.openxmlformats.org/markup-compatibility/2006" xmlns:o="urn:schemas-microsoft-com:office:office" xmlns:r="http://schemas.openxmlformats.org/officeDocument/2006/relationships" xmlns:m="http://schemas.openxmlformats.org/officeDocument/2006/math" xmlns:v="urn:schemas-microsoft-com:vml" xmlns:wp14="http://schemas.microsoft.com/office/word/2010/wordprocessingDrawing" xmlns:wp="http://schemas.openxmlformats.org/drawingml/2006/wordprocessingDrawing" xmlns:w10="urn:schemas-microsoft-com:office:word" xmlns:w="http://schemas.openxmlformats.org/wordprocessingml/2006/main" xmlns:w14="http://schemas.microsoft.com/office/word/2010/wordml" xmlns:w15="http://schemas.microsoft.com/office/word/2012/wordml" xmlns:w16se="http://schemas.microsoft.com/office/word/2015/wordml/symex" xmlns:wpg="http://schemas.microsoft.com/office/word/2010/wordprocessingGroup" xmlns:wpi="http://schemas.microsoft.com/office/word/2010/wordprocessingInk" xmlns:wne="http://schemas.microsoft.com/office/word/2006/wordml" xmlns:wps="http://schemas.microsoft.com/office/word/2010/wordprocessingShape" mc:Ignorable="w14 w15 w16se wp14">
+<w:document xmlns:wpc="http://schemas.microsoft.com/office/word/2010/wordprocessingCanvas" xmlns:cx="http://schemas.microsoft.com/office/drawing/2014/chartex" xmlns:cx1="http://schemas.microsoft.com/office/drawing/2015/9/8/chartex" xmlns:cx2="http://schemas.microsoft.com/office/drawing/2015/10/21/chartex" xmlns:cx3="http://schemas.microsoft.com/office/drawing/2016/5/9/chartex" xmlns:cx4="http://schemas.microsoft.com/office/drawing/2016/5/10/chartex" xmlns:cx5="http://schemas.microsoft.com/office/drawing/2016/5/11/chartex" xmlns:cx6="http://schemas.microsoft.com/office/drawing/2016/5/12/chartex" xmlns:cx7="http://schemas.microsoft.com/office/drawing/2016/5/13/chartex" xmlns:cx8="http://schemas.microsoft.com/office/drawing/2016/5/14/chartex" xmlns:mc="http://schemas.openxmlformats.org/markup-compatibility/2006" xmlns:aink="http://schemas.microsoft.com/office/drawing/2016/ink" xmlns:o="urn:schemas-microsoft-com:office:office" xmlns:r="http://schemas.openxmlformats.org/officeDocument/2006/relationships" xmlns:m="http://schemas.openxmlformats.org/officeDocument/2006/math" xmlns:v="urn:schemas-microsoft-com:vml" xmlns:wp14="http://schemas.microsoft.com/office/word/2010/wordprocessingDrawing" xmlns:wp="http://schemas.openxmlformats.org/drawingml/2006/wordprocessingDrawing" xmlns:w10="urn:schemas-microsoft-com:office:word" xmlns:w="http://schemas.openxmlformats.org/wordprocessingml/2006/main" xmlns:w14="http://schemas.microsoft.com/office/word/2010/wordml" xmlns:w15="http://schemas.microsoft.com/office/word/2012/wordml" xmlns:w16se="http://schemas.microsoft.com/office/word/2015/wordml/symex" xmlns:wpg="http://schemas.microsoft.com/office/word/2010/wordprocessingGroup" xmlns:wpi="http://schemas.microsoft.com/office/word/2010/wordprocessingInk" xmlns:wne="http://schemas.microsoft.com/office/word/2006/wordml" xmlns:wps="http://schemas.microsoft.com/office/word/2010/wordprocessingShape" mc:Ignorable="w14 w15 w16se wp14">
   <w:body>
     <w:tbl>
       <w:tblPr>
@@ -456,14 +456,27 @@
             <w:r>
               <w:t xml:space="preserve">Dear </w:t>
             </w:r>
-            <w:fldSimple w:instr=" MERGEFIELD  FirstName  \* MERGEFORMAT ">
-              <w:r>
-                <w:rPr>
-                  <w:noProof/>
-                </w:rPr>
-                <w:t>«FirstName»</w:t>
-              </w:r>
-            </w:fldSimple>
+            <w:r>
+              <w:fldChar w:fldCharType="begin"/>
+            </w:r>
+            <w:r>
+              <w:instrText xml:space="preserve"> MERGEFIELD  FirstName  \* MERGEFORMAT </w:instrText>
+            </w:r>
+            <w:r>
+              <w:fldChar w:fldCharType="separate"/>
+            </w:r>
+            <w:r>
+              <w:rPr>
+                <w:noProof/>
+              </w:rPr>
+              <w:t>«FirstName»</w:t>
+            </w:r>
+            <w:r>
+              <w:rPr>
+                <w:noProof/>
+              </w:rPr>
+              <w:fldChar w:fldCharType="end"/>
+            </w:r>
             <w:r>
               <w:t>,</w:t>
             </w:r>
@@ -475,9 +488,21 @@
                 <w:noProof/>
               </w:rPr>
             </w:pPr>
+            <w:bookmarkStart w:id="1" w:name="OLE_LINK3"/>
+            <w:bookmarkStart w:id="2" w:name="OLE_LINK7"/>
+            <w:r>
+              <w:t>[specialmsg</w:t>
+            </w:r>
+            <w:bookmarkStart w:id="3" w:name="_GoBack"/>
+            <w:bookmarkEnd w:id="3"/>
+            <w:r>
+              <w:t>]</w:t>
+            </w:r>
             <w:r>
               <w:t xml:space="preserve">It’s time to get ready for the </w:t>
             </w:r>
+            <w:bookmarkEnd w:id="1"/>
+            <w:bookmarkEnd w:id="2"/>
             <w:r>
               <w:rPr>
                 <w:i/>
@@ -515,17 +540,35 @@
               </w:rPr>
               <w:t xml:space="preserve"> </w:t>
             </w:r>
-            <w:r>
-              <w:t xml:space="preserve">webinar coming up on </w:t>
-            </w:r>
-            <w:fldSimple w:instr=" MERGEFIELD  DisplayDate  \* MERGEFORMAT ">
-              <w:r>
-                <w:rPr>
-                  <w:noProof/>
-                </w:rPr>
-                <w:t>«DisplayDate»</w:t>
-              </w:r>
-            </w:fldSimple>
+            <w:bookmarkStart w:id="4" w:name="OLE_LINK8"/>
+            <w:r>
+              <w:t>webinar coming up on</w:t>
+            </w:r>
+            <w:bookmarkEnd w:id="4"/>
+            <w:r>
+              <w:t xml:space="preserve"> </w:t>
+            </w:r>
+            <w:r>
+              <w:fldChar w:fldCharType="begin"/>
+            </w:r>
+            <w:r>
+              <w:instrText xml:space="preserve"> MERGEFIELD  DisplayDate  \* MERGEFORMAT </w:instrText>
+            </w:r>
+            <w:r>
+              <w:fldChar w:fldCharType="separate"/>
+            </w:r>
+            <w:r>
+              <w:rPr>
+                <w:noProof/>
+              </w:rPr>
+              <w:t>«DisplayDate»</w:t>
+            </w:r>
+            <w:r>
+              <w:rPr>
+                <w:noProof/>
+              </w:rPr>
+              <w:fldChar w:fldCharType="end"/>
+            </w:r>
             <w:r>
               <w:rPr>
                 <w:noProof/>
@@ -535,14 +578,27 @@
             <w:r>
               <w:t xml:space="preserve"> </w:t>
             </w:r>
-            <w:fldSimple w:instr=" MERGEFIELD  AddReminder  \* MERGEFORMAT ">
-              <w:r>
-                <w:rPr>
-                  <w:noProof/>
-                </w:rPr>
-                <w:t>«AddReminder»</w:t>
-              </w:r>
-            </w:fldSimple>
+            <w:r>
+              <w:fldChar w:fldCharType="begin"/>
+            </w:r>
+            <w:r>
+              <w:instrText xml:space="preserve"> MERGEFIELD  AddReminder  \* MERGEFORMAT </w:instrText>
+            </w:r>
+            <w:r>
+              <w:fldChar w:fldCharType="separate"/>
+            </w:r>
+            <w:r>
+              <w:rPr>
+                <w:noProof/>
+              </w:rPr>
+              <w:t>«AddReminder»</w:t>
+            </w:r>
+            <w:r>
+              <w:rPr>
+                <w:noProof/>
+              </w:rPr>
+              <w:fldChar w:fldCharType="end"/>
+            </w:r>
           </w:p>
           <w:p>
             <w:pPr>
@@ -566,50 +622,50 @@
             <w:pPr>
               <w:ind w:left="438"/>
             </w:pPr>
-            <w:fldSimple w:instr=" MERGEFIELD  PresenterMaterials  \* MERGEFORMAT ">
+            <w:r>
+              <w:fldChar w:fldCharType="begin"/>
+            </w:r>
+            <w:r>
+              <w:instrText xml:space="preserve"> MERGEFIELD  PresenterMaterials  \* MERGEFORMAT </w:instrText>
+            </w:r>
+            <w:r>
+              <w:fldChar w:fldCharType="separate"/>
+            </w:r>
+            <w:r>
+              <w:rPr>
+                <w:noProof/>
+              </w:rPr>
+              <w:t>«PresenterMaterials»</w:t>
+            </w:r>
+            <w:r>
+              <w:rPr>
+                <w:noProof/>
+              </w:rPr>
+              <w:fldChar w:fldCharType="end"/>
+            </w:r>
+          </w:p>
+          <w:p/>
+          <w:p>
+            <w:pPr>
+              <w:rPr>
+                <w:sz w:val="20"/>
+                <w:szCs w:val="20"/>
+              </w:rPr>
+            </w:pPr>
+            <w:r>
+              <w:t xml:space="preserve">1. </w:t>
+            </w:r>
+            <w:r>
+              <w:t xml:space="preserve">Click the link to join: </w:t>
+            </w:r>
+            <w:fldSimple w:instr=" MERGEFIELD  ClickToJoinLink  \* MERGEFORMAT ">
               <w:r>
                 <w:rPr>
                   <w:noProof/>
                 </w:rPr>
-                <w:t>«PresenterMaterials»</w:t>
+                <w:t>«ClickToJoinLink»</w:t>
               </w:r>
             </w:fldSimple>
-          </w:p>
-          <w:p/>
-          <w:p>
-            <w:pPr>
-              <w:rPr>
-                <w:sz w:val="20"/>
-                <w:szCs w:val="20"/>
-              </w:rPr>
-            </w:pPr>
-            <w:r>
-              <w:t xml:space="preserve">1. </w:t>
-            </w:r>
-            <w:r>
-              <w:t xml:space="preserve">Click the link to join: </w:t>
-            </w:r>
-            <w:r>
-              <w:fldChar w:fldCharType="begin"/>
-            </w:r>
-            <w:r>
-              <w:instrText xml:space="preserve"> MERGEFIELD  ClickToJoinLink  \* MERGEFORMAT </w:instrText>
-            </w:r>
-            <w:r>
-              <w:fldChar w:fldCharType="separate"/>
-            </w:r>
-            <w:r>
-              <w:rPr>
-                <w:noProof/>
-              </w:rPr>
-              <w:t>«ClickToJoinLink»</w:t>
-            </w:r>
-            <w:r>
-              <w:rPr>
-                <w:noProof/>
-              </w:rPr>
-              <w:fldChar w:fldCharType="end"/>
-            </w:r>
             <w:r>
               <w:rPr>
                 <w:noProof/>
@@ -677,30 +733,48 @@
                 <w:noProof/>
               </w:rPr>
             </w:pPr>
-            <w:fldSimple w:instr=" MERGEFIELD  CCCaption  \* MERGEFORMAT ">
-              <w:r>
-                <w:rPr>
-                  <w:noProof/>
-                </w:rPr>
-                <w:t>«C</w:t>
-              </w:r>
-              <w:bookmarkStart w:id="1" w:name="_GoBack"/>
-              <w:bookmarkEnd w:id="1"/>
-              <w:r>
-                <w:rPr>
-                  <w:noProof/>
-                </w:rPr>
-                <w:t>CCaption»</w:t>
-              </w:r>
-            </w:fldSimple>
-            <w:fldSimple w:instr=" MERGEFIELD  ExistingAddLocs  \* MERGEFORMAT ">
-              <w:r>
-                <w:rPr>
-                  <w:noProof/>
-                </w:rPr>
-                <w:t>«ExistingAddLocs»</w:t>
-              </w:r>
-            </w:fldSimple>
+            <w:r>
+              <w:fldChar w:fldCharType="begin"/>
+            </w:r>
+            <w:r>
+              <w:instrText xml:space="preserve"> MERGEFIELD  CCCaption  \* MERGEFORMAT </w:instrText>
+            </w:r>
+            <w:r>
+              <w:fldChar w:fldCharType="separate"/>
+            </w:r>
+            <w:r>
+              <w:rPr>
+                <w:noProof/>
+              </w:rPr>
+              <w:t>«CCCaption»</w:t>
+            </w:r>
+            <w:r>
+              <w:rPr>
+                <w:noProof/>
+              </w:rPr>
+              <w:fldChar w:fldCharType="end"/>
+            </w:r>
+            <w:r>
+              <w:fldChar w:fldCharType="begin"/>
+            </w:r>
+            <w:r>
+              <w:instrText xml:space="preserve"> MERGEFIELD  ExistingAddLocs  \* MERGEFORMAT </w:instrText>
+            </w:r>
+            <w:r>
+              <w:fldChar w:fldCharType="separate"/>
+            </w:r>
+            <w:r>
+              <w:rPr>
+                <w:noProof/>
+              </w:rPr>
+              <w:t>«ExistingAddLocs»</w:t>
+            </w:r>
+            <w:r>
+              <w:rPr>
+                <w:noProof/>
+              </w:rPr>
+              <w:fldChar w:fldCharType="end"/>
+            </w:r>
             <w:r>
               <w:t xml:space="preserve"> </w:t>
             </w:r>
@@ -716,14 +790,27 @@
               </w:rPr>
               <w:t xml:space="preserve">his event is shared with visit your </w:t>
             </w:r>
-            <w:fldSimple w:instr=" MERGEFIELD  UpdateOrderPage  \* MERGEFORMAT ">
-              <w:r>
-                <w:rPr>
-                  <w:noProof/>
-                </w:rPr>
-                <w:t>«UpdateOrderPage»</w:t>
-              </w:r>
-            </w:fldSimple>
+            <w:r>
+              <w:fldChar w:fldCharType="begin"/>
+            </w:r>
+            <w:r>
+              <w:instrText xml:space="preserve"> MERGEFIELD  UpdateOrderPage  \* MERGEFORMAT </w:instrText>
+            </w:r>
+            <w:r>
+              <w:fldChar w:fldCharType="separate"/>
+            </w:r>
+            <w:r>
+              <w:rPr>
+                <w:noProof/>
+              </w:rPr>
+              <w:t>«UpdateOrderPage»</w:t>
+            </w:r>
+            <w:r>
+              <w:rPr>
+                <w:noProof/>
+              </w:rPr>
+              <w:fldChar w:fldCharType="end"/>
+            </w:r>
             <w:r>
               <w:t xml:space="preserve"> </w:t>
             </w:r>
@@ -981,8 +1068,8 @@
               </w:rPr>
               <w:t>«</w:t>
             </w:r>
-            <w:bookmarkStart w:id="2" w:name="OLE_LINK4"/>
-            <w:bookmarkStart w:id="3" w:name="OLE_LINK5"/>
+            <w:bookmarkStart w:id="5" w:name="OLE_LINK4"/>
+            <w:bookmarkStart w:id="6" w:name="OLE_LINK5"/>
             <w:r>
               <w:rPr>
                 <w:b/>
@@ -990,8 +1077,8 @@
               </w:rPr>
               <w:t>ShowStartTime</w:t>
             </w:r>
-            <w:bookmarkEnd w:id="2"/>
-            <w:bookmarkEnd w:id="3"/>
+            <w:bookmarkEnd w:id="5"/>
+            <w:bookmarkEnd w:id="6"/>
             <w:r>
               <w:rPr>
                 <w:b/>
@@ -1091,14 +1178,27 @@
             <w:r>
               <w:t xml:space="preserve"> </w:t>
             </w:r>
-            <w:fldSimple w:instr=" MERGEFIELD  ChangeTimeZoneLink  \* MERGEFORMAT ">
-              <w:r>
-                <w:rPr>
-                  <w:noProof/>
-                </w:rPr>
-                <w:t>«ChangeTimeZoneLink»</w:t>
-              </w:r>
-            </w:fldSimple>
+            <w:r>
+              <w:fldChar w:fldCharType="begin"/>
+            </w:r>
+            <w:r>
+              <w:instrText xml:space="preserve"> MERGEFIELD  ChangeTimeZoneLink  \* MERGEFORMAT </w:instrText>
+            </w:r>
+            <w:r>
+              <w:fldChar w:fldCharType="separate"/>
+            </w:r>
+            <w:r>
+              <w:rPr>
+                <w:noProof/>
+              </w:rPr>
+              <w:t>«ChangeTimeZoneLink»</w:t>
+            </w:r>
+            <w:r>
+              <w:rPr>
+                <w:noProof/>
+              </w:rPr>
+              <w:fldChar w:fldCharType="end"/>
+            </w:r>
           </w:p>
           <w:p/>
           <w:p>
@@ -1112,14 +1212,27 @@
             <w:r>
               <w:t xml:space="preserve"> (including a chance to test your computer’s readiness) can be viewed at </w:t>
             </w:r>
-            <w:fldSimple w:instr=" MERGEFIELD  DetailedConnectionInfoLink  \* MERGEFORMAT ">
-              <w:r>
-                <w:rPr>
-                  <w:noProof/>
-                </w:rPr>
-                <w:t>«DetailedConnectionInfoLink»</w:t>
-              </w:r>
-            </w:fldSimple>
+            <w:r>
+              <w:fldChar w:fldCharType="begin"/>
+            </w:r>
+            <w:r>
+              <w:instrText xml:space="preserve"> MERGEFIELD  DetailedConnectionInfoLink  \* MERGEFORMAT </w:instrText>
+            </w:r>
+            <w:r>
+              <w:fldChar w:fldCharType="separate"/>
+            </w:r>
+            <w:r>
+              <w:rPr>
+                <w:noProof/>
+              </w:rPr>
+              <w:t>«DetailedConnectionInfoLink»</w:t>
+            </w:r>
+            <w:r>
+              <w:rPr>
+                <w:noProof/>
+              </w:rPr>
+              <w:fldChar w:fldCharType="end"/>
+            </w:r>
             <w:r>
               <w:t xml:space="preserve">. </w:t>
             </w:r>
@@ -1190,8 +1303,8 @@
                       <w:tcPr>
                         <w:tcW w:w="4297" w:type="dxa"/>
                       </w:tcPr>
-                      <w:bookmarkStart w:id="4" w:name="OLE_LINK1"/>
-                      <w:bookmarkStart w:id="5" w:name="OLE_LINK2"/>
+                      <w:bookmarkStart w:id="7" w:name="OLE_LINK1"/>
+                      <w:bookmarkStart w:id="8" w:name="OLE_LINK2"/>
                       <w:p>
                         <w:pPr>
                           <w:jc w:val="center"/>
@@ -1236,8 +1349,8 @@
                           </w:rPr>
                           <w:fldChar w:fldCharType="end"/>
                         </w:r>
-                        <w:bookmarkEnd w:id="4"/>
-                        <w:bookmarkEnd w:id="5"/>
+                        <w:bookmarkEnd w:id="7"/>
+                        <w:bookmarkEnd w:id="8"/>
                       </w:p>
                     </w:tc>
                     <w:tc>
@@ -1406,7 +1519,7 @@
 </file>
 
 <file path=word/numbering.xml><?xml version="1.0" encoding="utf-8"?>
-<w:numbering xmlns:wpc="http://schemas.microsoft.com/office/word/2010/wordprocessingCanvas" xmlns:cx="http://schemas.microsoft.com/office/drawing/2014/chartex" xmlns:cx1="http://schemas.microsoft.com/office/drawing/2015/9/8/chartex" xmlns:cx2="http://schemas.microsoft.com/office/drawing/2015/10/21/chartex" xmlns:cx3="http://schemas.microsoft.com/office/drawing/2016/5/9/chartex" xmlns:cx4="http://schemas.microsoft.com/office/drawing/2016/5/10/chartex" xmlns:cx5="http://schemas.microsoft.com/office/drawing/2016/5/11/chartex" xmlns:cx6="http://schemas.microsoft.com/office/drawing/2016/5/12/chartex" xmlns:cx7="http://schemas.microsoft.com/office/drawing/2016/5/13/chartex" xmlns:cx8="http://schemas.microsoft.com/office/drawing/2016/5/14/chartex" xmlns:mc="http://schemas.openxmlformats.org/markup-compatibility/2006" xmlns:o="urn:schemas-microsoft-com:office:office" xmlns:r="http://schemas.openxmlformats.org/officeDocument/2006/relationships" xmlns:m="http://schemas.openxmlformats.org/officeDocument/2006/math" xmlns:v="urn:schemas-microsoft-com:vml" xmlns:wp14="http://schemas.microsoft.com/office/word/2010/wordprocessingDrawing" xmlns:wp="http://schemas.openxmlformats.org/drawingml/2006/wordprocessingDrawing" xmlns:w10="urn:schemas-microsoft-com:office:word" xmlns:w="http://schemas.openxmlformats.org/wordprocessingml/2006/main" xmlns:w14="http://schemas.microsoft.com/office/word/2010/wordml" xmlns:w15="http://schemas.microsoft.com/office/word/2012/wordml" xmlns:w16se="http://schemas.microsoft.com/office/word/2015/wordml/symex" xmlns:wpg="http://schemas.microsoft.com/office/word/2010/wordprocessingGroup" xmlns:wpi="http://schemas.microsoft.com/office/word/2010/wordprocessingInk" xmlns:wne="http://schemas.microsoft.com/office/word/2006/wordml" xmlns:wps="http://schemas.microsoft.com/office/word/2010/wordprocessingShape" mc:Ignorable="w14 w15 w16se wp14">
+<w:numbering xmlns:wpc="http://schemas.microsoft.com/office/word/2010/wordprocessingCanvas" xmlns:cx="http://schemas.microsoft.com/office/drawing/2014/chartex" xmlns:cx1="http://schemas.microsoft.com/office/drawing/2015/9/8/chartex" xmlns:cx2="http://schemas.microsoft.com/office/drawing/2015/10/21/chartex" xmlns:cx3="http://schemas.microsoft.com/office/drawing/2016/5/9/chartex" xmlns:cx4="http://schemas.microsoft.com/office/drawing/2016/5/10/chartex" xmlns:cx5="http://schemas.microsoft.com/office/drawing/2016/5/11/chartex" xmlns:cx6="http://schemas.microsoft.com/office/drawing/2016/5/12/chartex" xmlns:cx7="http://schemas.microsoft.com/office/drawing/2016/5/13/chartex" xmlns:cx8="http://schemas.microsoft.com/office/drawing/2016/5/14/chartex" xmlns:mc="http://schemas.openxmlformats.org/markup-compatibility/2006" xmlns:aink="http://schemas.microsoft.com/office/drawing/2016/ink" xmlns:o="urn:schemas-microsoft-com:office:office" xmlns:r="http://schemas.openxmlformats.org/officeDocument/2006/relationships" xmlns:m="http://schemas.openxmlformats.org/officeDocument/2006/math" xmlns:v="urn:schemas-microsoft-com:vml" xmlns:wp14="http://schemas.microsoft.com/office/word/2010/wordprocessingDrawing" xmlns:wp="http://schemas.openxmlformats.org/drawingml/2006/wordprocessingDrawing" xmlns:w10="urn:schemas-microsoft-com:office:word" xmlns:w="http://schemas.openxmlformats.org/wordprocessingml/2006/main" xmlns:w14="http://schemas.microsoft.com/office/word/2010/wordml" xmlns:w15="http://schemas.microsoft.com/office/word/2012/wordml" xmlns:w16se="http://schemas.microsoft.com/office/word/2015/wordml/symex" xmlns:wpg="http://schemas.microsoft.com/office/word/2010/wordprocessingGroup" xmlns:wpi="http://schemas.microsoft.com/office/word/2010/wordprocessingInk" xmlns:wne="http://schemas.microsoft.com/office/word/2006/wordml" xmlns:wps="http://schemas.microsoft.com/office/word/2010/wordprocessingShape" mc:Ignorable="w14 w15 w16se wp14">
   <w:abstractNum w:abstractNumId="0" w15:restartNumberingAfterBreak="0">
     <w:nsid w:val="0DED66E9"/>
     <w:multiLevelType w:val="hybridMultilevel"/>
@@ -2760,7 +2873,7 @@
 </file>
 
 <file path=customXml/itemProps1.xml><?xml version="1.0" encoding="utf-8"?>
-<ds:datastoreItem xmlns:ds="http://schemas.openxmlformats.org/officeDocument/2006/customXml" ds:itemID="{E7FE4751-EA34-45B5-AC08-C8A313AD66B6}">
+<ds:datastoreItem xmlns:ds="http://schemas.openxmlformats.org/officeDocument/2006/customXml" ds:itemID="{F6B8025A-1B81-4937-8AFD-028BE8A87A25}">
   <ds:schemaRefs>
     <ds:schemaRef ds:uri="http://schemas.openxmlformats.org/officeDocument/2006/bibliography"/>
   </ds:schemaRefs>

</xml_diff>

<commit_message>
Implement Default Opening Message for connection info Removes affiliate rights to edit order status Restricts affiliate RegType editing to valid upgrade types (admins have all reg types).
</commit_message>
<xml_diff>
--- a/CUWebinars.Web/App_Data/mergeTemplates/ConnectionInfo2.docx
+++ b/CUWebinars.Web/App_Data/mergeTemplates/ConnectionInfo2.docx
@@ -456,14 +456,27 @@
             <w:r>
               <w:t xml:space="preserve">Dear </w:t>
             </w:r>
-            <w:fldSimple w:instr=" MERGEFIELD  FirstName  \* MERGEFORMAT ">
-              <w:r>
-                <w:rPr>
-                  <w:noProof/>
-                </w:rPr>
-                <w:t>«FirstName»</w:t>
-              </w:r>
-            </w:fldSimple>
+            <w:r>
+              <w:fldChar w:fldCharType="begin"/>
+            </w:r>
+            <w:r>
+              <w:instrText xml:space="preserve"> MERGEFIELD  FirstName  \* MERGEFORMAT </w:instrText>
+            </w:r>
+            <w:r>
+              <w:fldChar w:fldCharType="separate"/>
+            </w:r>
+            <w:r>
+              <w:rPr>
+                <w:noProof/>
+              </w:rPr>
+              <w:t>«FirstName»</w:t>
+            </w:r>
+            <w:r>
+              <w:rPr>
+                <w:noProof/>
+              </w:rPr>
+              <w:fldChar w:fldCharType="end"/>
+            </w:r>
             <w:r>
               <w:t>,</w:t>
             </w:r>
@@ -478,87 +491,29 @@
             <w:bookmarkStart w:id="1" w:name="OLE_LINK3"/>
             <w:bookmarkStart w:id="2" w:name="OLE_LINK7"/>
             <w:r>
-              <w:t>[specialmsg]</w:t>
-            </w:r>
-            <w:r>
-              <w:t xml:space="preserve">It’s time to get ready for the </w:t>
+              <w:t>[</w:t>
+            </w:r>
+            <w:proofErr w:type="spellStart"/>
+            <w:r>
+              <w:t>O</w:t>
+            </w:r>
+            <w:bookmarkStart w:id="3" w:name="_GoBack"/>
+            <w:bookmarkEnd w:id="3"/>
+            <w:r>
+              <w:t>peningMessage</w:t>
+            </w:r>
+            <w:proofErr w:type="spellEnd"/>
+            <w:r>
+              <w:t>]</w:t>
             </w:r>
             <w:bookmarkEnd w:id="1"/>
             <w:bookmarkEnd w:id="2"/>
             <w:r>
               <w:rPr>
-                <w:i/>
-              </w:rPr>
-              <w:fldChar w:fldCharType="begin"/>
-            </w:r>
-            <w:r>
-              <w:rPr>
-                <w:i/>
-              </w:rPr>
-              <w:instrText xml:space="preserve"> MERGEFIELD  WebinarTitle  \* MERGEFORMAT </w:instrText>
-            </w:r>
-            <w:r>
-              <w:rPr>
-                <w:i/>
-              </w:rPr>
-              <w:fldChar w:fldCharType="separate"/>
-            </w:r>
-            <w:r>
-              <w:rPr>
-                <w:i/>
-                <w:noProof/>
-              </w:rPr>
-              <w:t>«WebinarTitle»</w:t>
-            </w:r>
-            <w:r>
-              <w:rPr>
-                <w:i/>
-              </w:rPr>
-              <w:fldChar w:fldCharType="end"/>
-            </w:r>
-            <w:r>
-              <w:rPr>
-                <w:i/>
+                <w:noProof/>
               </w:rPr>
               <w:t xml:space="preserve"> </w:t>
             </w:r>
-            <w:bookmarkStart w:id="3" w:name="OLE_LINK8"/>
-            <w:bookmarkStart w:id="4" w:name="OLE_LINK9"/>
-            <w:bookmarkStart w:id="5" w:name="_GoBack"/>
-            <w:r>
-              <w:t>webinar coming up on</w:t>
-            </w:r>
-            <w:bookmarkEnd w:id="3"/>
-            <w:bookmarkEnd w:id="4"/>
-            <w:bookmarkEnd w:id="5"/>
-            <w:r>
-              <w:t xml:space="preserve"> </w:t>
-            </w:r>
-            <w:fldSimple w:instr=" MERGEFIELD  DisplayDate  \* MERGEFORMAT ">
-              <w:r>
-                <w:rPr>
-                  <w:noProof/>
-                </w:rPr>
-                <w:t>«DisplayDate»</w:t>
-              </w:r>
-            </w:fldSimple>
-            <w:r>
-              <w:rPr>
-                <w:noProof/>
-              </w:rPr>
-              <w:t>.</w:t>
-            </w:r>
-            <w:r>
-              <w:t xml:space="preserve"> </w:t>
-            </w:r>
-            <w:fldSimple w:instr=" MERGEFIELD  AddReminder  \* MERGEFORMAT ">
-              <w:r>
-                <w:rPr>
-                  <w:noProof/>
-                </w:rPr>
-                <w:t>«AddReminder»</w:t>
-              </w:r>
-            </w:fldSimple>
           </w:p>
           <w:p>
             <w:pPr>
@@ -582,50 +537,50 @@
             <w:pPr>
               <w:ind w:left="438"/>
             </w:pPr>
-            <w:fldSimple w:instr=" MERGEFIELD  PresenterMaterials  \* MERGEFORMAT ">
+            <w:r>
+              <w:fldChar w:fldCharType="begin"/>
+            </w:r>
+            <w:r>
+              <w:instrText xml:space="preserve"> MERGEFIELD  PresenterMaterials  \* MERGEFORMAT </w:instrText>
+            </w:r>
+            <w:r>
+              <w:fldChar w:fldCharType="separate"/>
+            </w:r>
+            <w:r>
+              <w:rPr>
+                <w:noProof/>
+              </w:rPr>
+              <w:t>«PresenterMaterials»</w:t>
+            </w:r>
+            <w:r>
+              <w:rPr>
+                <w:noProof/>
+              </w:rPr>
+              <w:fldChar w:fldCharType="end"/>
+            </w:r>
+          </w:p>
+          <w:p/>
+          <w:p>
+            <w:pPr>
+              <w:rPr>
+                <w:sz w:val="20"/>
+                <w:szCs w:val="20"/>
+              </w:rPr>
+            </w:pPr>
+            <w:r>
+              <w:t xml:space="preserve">1. </w:t>
+            </w:r>
+            <w:r>
+              <w:t xml:space="preserve">Click the link to join: </w:t>
+            </w:r>
+            <w:fldSimple w:instr=" MERGEFIELD  ClickToJoinLink  \* MERGEFORMAT ">
               <w:r>
                 <w:rPr>
                   <w:noProof/>
                 </w:rPr>
-                <w:t>«PresenterMaterials»</w:t>
+                <w:t>«ClickToJoinLink»</w:t>
               </w:r>
             </w:fldSimple>
-          </w:p>
-          <w:p/>
-          <w:p>
-            <w:pPr>
-              <w:rPr>
-                <w:sz w:val="20"/>
-                <w:szCs w:val="20"/>
-              </w:rPr>
-            </w:pPr>
-            <w:r>
-              <w:t xml:space="preserve">1. </w:t>
-            </w:r>
-            <w:r>
-              <w:t xml:space="preserve">Click the link to join: </w:t>
-            </w:r>
-            <w:r>
-              <w:fldChar w:fldCharType="begin"/>
-            </w:r>
-            <w:r>
-              <w:instrText xml:space="preserve"> MERGEFIELD  ClickToJoinLink  \* MERGEFORMAT </w:instrText>
-            </w:r>
-            <w:r>
-              <w:fldChar w:fldCharType="separate"/>
-            </w:r>
-            <w:r>
-              <w:rPr>
-                <w:noProof/>
-              </w:rPr>
-              <w:t>«ClickToJoinLink»</w:t>
-            </w:r>
-            <w:r>
-              <w:rPr>
-                <w:noProof/>
-              </w:rPr>
-              <w:fldChar w:fldCharType="end"/>
-            </w:r>
             <w:r>
               <w:rPr>
                 <w:noProof/>
@@ -693,22 +648,48 @@
                 <w:noProof/>
               </w:rPr>
             </w:pPr>
-            <w:fldSimple w:instr=" MERGEFIELD  CCCaption  \* MERGEFORMAT ">
-              <w:r>
-                <w:rPr>
-                  <w:noProof/>
-                </w:rPr>
-                <w:t>«CCCaption»</w:t>
-              </w:r>
-            </w:fldSimple>
-            <w:fldSimple w:instr=" MERGEFIELD  ExistingAddLocs  \* MERGEFORMAT ">
-              <w:r>
-                <w:rPr>
-                  <w:noProof/>
-                </w:rPr>
-                <w:t>«ExistingAddLocs»</w:t>
-              </w:r>
-            </w:fldSimple>
+            <w:r>
+              <w:fldChar w:fldCharType="begin"/>
+            </w:r>
+            <w:r>
+              <w:instrText xml:space="preserve"> MERGEFIELD  CCCaption  \* MERGEFORMAT </w:instrText>
+            </w:r>
+            <w:r>
+              <w:fldChar w:fldCharType="separate"/>
+            </w:r>
+            <w:r>
+              <w:rPr>
+                <w:noProof/>
+              </w:rPr>
+              <w:t>«CCCaption»</w:t>
+            </w:r>
+            <w:r>
+              <w:rPr>
+                <w:noProof/>
+              </w:rPr>
+              <w:fldChar w:fldCharType="end"/>
+            </w:r>
+            <w:r>
+              <w:fldChar w:fldCharType="begin"/>
+            </w:r>
+            <w:r>
+              <w:instrText xml:space="preserve"> MERGEFIELD  ExistingAddLocs  \* MERGEFORMAT </w:instrText>
+            </w:r>
+            <w:r>
+              <w:fldChar w:fldCharType="separate"/>
+            </w:r>
+            <w:r>
+              <w:rPr>
+                <w:noProof/>
+              </w:rPr>
+              <w:t>«ExistingAddLocs»</w:t>
+            </w:r>
+            <w:r>
+              <w:rPr>
+                <w:noProof/>
+              </w:rPr>
+              <w:fldChar w:fldCharType="end"/>
+            </w:r>
             <w:r>
               <w:t xml:space="preserve"> </w:t>
             </w:r>
@@ -724,14 +705,27 @@
               </w:rPr>
               <w:t xml:space="preserve">his event is shared with visit your </w:t>
             </w:r>
-            <w:fldSimple w:instr=" MERGEFIELD  UpdateOrderPage  \* MERGEFORMAT ">
-              <w:r>
-                <w:rPr>
-                  <w:noProof/>
-                </w:rPr>
-                <w:t>«UpdateOrderPage»</w:t>
-              </w:r>
-            </w:fldSimple>
+            <w:r>
+              <w:fldChar w:fldCharType="begin"/>
+            </w:r>
+            <w:r>
+              <w:instrText xml:space="preserve"> MERGEFIELD  UpdateOrderPage  \* MERGEFORMAT </w:instrText>
+            </w:r>
+            <w:r>
+              <w:fldChar w:fldCharType="separate"/>
+            </w:r>
+            <w:r>
+              <w:rPr>
+                <w:noProof/>
+              </w:rPr>
+              <w:t>«UpdateOrderPage»</w:t>
+            </w:r>
+            <w:r>
+              <w:rPr>
+                <w:noProof/>
+              </w:rPr>
+              <w:fldChar w:fldCharType="end"/>
+            </w:r>
             <w:r>
               <w:t xml:space="preserve"> </w:t>
             </w:r>
@@ -989,8 +983,8 @@
               </w:rPr>
               <w:t>«</w:t>
             </w:r>
-            <w:bookmarkStart w:id="6" w:name="OLE_LINK4"/>
-            <w:bookmarkStart w:id="7" w:name="OLE_LINK5"/>
+            <w:bookmarkStart w:id="4" w:name="OLE_LINK4"/>
+            <w:bookmarkStart w:id="5" w:name="OLE_LINK5"/>
             <w:r>
               <w:rPr>
                 <w:b/>
@@ -998,8 +992,8 @@
               </w:rPr>
               <w:t>ShowStartTime</w:t>
             </w:r>
-            <w:bookmarkEnd w:id="6"/>
-            <w:bookmarkEnd w:id="7"/>
+            <w:bookmarkEnd w:id="4"/>
+            <w:bookmarkEnd w:id="5"/>
             <w:r>
               <w:rPr>
                 <w:b/>
@@ -1099,14 +1093,27 @@
             <w:r>
               <w:t xml:space="preserve"> </w:t>
             </w:r>
-            <w:fldSimple w:instr=" MERGEFIELD  ChangeTimeZoneLink  \* MERGEFORMAT ">
-              <w:r>
-                <w:rPr>
-                  <w:noProof/>
-                </w:rPr>
-                <w:t>«ChangeTimeZoneLink»</w:t>
-              </w:r>
-            </w:fldSimple>
+            <w:r>
+              <w:fldChar w:fldCharType="begin"/>
+            </w:r>
+            <w:r>
+              <w:instrText xml:space="preserve"> MERGEFIELD  ChangeTimeZoneLink  \* MERGEFORMAT </w:instrText>
+            </w:r>
+            <w:r>
+              <w:fldChar w:fldCharType="separate"/>
+            </w:r>
+            <w:r>
+              <w:rPr>
+                <w:noProof/>
+              </w:rPr>
+              <w:t>«ChangeTimeZoneLink»</w:t>
+            </w:r>
+            <w:r>
+              <w:rPr>
+                <w:noProof/>
+              </w:rPr>
+              <w:fldChar w:fldCharType="end"/>
+            </w:r>
           </w:p>
           <w:p/>
           <w:p>
@@ -1120,14 +1127,27 @@
             <w:r>
               <w:t xml:space="preserve"> (including a chance to test your computer’s readiness) can be viewed at </w:t>
             </w:r>
-            <w:fldSimple w:instr=" MERGEFIELD  DetailedConnectionInfoLink  \* MERGEFORMAT ">
-              <w:r>
-                <w:rPr>
-                  <w:noProof/>
-                </w:rPr>
-                <w:t>«DetailedConnectionInfoLink»</w:t>
-              </w:r>
-            </w:fldSimple>
+            <w:r>
+              <w:fldChar w:fldCharType="begin"/>
+            </w:r>
+            <w:r>
+              <w:instrText xml:space="preserve"> MERGEFIELD  DetailedConnectionInfoLink  \* MERGEFORMAT </w:instrText>
+            </w:r>
+            <w:r>
+              <w:fldChar w:fldCharType="separate"/>
+            </w:r>
+            <w:r>
+              <w:rPr>
+                <w:noProof/>
+              </w:rPr>
+              <w:t>«DetailedConnectionInfoLink»</w:t>
+            </w:r>
+            <w:r>
+              <w:rPr>
+                <w:noProof/>
+              </w:rPr>
+              <w:fldChar w:fldCharType="end"/>
+            </w:r>
             <w:r>
               <w:t xml:space="preserve">. </w:t>
             </w:r>
@@ -1198,8 +1218,8 @@
                       <w:tcPr>
                         <w:tcW w:w="4297" w:type="dxa"/>
                       </w:tcPr>
-                      <w:bookmarkStart w:id="8" w:name="OLE_LINK1"/>
-                      <w:bookmarkStart w:id="9" w:name="OLE_LINK2"/>
+                      <w:bookmarkStart w:id="6" w:name="OLE_LINK1"/>
+                      <w:bookmarkStart w:id="7" w:name="OLE_LINK2"/>
                       <w:p>
                         <w:pPr>
                           <w:jc w:val="center"/>
@@ -1244,8 +1264,8 @@
                           </w:rPr>
                           <w:fldChar w:fldCharType="end"/>
                         </w:r>
-                        <w:bookmarkEnd w:id="8"/>
-                        <w:bookmarkEnd w:id="9"/>
+                        <w:bookmarkEnd w:id="6"/>
+                        <w:bookmarkEnd w:id="7"/>
                       </w:p>
                     </w:tc>
                     <w:tc>
@@ -2116,6 +2136,7 @@
     <w:lsdException w:name="HTML Sample" w:semiHidden="1" w:unhideWhenUsed="1"/>
     <w:lsdException w:name="HTML Typewriter" w:semiHidden="1" w:unhideWhenUsed="1"/>
     <w:lsdException w:name="HTML Variable" w:semiHidden="1" w:unhideWhenUsed="1"/>
+    <w:lsdException w:name="Normal Table" w:semiHidden="1" w:unhideWhenUsed="1"/>
     <w:lsdException w:name="annotation subject" w:semiHidden="1" w:unhideWhenUsed="1"/>
     <w:lsdException w:name="No List" w:semiHidden="1" w:unhideWhenUsed="1"/>
     <w:lsdException w:name="Outline List 1" w:semiHidden="1" w:unhideWhenUsed="1"/>
@@ -2162,8 +2183,10 @@
     <w:lsdException w:name="Table Subtle 2" w:semiHidden="1" w:unhideWhenUsed="1"/>
     <w:lsdException w:name="Table Web 1" w:semiHidden="1" w:unhideWhenUsed="1"/>
     <w:lsdException w:name="Table Web 2" w:semiHidden="1" w:unhideWhenUsed="1"/>
+    <w:lsdException w:name="Table Web 3" w:semiHidden="1" w:unhideWhenUsed="1"/>
     <w:lsdException w:name="Balloon Text" w:semiHidden="1" w:unhideWhenUsed="1"/>
     <w:lsdException w:name="Table Grid" w:uiPriority="39"/>
+    <w:lsdException w:name="Table Theme" w:semiHidden="1" w:unhideWhenUsed="1"/>
     <w:lsdException w:name="Placeholder Text" w:semiHidden="1"/>
     <w:lsdException w:name="No Spacing" w:uiPriority="1" w:qFormat="1"/>
     <w:lsdException w:name="Light Shading" w:uiPriority="60"/>
@@ -2766,7 +2789,7 @@
 </file>
 
 <file path=customXml/itemProps1.xml><?xml version="1.0" encoding="utf-8"?>
-<ds:datastoreItem xmlns:ds="http://schemas.openxmlformats.org/officeDocument/2006/customXml" ds:itemID="{E3B6F750-0DED-4A6E-A037-C6738AD755F9}">
+<ds:datastoreItem xmlns:ds="http://schemas.openxmlformats.org/officeDocument/2006/customXml" ds:itemID="{F567E59C-C5AB-42D1-A54C-4E2F2C87B315}">
   <ds:schemaRefs>
     <ds:schemaRef ds:uri="http://schemas.openxmlformats.org/officeDocument/2006/bibliography"/>
   </ds:schemaRefs>

</xml_diff>

<commit_message>
Adds confirmation templates for FedComp & BSA Schools. Prevents WSP usage on same schools Re-do on ConfSem parsing. Prevents overlapped Affiliate on WSP entries.
</commit_message>
<xml_diff>
--- a/CUWebinars.Web/App_Data/mergeTemplates/ConnectionInfo2.docx
+++ b/CUWebinars.Web/App_Data/mergeTemplates/ConnectionInfo2.docx
@@ -456,27 +456,14 @@
             <w:r>
               <w:t xml:space="preserve">Dear </w:t>
             </w:r>
-            <w:r>
-              <w:fldChar w:fldCharType="begin"/>
-            </w:r>
-            <w:r>
-              <w:instrText xml:space="preserve"> MERGEFIELD  FirstName  \* MERGEFORMAT </w:instrText>
-            </w:r>
-            <w:r>
-              <w:fldChar w:fldCharType="separate"/>
-            </w:r>
-            <w:r>
-              <w:rPr>
-                <w:noProof/>
-              </w:rPr>
-              <w:t>«FirstName»</w:t>
-            </w:r>
-            <w:r>
-              <w:rPr>
-                <w:noProof/>
-              </w:rPr>
-              <w:fldChar w:fldCharType="end"/>
-            </w:r>
+            <w:fldSimple w:instr=" MERGEFIELD  FirstName  \* MERGEFORMAT ">
+              <w:r>
+                <w:rPr>
+                  <w:noProof/>
+                </w:rPr>
+                <w:t>«FirstName»</w:t>
+              </w:r>
+            </w:fldSimple>
             <w:r>
               <w:t>,</w:t>
             </w:r>
@@ -495,12 +482,7 @@
             </w:r>
             <w:proofErr w:type="spellStart"/>
             <w:r>
-              <w:t>O</w:t>
-            </w:r>
-            <w:bookmarkStart w:id="3" w:name="_GoBack"/>
-            <w:bookmarkEnd w:id="3"/>
-            <w:r>
-              <w:t>peningMessage</w:t>
+              <w:t>OpeningMessage</w:t>
             </w:r>
             <w:proofErr w:type="spellEnd"/>
             <w:r>
@@ -537,27 +519,14 @@
             <w:pPr>
               <w:ind w:left="438"/>
             </w:pPr>
-            <w:r>
-              <w:fldChar w:fldCharType="begin"/>
-            </w:r>
-            <w:r>
-              <w:instrText xml:space="preserve"> MERGEFIELD  PresenterMaterials  \* MERGEFORMAT </w:instrText>
-            </w:r>
-            <w:r>
-              <w:fldChar w:fldCharType="separate"/>
-            </w:r>
-            <w:r>
-              <w:rPr>
-                <w:noProof/>
-              </w:rPr>
-              <w:t>«PresenterMaterials»</w:t>
-            </w:r>
-            <w:r>
-              <w:rPr>
-                <w:noProof/>
-              </w:rPr>
-              <w:fldChar w:fldCharType="end"/>
-            </w:r>
+            <w:fldSimple w:instr=" MERGEFIELD  PresenterMaterials  \* MERGEFORMAT ">
+              <w:r>
+                <w:rPr>
+                  <w:noProof/>
+                </w:rPr>
+                <w:t>«PresenterMaterials»</w:t>
+              </w:r>
+            </w:fldSimple>
           </w:p>
           <w:p/>
           <w:p>
@@ -573,159 +542,133 @@
             <w:r>
               <w:t xml:space="preserve">Click the link to join: </w:t>
             </w:r>
-            <w:fldSimple w:instr=" MERGEFIELD  ClickToJoinLink  \* MERGEFORMAT ">
+            <w:r>
+              <w:fldChar w:fldCharType="begin"/>
+            </w:r>
+            <w:r>
+              <w:instrText xml:space="preserve"> MERGEFIELD  ClickToJoinLink  \* MERGEFORMAT </w:instrText>
+            </w:r>
+            <w:r>
+              <w:fldChar w:fldCharType="separate"/>
+            </w:r>
+            <w:r>
+              <w:rPr>
+                <w:noProof/>
+              </w:rPr>
+              <w:t>«ClickToJoinLink»</w:t>
+            </w:r>
+            <w:r>
+              <w:rPr>
+                <w:noProof/>
+              </w:rPr>
+              <w:fldChar w:fldCharType="end"/>
+            </w:r>
+            <w:r>
+              <w:rPr>
+                <w:noProof/>
+              </w:rPr>
+              <w:t>.</w:t>
+            </w:r>
+            <w:r>
+              <w:rPr>
+                <w:noProof/>
+              </w:rPr>
+              <w:t xml:space="preserve"> </w:t>
+            </w:r>
+            <w:r>
+              <w:rPr>
+                <w:noProof/>
+                <w:sz w:val="20"/>
+                <w:szCs w:val="20"/>
+              </w:rPr>
+              <w:t>(V</w:t>
+            </w:r>
+            <w:r>
+              <w:rPr>
+                <w:noProof/>
+                <w:sz w:val="20"/>
+                <w:szCs w:val="20"/>
+              </w:rPr>
+              <w:t>alid for one location</w:t>
+            </w:r>
+            <w:r>
+              <w:rPr>
+                <w:noProof/>
+                <w:sz w:val="20"/>
+                <w:szCs w:val="20"/>
+              </w:rPr>
+              <w:t xml:space="preserve"> only</w:t>
+            </w:r>
+            <w:r>
+              <w:rPr>
+                <w:noProof/>
+                <w:sz w:val="20"/>
+                <w:szCs w:val="20"/>
+              </w:rPr>
+              <w:t>.</w:t>
+            </w:r>
+            <w:r>
+              <w:rPr>
+                <w:noProof/>
+                <w:sz w:val="20"/>
+                <w:szCs w:val="20"/>
+              </w:rPr>
+              <w:t>)</w:t>
+            </w:r>
+            <w:r>
+              <w:rPr>
+                <w:sz w:val="20"/>
+                <w:szCs w:val="20"/>
+              </w:rPr>
+              <w:t xml:space="preserve"> </w:t>
+            </w:r>
+          </w:p>
+          <w:p>
+            <w:pPr>
+              <w:ind w:left="798"/>
+              <w:rPr>
+                <w:noProof/>
+              </w:rPr>
+            </w:pPr>
+            <w:fldSimple w:instr=" MERGEFIELD  CCCaption  \* MERGEFORMAT ">
               <w:r>
                 <w:rPr>
                   <w:noProof/>
                 </w:rPr>
-                <w:t>«ClickToJoinLink»</w:t>
+                <w:t>«CCCaption»</w:t>
               </w:r>
             </w:fldSimple>
+            <w:fldSimple w:instr=" MERGEFIELD  ExistingAddLocs  \* MERGEFORMAT ">
+              <w:r>
+                <w:rPr>
+                  <w:noProof/>
+                </w:rPr>
+                <w:t>«ExistingAddLocs»</w:t>
+              </w:r>
+            </w:fldSimple>
+            <w:r>
+              <w:t xml:space="preserve"> </w:t>
+            </w:r>
             <w:r>
               <w:rPr>
                 <w:noProof/>
               </w:rPr>
-              <w:t>.</w:t>
+              <w:t xml:space="preserve"> To update addresses t</w:t>
             </w:r>
             <w:r>
               <w:rPr>
                 <w:noProof/>
               </w:rPr>
-              <w:t xml:space="preserve"> </w:t>
-            </w:r>
-            <w:r>
-              <w:rPr>
-                <w:noProof/>
-                <w:sz w:val="20"/>
-                <w:szCs w:val="20"/>
-              </w:rPr>
-              <w:t>(V</w:t>
-            </w:r>
-            <w:r>
-              <w:rPr>
-                <w:noProof/>
-                <w:sz w:val="20"/>
-                <w:szCs w:val="20"/>
-              </w:rPr>
-              <w:t>alid for one location</w:t>
-            </w:r>
-            <w:r>
-              <w:rPr>
-                <w:noProof/>
-                <w:sz w:val="20"/>
-                <w:szCs w:val="20"/>
-              </w:rPr>
-              <w:t xml:space="preserve"> only</w:t>
-            </w:r>
-            <w:r>
-              <w:rPr>
-                <w:noProof/>
-                <w:sz w:val="20"/>
-                <w:szCs w:val="20"/>
-              </w:rPr>
-              <w:t>.</w:t>
-            </w:r>
-            <w:r>
-              <w:rPr>
-                <w:noProof/>
-                <w:sz w:val="20"/>
-                <w:szCs w:val="20"/>
-              </w:rPr>
-              <w:t>)</w:t>
-            </w:r>
-            <w:r>
-              <w:rPr>
-                <w:sz w:val="20"/>
-                <w:szCs w:val="20"/>
-              </w:rPr>
-              <w:t xml:space="preserve"> </w:t>
-            </w:r>
-          </w:p>
-          <w:p>
-            <w:pPr>
-              <w:ind w:left="798"/>
-              <w:rPr>
-                <w:noProof/>
-              </w:rPr>
-            </w:pPr>
-            <w:r>
-              <w:fldChar w:fldCharType="begin"/>
-            </w:r>
-            <w:r>
-              <w:instrText xml:space="preserve"> MERGEFIELD  CCCaption  \* MERGEFORMAT </w:instrText>
-            </w:r>
-            <w:r>
-              <w:fldChar w:fldCharType="separate"/>
-            </w:r>
-            <w:r>
-              <w:rPr>
-                <w:noProof/>
-              </w:rPr>
-              <w:t>«CCCaption»</w:t>
-            </w:r>
-            <w:r>
-              <w:rPr>
-                <w:noProof/>
-              </w:rPr>
-              <w:fldChar w:fldCharType="end"/>
-            </w:r>
-            <w:r>
-              <w:fldChar w:fldCharType="begin"/>
-            </w:r>
-            <w:r>
-              <w:instrText xml:space="preserve"> MERGEFIELD  ExistingAddLocs  \* MERGEFORMAT </w:instrText>
-            </w:r>
-            <w:r>
-              <w:fldChar w:fldCharType="separate"/>
-            </w:r>
-            <w:r>
-              <w:rPr>
-                <w:noProof/>
-              </w:rPr>
-              <w:t>«ExistingAddLocs»</w:t>
-            </w:r>
-            <w:r>
-              <w:rPr>
-                <w:noProof/>
-              </w:rPr>
-              <w:fldChar w:fldCharType="end"/>
-            </w:r>
-            <w:r>
-              <w:t xml:space="preserve"> </w:t>
-            </w:r>
-            <w:r>
-              <w:rPr>
-                <w:noProof/>
-              </w:rPr>
-              <w:t xml:space="preserve"> To update addresses t</w:t>
-            </w:r>
-            <w:r>
-              <w:rPr>
-                <w:noProof/>
-              </w:rPr>
               <w:t xml:space="preserve">his event is shared with visit your </w:t>
             </w:r>
-            <w:r>
-              <w:fldChar w:fldCharType="begin"/>
-            </w:r>
-            <w:r>
-              <w:instrText xml:space="preserve"> MERGEFIELD  UpdateOrderPage  \* MERGEFORMAT </w:instrText>
-            </w:r>
-            <w:r>
-              <w:fldChar w:fldCharType="separate"/>
-            </w:r>
-            <w:r>
-              <w:rPr>
-                <w:noProof/>
-              </w:rPr>
-              <w:t>«UpdateOrderPage»</w:t>
-            </w:r>
-            <w:r>
-              <w:rPr>
-                <w:noProof/>
-              </w:rPr>
-              <w:fldChar w:fldCharType="end"/>
-            </w:r>
+            <w:fldSimple w:instr=" MERGEFIELD  UpdateOrderPage  \* MERGEFORMAT ">
+              <w:r>
+                <w:rPr>
+                  <w:noProof/>
+                </w:rPr>
+                <w:t>«UpdateOrderPage»</w:t>
+              </w:r>
+            </w:fldSimple>
             <w:r>
               <w:t xml:space="preserve"> </w:t>
             </w:r>
@@ -983,8 +926,8 @@
               </w:rPr>
               <w:t>«</w:t>
             </w:r>
-            <w:bookmarkStart w:id="4" w:name="OLE_LINK4"/>
-            <w:bookmarkStart w:id="5" w:name="OLE_LINK5"/>
+            <w:bookmarkStart w:id="3" w:name="OLE_LINK4"/>
+            <w:bookmarkStart w:id="4" w:name="OLE_LINK5"/>
             <w:r>
               <w:rPr>
                 <w:b/>
@@ -992,8 +935,8 @@
               </w:rPr>
               <w:t>ShowStartTime</w:t>
             </w:r>
+            <w:bookmarkEnd w:id="3"/>
             <w:bookmarkEnd w:id="4"/>
-            <w:bookmarkEnd w:id="5"/>
             <w:r>
               <w:rPr>
                 <w:b/>
@@ -1080,40 +1023,27 @@
               <w:t xml:space="preserve"> our notifications to use</w:t>
             </w:r>
             <w:r>
-              <w:t xml:space="preserve"> a different </w:t>
-            </w:r>
-            <w:proofErr w:type="spellStart"/>
-            <w:r>
-              <w:t>timezone</w:t>
-            </w:r>
-            <w:proofErr w:type="spellEnd"/>
-            <w:r>
-              <w:t xml:space="preserve"> please</w:t>
+              <w:t xml:space="preserve"> a different time</w:t>
             </w:r>
             <w:r>
               <w:t xml:space="preserve"> </w:t>
             </w:r>
-            <w:r>
-              <w:fldChar w:fldCharType="begin"/>
-            </w:r>
-            <w:r>
-              <w:instrText xml:space="preserve"> MERGEFIELD  ChangeTimeZoneLink  \* MERGEFORMAT </w:instrText>
-            </w:r>
-            <w:r>
-              <w:fldChar w:fldCharType="separate"/>
-            </w:r>
-            <w:r>
-              <w:rPr>
-                <w:noProof/>
-              </w:rPr>
-              <w:t>«ChangeTimeZoneLink»</w:t>
-            </w:r>
-            <w:r>
-              <w:rPr>
-                <w:noProof/>
-              </w:rPr>
-              <w:fldChar w:fldCharType="end"/>
-            </w:r>
+            <w:bookmarkStart w:id="5" w:name="_GoBack"/>
+            <w:bookmarkEnd w:id="5"/>
+            <w:r>
+              <w:t>zone please</w:t>
+            </w:r>
+            <w:r>
+              <w:t xml:space="preserve"> </w:t>
+            </w:r>
+            <w:fldSimple w:instr=" MERGEFIELD  ChangeTimeZoneLink  \* MERGEFORMAT ">
+              <w:r>
+                <w:rPr>
+                  <w:noProof/>
+                </w:rPr>
+                <w:t>«ChangeTimeZoneLink»</w:t>
+              </w:r>
+            </w:fldSimple>
           </w:p>
           <w:p/>
           <w:p>
@@ -1127,27 +1057,14 @@
             <w:r>
               <w:t xml:space="preserve"> (including a chance to test your computer’s readiness) can be viewed at </w:t>
             </w:r>
-            <w:r>
-              <w:fldChar w:fldCharType="begin"/>
-            </w:r>
-            <w:r>
-              <w:instrText xml:space="preserve"> MERGEFIELD  DetailedConnectionInfoLink  \* MERGEFORMAT </w:instrText>
-            </w:r>
-            <w:r>
-              <w:fldChar w:fldCharType="separate"/>
-            </w:r>
-            <w:r>
-              <w:rPr>
-                <w:noProof/>
-              </w:rPr>
-              <w:t>«DetailedConnectionInfoLink»</w:t>
-            </w:r>
-            <w:r>
-              <w:rPr>
-                <w:noProof/>
-              </w:rPr>
-              <w:fldChar w:fldCharType="end"/>
-            </w:r>
+            <w:fldSimple w:instr=" MERGEFIELD  DetailedConnectionInfoLink  \* MERGEFORMAT ">
+              <w:r>
+                <w:rPr>
+                  <w:noProof/>
+                </w:rPr>
+                <w:t>«DetailedConnectionInfoLink»</w:t>
+              </w:r>
+            </w:fldSimple>
             <w:r>
               <w:t xml:space="preserve">. </w:t>
             </w:r>
@@ -2789,7 +2706,7 @@
 </file>
 
 <file path=customXml/itemProps1.xml><?xml version="1.0" encoding="utf-8"?>
-<ds:datastoreItem xmlns:ds="http://schemas.openxmlformats.org/officeDocument/2006/customXml" ds:itemID="{F567E59C-C5AB-42D1-A54C-4E2F2C87B315}">
+<ds:datastoreItem xmlns:ds="http://schemas.openxmlformats.org/officeDocument/2006/customXml" ds:itemID="{763ED6E5-9F24-4420-A0FC-BE4828268844}">
   <ds:schemaRefs>
     <ds:schemaRef ds:uri="http://schemas.openxmlformats.org/officeDocument/2006/bibliography"/>
   </ds:schemaRefs>

</xml_diff>